<commit_message>
aggiunta modifiche finali documento di visione
</commit_message>
<xml_diff>
--- a/Documenti/Documento di progetto finale.docx
+++ b/Documenti/Documento di progetto finale.docx
@@ -13945,11 +13945,8 @@
     <w:p>
       <w:pPr>
         <w:pStyle w:val="Paragrafoelenco"/>
+        <w:keepNext/>
         <w:ind w:left="444"/>
-        <w:rPr>
-          <w:rFonts w:ascii="Calibri" w:hAnsi="Calibri" w:cs="Calibri"/>
-          <w:color w:val="000000" w:themeColor="text1"/>
-        </w:rPr>
       </w:pPr>
       <w:r>
         <w:rPr>
@@ -13958,26 +13955,10 @@
           <w:color w:val="000000" w:themeColor="text1"/>
         </w:rPr>
         <w:drawing>
-          <wp:anchor distT="0" distB="0" distL="114300" distR="114300" simplePos="0" relativeHeight="251623424" behindDoc="1" locked="0" layoutInCell="1" allowOverlap="1" wp14:anchorId="16C2BBC3" wp14:editId="04A9D63F">
-            <wp:simplePos x="0" y="0"/>
-            <wp:positionH relativeFrom="margin">
-              <wp:align>left</wp:align>
-            </wp:positionH>
-            <wp:positionV relativeFrom="paragraph">
-              <wp:posOffset>684157</wp:posOffset>
-            </wp:positionV>
-            <wp:extent cx="6049924" cy="3388659"/>
-            <wp:effectExtent l="0" t="0" r="8255" b="2540"/>
-            <wp:wrapTight wrapText="bothSides">
-              <wp:wrapPolygon edited="0">
-                <wp:start x="0" y="0"/>
-                <wp:lineTo x="0" y="21495"/>
-                <wp:lineTo x="21561" y="21495"/>
-                <wp:lineTo x="21561" y="0"/>
-                <wp:lineTo x="0" y="0"/>
-              </wp:wrapPolygon>
-            </wp:wrapTight>
-            <wp:docPr id="1987447705" name="Immagine 1" descr="Immagine che contiene testo, diagramma, Piano, schematico&#10;&#10;Il contenuto generato dall'IA potrebbe non essere corretto."/>
+          <wp:inline distT="0" distB="0" distL="0" distR="0" wp14:anchorId="12EE7490" wp14:editId="29337208">
+            <wp:extent cx="5825002" cy="3403261"/>
+            <wp:effectExtent l="0" t="0" r="4445" b="6985"/>
+            <wp:docPr id="1470748806" name="Immagine 1"/>
             <wp:cNvGraphicFramePr>
               <a:graphicFrameLocks xmlns:a="http://schemas.openxmlformats.org/drawingml/2006/main" noChangeAspect="1"/>
             </wp:cNvGraphicFramePr>
@@ -13985,8 +13966,10 @@
               <a:graphicData uri="http://schemas.openxmlformats.org/drawingml/2006/picture">
                 <pic:pic xmlns:pic="http://schemas.openxmlformats.org/drawingml/2006/picture">
                   <pic:nvPicPr>
-                    <pic:cNvPr id="1987447705" name="Immagine 1" descr="Immagine che contiene testo, diagramma, Piano, schematico&#10;&#10;Il contenuto generato dall'IA potrebbe non essere corretto."/>
-                    <pic:cNvPicPr/>
+                    <pic:cNvPr id="0" name="Picture 2"/>
+                    <pic:cNvPicPr>
+                      <a:picLocks noChangeAspect="1" noChangeArrowheads="1"/>
+                    </pic:cNvPicPr>
                   </pic:nvPicPr>
                   <pic:blipFill>
                     <a:blip r:embed="rId11">
@@ -13996,31 +13979,82 @@
                         </a:ext>
                       </a:extLst>
                     </a:blip>
+                    <a:srcRect/>
                     <a:stretch>
                       <a:fillRect/>
                     </a:stretch>
                   </pic:blipFill>
-                  <pic:spPr>
+                  <pic:spPr bwMode="auto">
                     <a:xfrm>
                       <a:off x="0" y="0"/>
-                      <a:ext cx="6049924" cy="3388659"/>
+                      <a:ext cx="5845752" cy="3415384"/>
                     </a:xfrm>
                     <a:prstGeom prst="rect">
                       <a:avLst/>
                     </a:prstGeom>
+                    <a:noFill/>
                   </pic:spPr>
                 </pic:pic>
               </a:graphicData>
             </a:graphic>
-            <wp14:sizeRelH relativeFrom="margin">
-              <wp14:pctWidth>0</wp14:pctWidth>
-            </wp14:sizeRelH>
-            <wp14:sizeRelV relativeFrom="margin">
-              <wp14:pctHeight>0</wp14:pctHeight>
-            </wp14:sizeRelV>
-          </wp:anchor>
+          </wp:inline>
         </w:drawing>
       </w:r>
+    </w:p>
+    <w:p>
+      <w:pPr>
+        <w:pStyle w:val="Didascalia"/>
+        <w:rPr>
+          <w:rFonts w:ascii="Calibri" w:hAnsi="Calibri" w:cs="Calibri"/>
+          <w:noProof/>
+          <w:color w:val="000000" w:themeColor="text1"/>
+        </w:rPr>
+      </w:pPr>
+      <w:r>
+        <w:t xml:space="preserve">Figura </w:t>
+      </w:r>
+      <w:r>
+        <w:fldChar w:fldCharType="begin"/>
+      </w:r>
+      <w:r>
+        <w:instrText xml:space="preserve"> SEQ Figura \* ARABIC </w:instrText>
+      </w:r>
+      <w:r>
+        <w:fldChar w:fldCharType="separate"/>
+      </w:r>
+      <w:r>
+        <w:rPr>
+          <w:noProof/>
+        </w:rPr>
+        <w:t>1</w:t>
+      </w:r>
+      <w:r>
+        <w:fldChar w:fldCharType="end"/>
+      </w:r>
+      <w:r>
+        <w:t xml:space="preserve"> Modello di dominio</w:t>
+      </w:r>
+    </w:p>
+    <w:p>
+      <w:pPr>
+        <w:pStyle w:val="Paragrafoelenco"/>
+        <w:ind w:left="444"/>
+        <w:rPr>
+          <w:rFonts w:ascii="Calibri" w:hAnsi="Calibri" w:cs="Calibri"/>
+          <w:noProof/>
+          <w:color w:val="000000" w:themeColor="text1"/>
+        </w:rPr>
+      </w:pPr>
+    </w:p>
+    <w:p>
+      <w:pPr>
+        <w:pStyle w:val="Paragrafoelenco"/>
+        <w:ind w:left="444"/>
+        <w:rPr>
+          <w:rFonts w:ascii="Calibri" w:hAnsi="Calibri" w:cs="Calibri"/>
+          <w:color w:val="000000" w:themeColor="text1"/>
+        </w:rPr>
+      </w:pPr>
       <w:r>
         <w:rPr>
           <w:rFonts w:ascii="Calibri" w:hAnsi="Calibri" w:cs="Calibri"/>
@@ -14391,6 +14425,7 @@
           <w:bCs/>
           <w:color w:val="000000" w:themeColor="text1"/>
         </w:rPr>
+        <w:lastRenderedPageBreak/>
         <w:t>Magazzino / Farmaco</w:t>
       </w:r>
       <w:r>
@@ -14486,10 +14521,7 @@
     </w:p>
     <w:p>
       <w:pPr>
-        <w:rPr>
-          <w:rFonts w:ascii="Calibri" w:hAnsi="Calibri" w:cs="Calibri"/>
-          <w:color w:val="000000" w:themeColor="text1"/>
-        </w:rPr>
+        <w:keepNext/>
       </w:pPr>
       <w:r>
         <w:rPr>
@@ -14542,6 +14574,39 @@
     </w:p>
     <w:p>
       <w:pPr>
+        <w:pStyle w:val="Didascalia"/>
+        <w:rPr>
+          <w:rFonts w:ascii="Calibri" w:hAnsi="Calibri" w:cs="Calibri"/>
+          <w:color w:val="000000" w:themeColor="text1"/>
+        </w:rPr>
+      </w:pPr>
+      <w:r>
+        <w:t xml:space="preserve">Figura </w:t>
+      </w:r>
+      <w:r>
+        <w:fldChar w:fldCharType="begin"/>
+      </w:r>
+      <w:r>
+        <w:instrText xml:space="preserve"> SEQ Figura \* ARABIC </w:instrText>
+      </w:r>
+      <w:r>
+        <w:fldChar w:fldCharType="separate"/>
+      </w:r>
+      <w:r>
+        <w:rPr>
+          <w:noProof/>
+        </w:rPr>
+        <w:t>2</w:t>
+      </w:r>
+      <w:r>
+        <w:fldChar w:fldCharType="end"/>
+      </w:r>
+      <w:r>
+        <w:t xml:space="preserve"> SSD Modello di Analisi UC1</w:t>
+      </w:r>
+    </w:p>
+    <w:p>
+      <w:pPr>
         <w:rPr>
           <w:rFonts w:ascii="Calibri" w:hAnsi="Calibri" w:cs="Calibri"/>
           <w:color w:val="000000" w:themeColor="text1"/>
@@ -14894,6 +14959,7 @@
           <w:rFonts w:ascii="Calibri" w:hAnsi="Calibri" w:cs="Calibri"/>
           <w:color w:val="000000" w:themeColor="text1"/>
         </w:rPr>
+        <w:lastRenderedPageBreak/>
         <w:t>Post-condizioni:</w:t>
       </w:r>
       <w:r>
@@ -15016,7 +15082,6 @@
           <w:rFonts w:ascii="Calibri" w:hAnsi="Calibri" w:cs="Calibri"/>
           <w:color w:val="000000" w:themeColor="text1"/>
         </w:rPr>
-        <w:lastRenderedPageBreak/>
         <w:t xml:space="preserve">- a è stato associato a </w:t>
       </w:r>
       <w:proofErr w:type="spellStart"/>
@@ -15306,6 +15371,157 @@
           <w:color w:val="000000" w:themeColor="text1"/>
         </w:rPr>
       </w:pPr>
+      <w:r>
+        <w:rPr>
+          <w:noProof/>
+        </w:rPr>
+        <mc:AlternateContent>
+          <mc:Choice Requires="wps">
+            <w:drawing>
+              <wp:anchor distT="0" distB="0" distL="114300" distR="114300" simplePos="0" relativeHeight="251696128" behindDoc="1" locked="0" layoutInCell="1" allowOverlap="1" wp14:anchorId="6BBFEEE5" wp14:editId="19374E96">
+                <wp:simplePos x="0" y="0"/>
+                <wp:positionH relativeFrom="column">
+                  <wp:posOffset>32385</wp:posOffset>
+                </wp:positionH>
+                <wp:positionV relativeFrom="paragraph">
+                  <wp:posOffset>1986280</wp:posOffset>
+                </wp:positionV>
+                <wp:extent cx="4120515" cy="635"/>
+                <wp:effectExtent l="0" t="0" r="0" b="0"/>
+                <wp:wrapTight wrapText="bothSides">
+                  <wp:wrapPolygon edited="0">
+                    <wp:start x="0" y="0"/>
+                    <wp:lineTo x="0" y="21600"/>
+                    <wp:lineTo x="21600" y="21600"/>
+                    <wp:lineTo x="21600" y="0"/>
+                  </wp:wrapPolygon>
+                </wp:wrapTight>
+                <wp:docPr id="148219860" name="Casella di testo 1"/>
+                <wp:cNvGraphicFramePr/>
+                <a:graphic xmlns:a="http://schemas.openxmlformats.org/drawingml/2006/main">
+                  <a:graphicData uri="http://schemas.microsoft.com/office/word/2010/wordprocessingShape">
+                    <wps:wsp>
+                      <wps:cNvSpPr txBox="1"/>
+                      <wps:spPr>
+                        <a:xfrm>
+                          <a:off x="0" y="0"/>
+                          <a:ext cx="4120515" cy="635"/>
+                        </a:xfrm>
+                        <a:prstGeom prst="rect">
+                          <a:avLst/>
+                        </a:prstGeom>
+                        <a:solidFill>
+                          <a:prstClr val="white"/>
+                        </a:solidFill>
+                        <a:ln>
+                          <a:noFill/>
+                        </a:ln>
+                      </wps:spPr>
+                      <wps:txbx>
+                        <w:txbxContent>
+                          <w:p>
+                            <w:pPr>
+                              <w:pStyle w:val="Didascalia"/>
+                              <w:rPr>
+                                <w:rFonts w:ascii="Calibri" w:hAnsi="Calibri" w:cs="Calibri"/>
+                                <w:noProof/>
+                                <w:color w:val="000000" w:themeColor="text1"/>
+                                <w:sz w:val="22"/>
+                                <w:szCs w:val="22"/>
+                              </w:rPr>
+                            </w:pPr>
+                            <w:r>
+                              <w:t xml:space="preserve">Figura </w:t>
+                            </w:r>
+                            <w:r>
+                              <w:fldChar w:fldCharType="begin"/>
+                            </w:r>
+                            <w:r>
+                              <w:instrText xml:space="preserve"> SEQ Figura \* ARABIC </w:instrText>
+                            </w:r>
+                            <w:r>
+                              <w:fldChar w:fldCharType="separate"/>
+                            </w:r>
+                            <w:r>
+                              <w:rPr>
+                                <w:noProof/>
+                              </w:rPr>
+                              <w:t>3</w:t>
+                            </w:r>
+                            <w:r>
+                              <w:fldChar w:fldCharType="end"/>
+                            </w:r>
+                            <w:r>
+                              <w:t xml:space="preserve"> SSD Modello di Analisi UC2</w:t>
+                            </w:r>
+                          </w:p>
+                        </w:txbxContent>
+                      </wps:txbx>
+                      <wps:bodyPr rot="0" spcFirstLastPara="0" vertOverflow="overflow" horzOverflow="overflow" vert="horz" wrap="square" lIns="0" tIns="0" rIns="0" bIns="0" numCol="1" spcCol="0" rtlCol="0" fromWordArt="0" anchor="t" anchorCtr="0" forceAA="0" compatLnSpc="1">
+                        <a:prstTxWarp prst="textNoShape">
+                          <a:avLst/>
+                        </a:prstTxWarp>
+                        <a:spAutoFit/>
+                      </wps:bodyPr>
+                    </wps:wsp>
+                  </a:graphicData>
+                </a:graphic>
+              </wp:anchor>
+            </w:drawing>
+          </mc:Choice>
+          <mc:Fallback>
+            <w:pict>
+              <v:shapetype w14:anchorId="6BBFEEE5" id="_x0000_t202" coordsize="21600,21600" o:spt="202" path="m,l,21600r21600,l21600,xe">
+                <v:stroke joinstyle="miter"/>
+                <v:path gradientshapeok="t" o:connecttype="rect"/>
+              </v:shapetype>
+              <v:shape id="Casella di testo 1" o:spid="_x0000_s1026" type="#_x0000_t202" style="position:absolute;margin-left:2.55pt;margin-top:156.4pt;width:324.45pt;height:.05pt;z-index:-251620352;visibility:visible;mso-wrap-style:square;mso-wrap-distance-left:9pt;mso-wrap-distance-top:0;mso-wrap-distance-right:9pt;mso-wrap-distance-bottom:0;mso-position-horizontal:absolute;mso-position-horizontal-relative:text;mso-position-vertical:absolute;mso-position-vertical-relative:text;v-text-anchor:top" o:gfxdata="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" stroked="f">
+                <v:textbox style="mso-fit-shape-to-text:t" inset="0,0,0,0">
+                  <w:txbxContent>
+                    <w:p>
+                      <w:pPr>
+                        <w:pStyle w:val="Didascalia"/>
+                        <w:rPr>
+                          <w:rFonts w:ascii="Calibri" w:hAnsi="Calibri" w:cs="Calibri"/>
+                          <w:noProof/>
+                          <w:color w:val="000000" w:themeColor="text1"/>
+                          <w:sz w:val="22"/>
+                          <w:szCs w:val="22"/>
+                        </w:rPr>
+                      </w:pPr>
+                      <w:r>
+                        <w:t xml:space="preserve">Figura </w:t>
+                      </w:r>
+                      <w:r>
+                        <w:fldChar w:fldCharType="begin"/>
+                      </w:r>
+                      <w:r>
+                        <w:instrText xml:space="preserve"> SEQ Figura \* ARABIC </w:instrText>
+                      </w:r>
+                      <w:r>
+                        <w:fldChar w:fldCharType="separate"/>
+                      </w:r>
+                      <w:r>
+                        <w:rPr>
+                          <w:noProof/>
+                        </w:rPr>
+                        <w:t>3</w:t>
+                      </w:r>
+                      <w:r>
+                        <w:fldChar w:fldCharType="end"/>
+                      </w:r>
+                      <w:r>
+                        <w:t xml:space="preserve"> SSD Modello di Analisi UC2</w:t>
+                      </w:r>
+                    </w:p>
+                  </w:txbxContent>
+                </v:textbox>
+                <w10:wrap type="tight"/>
+              </v:shape>
+            </w:pict>
+          </mc:Fallback>
+        </mc:AlternateContent>
+      </w:r>
       <w:r>
         <w:rPr>
           <w:rFonts w:ascii="Calibri" w:hAnsi="Calibri" w:cs="Calibri"/>
@@ -15452,6 +15668,14 @@
           <w:color w:val="000000" w:themeColor="text1"/>
         </w:rPr>
       </w:pPr>
+    </w:p>
+    <w:p>
+      <w:pPr>
+        <w:rPr>
+          <w:rFonts w:ascii="Calibri" w:hAnsi="Calibri" w:cs="Calibri"/>
+          <w:color w:val="000000" w:themeColor="text1"/>
+        </w:rPr>
+      </w:pPr>
       <w:proofErr w:type="spellStart"/>
       <w:r>
         <w:rPr>
@@ -15687,6 +15911,7 @@
           <w:rFonts w:ascii="Calibri" w:hAnsi="Calibri" w:cs="Calibri"/>
           <w:color w:val="000000" w:themeColor="text1"/>
         </w:rPr>
+        <w:lastRenderedPageBreak/>
         <w:t>Riferimenti: Caso d'uso: Creazione e aggiornamento di cartelle cliniche digitali</w:t>
       </w:r>
     </w:p>
@@ -15771,7 +15996,6 @@
           <w:rFonts w:ascii="Calibri" w:hAnsi="Calibri" w:cs="Calibri"/>
           <w:color w:val="000000" w:themeColor="text1"/>
         </w:rPr>
-        <w:lastRenderedPageBreak/>
         <w:t>3.</w:t>
       </w:r>
       <w:r>
@@ -15973,6 +16197,165 @@
           <w:color w:val="000000" w:themeColor="text1"/>
         </w:rPr>
       </w:pPr>
+      <w:r>
+        <w:rPr>
+          <w:noProof/>
+        </w:rPr>
+        <mc:AlternateContent>
+          <mc:Choice Requires="wps">
+            <w:drawing>
+              <wp:anchor distT="0" distB="0" distL="114300" distR="114300" simplePos="0" relativeHeight="251698176" behindDoc="1" locked="0" layoutInCell="1" allowOverlap="1" wp14:anchorId="3100CD7D" wp14:editId="31DF8E2B">
+                <wp:simplePos x="0" y="0"/>
+                <wp:positionH relativeFrom="column">
+                  <wp:posOffset>1905</wp:posOffset>
+                </wp:positionH>
+                <wp:positionV relativeFrom="paragraph">
+                  <wp:posOffset>2283460</wp:posOffset>
+                </wp:positionV>
+                <wp:extent cx="3987800" cy="635"/>
+                <wp:effectExtent l="0" t="0" r="0" b="0"/>
+                <wp:wrapTight wrapText="bothSides">
+                  <wp:wrapPolygon edited="0">
+                    <wp:start x="0" y="0"/>
+                    <wp:lineTo x="0" y="21600"/>
+                    <wp:lineTo x="21600" y="21600"/>
+                    <wp:lineTo x="21600" y="0"/>
+                  </wp:wrapPolygon>
+                </wp:wrapTight>
+                <wp:docPr id="114160978" name="Casella di testo 1"/>
+                <wp:cNvGraphicFramePr/>
+                <a:graphic xmlns:a="http://schemas.openxmlformats.org/drawingml/2006/main">
+                  <a:graphicData uri="http://schemas.microsoft.com/office/word/2010/wordprocessingShape">
+                    <wps:wsp>
+                      <wps:cNvSpPr txBox="1"/>
+                      <wps:spPr>
+                        <a:xfrm>
+                          <a:off x="0" y="0"/>
+                          <a:ext cx="3987800" cy="635"/>
+                        </a:xfrm>
+                        <a:prstGeom prst="rect">
+                          <a:avLst/>
+                        </a:prstGeom>
+                        <a:solidFill>
+                          <a:prstClr val="white"/>
+                        </a:solidFill>
+                        <a:ln>
+                          <a:noFill/>
+                        </a:ln>
+                      </wps:spPr>
+                      <wps:txbx>
+                        <w:txbxContent>
+                          <w:p>
+                            <w:pPr>
+                              <w:pStyle w:val="Didascalia"/>
+                              <w:rPr>
+                                <w:rFonts w:ascii="Calibri" w:hAnsi="Calibri" w:cs="Calibri"/>
+                                <w:noProof/>
+                                <w:color w:val="000000" w:themeColor="text1"/>
+                                <w:sz w:val="22"/>
+                                <w:szCs w:val="22"/>
+                              </w:rPr>
+                            </w:pPr>
+                            <w:r>
+                              <w:t xml:space="preserve">Figura </w:t>
+                            </w:r>
+                            <w:r>
+                              <w:fldChar w:fldCharType="begin"/>
+                            </w:r>
+                            <w:r>
+                              <w:instrText xml:space="preserve"> SEQ Figura \* ARABIC </w:instrText>
+                            </w:r>
+                            <w:r>
+                              <w:fldChar w:fldCharType="separate"/>
+                            </w:r>
+                            <w:r>
+                              <w:rPr>
+                                <w:noProof/>
+                              </w:rPr>
+                              <w:t>4</w:t>
+                            </w:r>
+                            <w:r>
+                              <w:fldChar w:fldCharType="end"/>
+                            </w:r>
+                            <w:r>
+                              <w:t xml:space="preserve"> </w:t>
+                            </w:r>
+                            <w:r>
+                              <w:t xml:space="preserve"> SSD Modello di Analisi UC</w:t>
+                            </w:r>
+                            <w:r>
+                              <w:t>3</w:t>
+                            </w:r>
+                          </w:p>
+                        </w:txbxContent>
+                      </wps:txbx>
+                      <wps:bodyPr rot="0" spcFirstLastPara="0" vertOverflow="overflow" horzOverflow="overflow" vert="horz" wrap="square" lIns="0" tIns="0" rIns="0" bIns="0" numCol="1" spcCol="0" rtlCol="0" fromWordArt="0" anchor="t" anchorCtr="0" forceAA="0" compatLnSpc="1">
+                        <a:prstTxWarp prst="textNoShape">
+                          <a:avLst/>
+                        </a:prstTxWarp>
+                        <a:spAutoFit/>
+                      </wps:bodyPr>
+                    </wps:wsp>
+                  </a:graphicData>
+                </a:graphic>
+              </wp:anchor>
+            </w:drawing>
+          </mc:Choice>
+          <mc:Fallback>
+            <w:pict>
+              <v:shape w14:anchorId="3100CD7D" id="_x0000_s1027" type="#_x0000_t202" style="position:absolute;margin-left:.15pt;margin-top:179.8pt;width:314pt;height:.05pt;z-index:-251618304;visibility:visible;mso-wrap-style:square;mso-wrap-distance-left:9pt;mso-wrap-distance-top:0;mso-wrap-distance-right:9pt;mso-wrap-distance-bottom:0;mso-position-horizontal:absolute;mso-position-horizontal-relative:text;mso-position-vertical:absolute;mso-position-vertical-relative:text;v-text-anchor:top" o:gfxdata="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" stroked="f">
+                <v:textbox style="mso-fit-shape-to-text:t" inset="0,0,0,0">
+                  <w:txbxContent>
+                    <w:p>
+                      <w:pPr>
+                        <w:pStyle w:val="Didascalia"/>
+                        <w:rPr>
+                          <w:rFonts w:ascii="Calibri" w:hAnsi="Calibri" w:cs="Calibri"/>
+                          <w:noProof/>
+                          <w:color w:val="000000" w:themeColor="text1"/>
+                          <w:sz w:val="22"/>
+                          <w:szCs w:val="22"/>
+                        </w:rPr>
+                      </w:pPr>
+                      <w:r>
+                        <w:t xml:space="preserve">Figura </w:t>
+                      </w:r>
+                      <w:r>
+                        <w:fldChar w:fldCharType="begin"/>
+                      </w:r>
+                      <w:r>
+                        <w:instrText xml:space="preserve"> SEQ Figura \* ARABIC </w:instrText>
+                      </w:r>
+                      <w:r>
+                        <w:fldChar w:fldCharType="separate"/>
+                      </w:r>
+                      <w:r>
+                        <w:rPr>
+                          <w:noProof/>
+                        </w:rPr>
+                        <w:t>4</w:t>
+                      </w:r>
+                      <w:r>
+                        <w:fldChar w:fldCharType="end"/>
+                      </w:r>
+                      <w:r>
+                        <w:t xml:space="preserve"> </w:t>
+                      </w:r>
+                      <w:r>
+                        <w:t xml:space="preserve"> SSD Modello di Analisi UC</w:t>
+                      </w:r>
+                      <w:r>
+                        <w:t>3</w:t>
+                      </w:r>
+                    </w:p>
+                  </w:txbxContent>
+                </v:textbox>
+                <w10:wrap type="tight"/>
+              </v:shape>
+            </w:pict>
+          </mc:Fallback>
+        </mc:AlternateContent>
+      </w:r>
       <w:r>
         <w:rPr>
           <w:rFonts w:ascii="Calibri" w:hAnsi="Calibri" w:cs="Calibri"/>
@@ -16101,6 +16484,14 @@
           <w:color w:val="000000" w:themeColor="text1"/>
         </w:rPr>
       </w:pPr>
+    </w:p>
+    <w:p>
+      <w:pPr>
+        <w:rPr>
+          <w:rFonts w:ascii="Calibri" w:hAnsi="Calibri" w:cs="Calibri"/>
+          <w:color w:val="000000" w:themeColor="text1"/>
+        </w:rPr>
+      </w:pPr>
       <w:r>
         <w:rPr>
           <w:rFonts w:ascii="Calibri" w:hAnsi="Calibri" w:cs="Calibri"/>
@@ -16258,6 +16649,7 @@
           <w:rFonts w:ascii="Calibri" w:hAnsi="Calibri" w:cs="Calibri"/>
           <w:color w:val="000000" w:themeColor="text1"/>
         </w:rPr>
+        <w:lastRenderedPageBreak/>
         <w:t>-è in corso una Visita;</w:t>
       </w:r>
     </w:p>
@@ -16409,7 +16801,6 @@
           <w:rFonts w:ascii="Calibri" w:hAnsi="Calibri" w:cs="Calibri"/>
           <w:color w:val="000000" w:themeColor="text1"/>
         </w:rPr>
-        <w:lastRenderedPageBreak/>
         <w:t>- è presente l’istanza m di Magazzino;</w:t>
       </w:r>
     </w:p>
@@ -16749,10 +17140,7 @@
     </w:p>
     <w:p>
       <w:pPr>
-        <w:rPr>
-          <w:rFonts w:ascii="Calibri" w:hAnsi="Calibri" w:cs="Calibri"/>
-          <w:color w:val="000000" w:themeColor="text1"/>
-        </w:rPr>
+        <w:keepNext/>
       </w:pPr>
       <w:r>
         <w:rPr>
@@ -16805,6 +17193,45 @@
     </w:p>
     <w:p>
       <w:pPr>
+        <w:pStyle w:val="Didascalia"/>
+        <w:rPr>
+          <w:rFonts w:ascii="Calibri" w:hAnsi="Calibri" w:cs="Calibri"/>
+          <w:color w:val="000000" w:themeColor="text1"/>
+        </w:rPr>
+      </w:pPr>
+      <w:r>
+        <w:t xml:space="preserve">Figura </w:t>
+      </w:r>
+      <w:r>
+        <w:fldChar w:fldCharType="begin"/>
+      </w:r>
+      <w:r>
+        <w:instrText xml:space="preserve"> SEQ Figura \* ARABIC </w:instrText>
+      </w:r>
+      <w:r>
+        <w:fldChar w:fldCharType="separate"/>
+      </w:r>
+      <w:r>
+        <w:rPr>
+          <w:noProof/>
+        </w:rPr>
+        <w:t>5</w:t>
+      </w:r>
+      <w:r>
+        <w:fldChar w:fldCharType="end"/>
+      </w:r>
+      <w:r>
+        <w:t xml:space="preserve"> </w:t>
+      </w:r>
+      <w:r>
+        <w:t xml:space="preserve"> SSD Modello di Analisi UC</w:t>
+      </w:r>
+      <w:r>
+        <w:t>4</w:t>
+      </w:r>
+    </w:p>
+    <w:p>
+      <w:pPr>
         <w:tabs>
           <w:tab w:val="left" w:pos="4259"/>
         </w:tabs>
@@ -16843,6 +17270,7 @@
           <w:rFonts w:ascii="Calibri" w:hAnsi="Calibri" w:cs="Calibri"/>
           <w:color w:val="000000" w:themeColor="text1"/>
         </w:rPr>
+        <w:lastRenderedPageBreak/>
         <w:t>1.</w:t>
       </w:r>
       <w:r>
@@ -16992,7 +17420,6 @@
           <w:rFonts w:ascii="Calibri" w:hAnsi="Calibri" w:cs="Calibri"/>
           <w:color w:val="000000" w:themeColor="text1"/>
         </w:rPr>
-        <w:lastRenderedPageBreak/>
         <w:t>-è in corso una Visita;</w:t>
       </w:r>
     </w:p>
@@ -17610,10 +18037,7 @@
     </w:p>
     <w:p>
       <w:pPr>
-        <w:rPr>
-          <w:rFonts w:ascii="Calibri" w:hAnsi="Calibri" w:cs="Calibri"/>
-          <w:color w:val="000000" w:themeColor="text1"/>
-        </w:rPr>
+        <w:keepNext/>
       </w:pPr>
       <w:r>
         <w:rPr>
@@ -17621,6 +18045,7 @@
           <w:noProof/>
           <w:color w:val="000000" w:themeColor="text1"/>
         </w:rPr>
+        <w:lastRenderedPageBreak/>
         <w:drawing>
           <wp:inline distT="0" distB="0" distL="0" distR="0" wp14:anchorId="699E0BDB" wp14:editId="441C1542">
             <wp:extent cx="3672968" cy="2075048"/>
@@ -17666,6 +18091,45 @@
     </w:p>
     <w:p>
       <w:pPr>
+        <w:pStyle w:val="Didascalia"/>
+        <w:rPr>
+          <w:rFonts w:ascii="Calibri" w:hAnsi="Calibri" w:cs="Calibri"/>
+          <w:color w:val="000000" w:themeColor="text1"/>
+        </w:rPr>
+      </w:pPr>
+      <w:r>
+        <w:t xml:space="preserve">Figura </w:t>
+      </w:r>
+      <w:r>
+        <w:fldChar w:fldCharType="begin"/>
+      </w:r>
+      <w:r>
+        <w:instrText xml:space="preserve"> SEQ Figura \* ARABIC </w:instrText>
+      </w:r>
+      <w:r>
+        <w:fldChar w:fldCharType="separate"/>
+      </w:r>
+      <w:r>
+        <w:rPr>
+          <w:noProof/>
+        </w:rPr>
+        <w:t>6</w:t>
+      </w:r>
+      <w:r>
+        <w:fldChar w:fldCharType="end"/>
+      </w:r>
+      <w:r>
+        <w:t xml:space="preserve"> </w:t>
+      </w:r>
+      <w:r>
+        <w:t xml:space="preserve"> SSD Modello di Analisi UC</w:t>
+      </w:r>
+      <w:r>
+        <w:t>5</w:t>
+      </w:r>
+    </w:p>
+    <w:p>
+      <w:pPr>
         <w:rPr>
           <w:rFonts w:ascii="Calibri" w:hAnsi="Calibri" w:cs="Calibri"/>
           <w:color w:val="000000" w:themeColor="text1"/>
@@ -17762,7 +18226,6 @@
           <w:rFonts w:ascii="Calibri" w:hAnsi="Calibri" w:cs="Calibri"/>
           <w:color w:val="000000" w:themeColor="text1"/>
         </w:rPr>
-        <w:lastRenderedPageBreak/>
         <w:t xml:space="preserve">Riferimenti: </w:t>
       </w:r>
       <w:r>
@@ -18052,17 +18515,206 @@
       <w:r>
         <w:rPr>
           <w:rFonts w:ascii="Calibri" w:hAnsi="Calibri" w:cs="Calibri"/>
+          <w:color w:val="000000" w:themeColor="text1"/>
+        </w:rPr>
+        <w:t>- gli attributi di ap sono stati inizializzati;</w:t>
+      </w:r>
+      <w:r>
+        <w:rPr>
+          <w:rFonts w:ascii="Calibri" w:hAnsi="Calibri" w:cs="Calibri"/>
+          <w:color w:val="000000" w:themeColor="text1"/>
+        </w:rPr>
+        <w:br/>
+      </w:r>
+      <w:r>
+        <w:rPr>
+          <w:rFonts w:ascii="Calibri" w:hAnsi="Calibri" w:cs="Calibri"/>
+          <w:color w:val="000000" w:themeColor="text1"/>
+        </w:rPr>
+        <w:br/>
+        <w:t>Scenario principale UC6</w:t>
+      </w:r>
+    </w:p>
+    <w:p>
+      <w:pPr>
+        <w:rPr>
+          <w:rFonts w:ascii="Calibri" w:hAnsi="Calibri" w:cs="Calibri"/>
+          <w:color w:val="000000" w:themeColor="text1"/>
+        </w:rPr>
+      </w:pPr>
+      <w:r>
+        <w:rPr>
           <w:noProof/>
+        </w:rPr>
+        <mc:AlternateContent>
+          <mc:Choice Requires="wps">
+            <w:drawing>
+              <wp:anchor distT="0" distB="0" distL="114300" distR="114300" simplePos="0" relativeHeight="251700224" behindDoc="0" locked="0" layoutInCell="1" allowOverlap="1" wp14:anchorId="5B45446D" wp14:editId="00133D16">
+                <wp:simplePos x="0" y="0"/>
+                <wp:positionH relativeFrom="column">
+                  <wp:posOffset>-635</wp:posOffset>
+                </wp:positionH>
+                <wp:positionV relativeFrom="paragraph">
+                  <wp:posOffset>1990090</wp:posOffset>
+                </wp:positionV>
+                <wp:extent cx="3295650" cy="635"/>
+                <wp:effectExtent l="0" t="0" r="0" b="0"/>
+                <wp:wrapThrough wrapText="bothSides">
+                  <wp:wrapPolygon edited="0">
+                    <wp:start x="0" y="0"/>
+                    <wp:lineTo x="0" y="21600"/>
+                    <wp:lineTo x="21600" y="21600"/>
+                    <wp:lineTo x="21600" y="0"/>
+                  </wp:wrapPolygon>
+                </wp:wrapThrough>
+                <wp:docPr id="490062238" name="Casella di testo 1"/>
+                <wp:cNvGraphicFramePr/>
+                <a:graphic xmlns:a="http://schemas.openxmlformats.org/drawingml/2006/main">
+                  <a:graphicData uri="http://schemas.microsoft.com/office/word/2010/wordprocessingShape">
+                    <wps:wsp>
+                      <wps:cNvSpPr txBox="1"/>
+                      <wps:spPr>
+                        <a:xfrm>
+                          <a:off x="0" y="0"/>
+                          <a:ext cx="3295650" cy="635"/>
+                        </a:xfrm>
+                        <a:prstGeom prst="rect">
+                          <a:avLst/>
+                        </a:prstGeom>
+                        <a:solidFill>
+                          <a:prstClr val="white"/>
+                        </a:solidFill>
+                        <a:ln>
+                          <a:noFill/>
+                        </a:ln>
+                      </wps:spPr>
+                      <wps:txbx>
+                        <w:txbxContent>
+                          <w:p>
+                            <w:pPr>
+                              <w:pStyle w:val="Didascalia"/>
+                              <w:rPr>
+                                <w:rFonts w:ascii="Calibri" w:hAnsi="Calibri" w:cs="Calibri"/>
+                                <w:noProof/>
+                                <w:color w:val="000000" w:themeColor="text1"/>
+                                <w:sz w:val="22"/>
+                                <w:szCs w:val="22"/>
+                              </w:rPr>
+                            </w:pPr>
+                            <w:r>
+                              <w:t xml:space="preserve">Figura </w:t>
+                            </w:r>
+                            <w:r>
+                              <w:fldChar w:fldCharType="begin"/>
+                            </w:r>
+                            <w:r>
+                              <w:instrText xml:space="preserve"> SEQ Figura \* ARABIC </w:instrText>
+                            </w:r>
+                            <w:r>
+                              <w:fldChar w:fldCharType="separate"/>
+                            </w:r>
+                            <w:r>
+                              <w:rPr>
+                                <w:noProof/>
+                              </w:rPr>
+                              <w:t>7</w:t>
+                            </w:r>
+                            <w:r>
+                              <w:fldChar w:fldCharType="end"/>
+                            </w:r>
+                            <w:r>
+                              <w:t xml:space="preserve"> </w:t>
+                            </w:r>
+                            <w:r>
+                              <w:t xml:space="preserve"> SSD Modello di Analisi UC</w:t>
+                            </w:r>
+                            <w:r>
+                              <w:t>6</w:t>
+                            </w:r>
+                          </w:p>
+                        </w:txbxContent>
+                      </wps:txbx>
+                      <wps:bodyPr rot="0" spcFirstLastPara="0" vertOverflow="overflow" horzOverflow="overflow" vert="horz" wrap="square" lIns="0" tIns="0" rIns="0" bIns="0" numCol="1" spcCol="0" rtlCol="0" fromWordArt="0" anchor="t" anchorCtr="0" forceAA="0" compatLnSpc="1">
+                        <a:prstTxWarp prst="textNoShape">
+                          <a:avLst/>
+                        </a:prstTxWarp>
+                        <a:spAutoFit/>
+                      </wps:bodyPr>
+                    </wps:wsp>
+                  </a:graphicData>
+                </a:graphic>
+              </wp:anchor>
+            </w:drawing>
+          </mc:Choice>
+          <mc:Fallback>
+            <w:pict>
+              <v:shape w14:anchorId="5B45446D" id="_x0000_s1028" type="#_x0000_t202" style="position:absolute;margin-left:-.05pt;margin-top:156.7pt;width:259.5pt;height:.05pt;z-index:251700224;visibility:visible;mso-wrap-style:square;mso-wrap-distance-left:9pt;mso-wrap-distance-top:0;mso-wrap-distance-right:9pt;mso-wrap-distance-bottom:0;mso-position-horizontal:absolute;mso-position-horizontal-relative:text;mso-position-vertical:absolute;mso-position-vertical-relative:text;v-text-anchor:top" o:gfxdata="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" stroked="f">
+                <v:textbox style="mso-fit-shape-to-text:t" inset="0,0,0,0">
+                  <w:txbxContent>
+                    <w:p>
+                      <w:pPr>
+                        <w:pStyle w:val="Didascalia"/>
+                        <w:rPr>
+                          <w:rFonts w:ascii="Calibri" w:hAnsi="Calibri" w:cs="Calibri"/>
+                          <w:noProof/>
+                          <w:color w:val="000000" w:themeColor="text1"/>
+                          <w:sz w:val="22"/>
+                          <w:szCs w:val="22"/>
+                        </w:rPr>
+                      </w:pPr>
+                      <w:r>
+                        <w:t xml:space="preserve">Figura </w:t>
+                      </w:r>
+                      <w:r>
+                        <w:fldChar w:fldCharType="begin"/>
+                      </w:r>
+                      <w:r>
+                        <w:instrText xml:space="preserve"> SEQ Figura \* ARABIC </w:instrText>
+                      </w:r>
+                      <w:r>
+                        <w:fldChar w:fldCharType="separate"/>
+                      </w:r>
+                      <w:r>
+                        <w:rPr>
+                          <w:noProof/>
+                        </w:rPr>
+                        <w:t>7</w:t>
+                      </w:r>
+                      <w:r>
+                        <w:fldChar w:fldCharType="end"/>
+                      </w:r>
+                      <w:r>
+                        <w:t xml:space="preserve"> </w:t>
+                      </w:r>
+                      <w:r>
+                        <w:t xml:space="preserve"> SSD Modello di Analisi UC</w:t>
+                      </w:r>
+                      <w:r>
+                        <w:t>6</w:t>
+                      </w:r>
+                    </w:p>
+                  </w:txbxContent>
+                </v:textbox>
+                <w10:wrap type="through"/>
+              </v:shape>
+            </w:pict>
+          </mc:Fallback>
+        </mc:AlternateContent>
+      </w:r>
+      <w:r>
+        <w:rPr>
+          <w:rFonts w:ascii="Calibri" w:hAnsi="Calibri" w:cs="Calibri"/>
+          <w:noProof/>
           <w:color w:val="000000" w:themeColor="text1"/>
         </w:rPr>
         <w:drawing>
-          <wp:anchor distT="0" distB="0" distL="114300" distR="114300" simplePos="0" relativeHeight="251653120" behindDoc="1" locked="0" layoutInCell="1" allowOverlap="1" wp14:anchorId="510FBAB9" wp14:editId="7E7A8849">
+          <wp:anchor distT="0" distB="0" distL="114300" distR="114300" simplePos="0" relativeHeight="251653120" behindDoc="1" locked="0" layoutInCell="1" allowOverlap="1" wp14:anchorId="510FBAB9" wp14:editId="0A889C0B">
             <wp:simplePos x="0" y="0"/>
             <wp:positionH relativeFrom="margin">
-              <wp:posOffset>2407285</wp:posOffset>
+              <wp:posOffset>-867</wp:posOffset>
             </wp:positionH>
             <wp:positionV relativeFrom="paragraph">
-              <wp:posOffset>383540</wp:posOffset>
+              <wp:posOffset>9331</wp:posOffset>
             </wp:positionV>
             <wp:extent cx="3295650" cy="1924050"/>
             <wp:effectExtent l="0" t="0" r="0" b="0"/>
@@ -18119,28 +18771,14 @@
           </wp:anchor>
         </w:drawing>
       </w:r>
-      <w:r>
-        <w:rPr>
-          <w:rFonts w:ascii="Calibri" w:hAnsi="Calibri" w:cs="Calibri"/>
-          <w:color w:val="000000" w:themeColor="text1"/>
-        </w:rPr>
-        <w:t>- gli attributi di ap sono stati inizializzati;</w:t>
-      </w:r>
-      <w:r>
-        <w:rPr>
-          <w:rFonts w:ascii="Calibri" w:hAnsi="Calibri" w:cs="Calibri"/>
-          <w:color w:val="000000" w:themeColor="text1"/>
-        </w:rPr>
-        <w:br/>
-      </w:r>
-      <w:r>
-        <w:rPr>
-          <w:rFonts w:ascii="Calibri" w:hAnsi="Calibri" w:cs="Calibri"/>
-          <w:color w:val="000000" w:themeColor="text1"/>
-        </w:rPr>
-        <w:br/>
-        <w:t>Scenario principale UC6</w:t>
-      </w:r>
+    </w:p>
+    <w:p>
+      <w:pPr>
+        <w:rPr>
+          <w:rFonts w:ascii="Calibri" w:hAnsi="Calibri" w:cs="Calibri"/>
+          <w:color w:val="000000" w:themeColor="text1"/>
+        </w:rPr>
+      </w:pPr>
     </w:p>
     <w:p>
       <w:pPr>
@@ -18217,6 +18855,7 @@
           <w:rFonts w:ascii="Calibri" w:hAnsi="Calibri" w:cs="Calibri"/>
           <w:color w:val="000000" w:themeColor="text1"/>
         </w:rPr>
+        <w:lastRenderedPageBreak/>
         <w:t>1.</w:t>
       </w:r>
       <w:r>
@@ -18578,7 +19217,6 @@
           <w:rFonts w:ascii="Calibri" w:hAnsi="Calibri" w:cs="Calibri"/>
           <w:color w:val="000000" w:themeColor="text1"/>
         </w:rPr>
-        <w:lastRenderedPageBreak/>
         <w:t>- gli attributi di op sono stati inizializzati;</w:t>
       </w:r>
     </w:p>
@@ -18635,6 +19273,159 @@
           <w:color w:val="000000" w:themeColor="text1"/>
         </w:rPr>
       </w:pPr>
+      <w:r>
+        <w:rPr>
+          <w:noProof/>
+        </w:rPr>
+        <mc:AlternateContent>
+          <mc:Choice Requires="wps">
+            <w:drawing>
+              <wp:anchor distT="0" distB="0" distL="114300" distR="114300" simplePos="0" relativeHeight="251702272" behindDoc="1" locked="0" layoutInCell="1" allowOverlap="1" wp14:anchorId="50EBA2A5" wp14:editId="4F1FD569">
+                <wp:simplePos x="0" y="0"/>
+                <wp:positionH relativeFrom="column">
+                  <wp:posOffset>-90170</wp:posOffset>
+                </wp:positionH>
+                <wp:positionV relativeFrom="paragraph">
+                  <wp:posOffset>3394710</wp:posOffset>
+                </wp:positionV>
+                <wp:extent cx="4126230" cy="635"/>
+                <wp:effectExtent l="0" t="0" r="0" b="0"/>
+                <wp:wrapTight wrapText="bothSides">
+                  <wp:wrapPolygon edited="0">
+                    <wp:start x="0" y="0"/>
+                    <wp:lineTo x="0" y="21600"/>
+                    <wp:lineTo x="21600" y="21600"/>
+                    <wp:lineTo x="21600" y="0"/>
+                  </wp:wrapPolygon>
+                </wp:wrapTight>
+                <wp:docPr id="1166533371" name="Casella di testo 1"/>
+                <wp:cNvGraphicFramePr/>
+                <a:graphic xmlns:a="http://schemas.openxmlformats.org/drawingml/2006/main">
+                  <a:graphicData uri="http://schemas.microsoft.com/office/word/2010/wordprocessingShape">
+                    <wps:wsp>
+                      <wps:cNvSpPr txBox="1"/>
+                      <wps:spPr>
+                        <a:xfrm>
+                          <a:off x="0" y="0"/>
+                          <a:ext cx="4126230" cy="635"/>
+                        </a:xfrm>
+                        <a:prstGeom prst="rect">
+                          <a:avLst/>
+                        </a:prstGeom>
+                        <a:solidFill>
+                          <a:prstClr val="white"/>
+                        </a:solidFill>
+                        <a:ln>
+                          <a:noFill/>
+                        </a:ln>
+                      </wps:spPr>
+                      <wps:txbx>
+                        <w:txbxContent>
+                          <w:p>
+                            <w:pPr>
+                              <w:pStyle w:val="Didascalia"/>
+                              <w:rPr>
+                                <w:rFonts w:ascii="Calibri" w:hAnsi="Calibri" w:cs="Calibri"/>
+                                <w:noProof/>
+                                <w:color w:val="000000" w:themeColor="text1"/>
+                                <w:sz w:val="22"/>
+                                <w:szCs w:val="22"/>
+                              </w:rPr>
+                            </w:pPr>
+                            <w:r>
+                              <w:t xml:space="preserve">Figura </w:t>
+                            </w:r>
+                            <w:r>
+                              <w:fldChar w:fldCharType="begin"/>
+                            </w:r>
+                            <w:r>
+                              <w:instrText xml:space="preserve"> SEQ Figura \* ARABIC </w:instrText>
+                            </w:r>
+                            <w:r>
+                              <w:fldChar w:fldCharType="separate"/>
+                            </w:r>
+                            <w:r>
+                              <w:rPr>
+                                <w:noProof/>
+                              </w:rPr>
+                              <w:t>8</w:t>
+                            </w:r>
+                            <w:r>
+                              <w:fldChar w:fldCharType="end"/>
+                            </w:r>
+                            <w:r>
+                              <w:t xml:space="preserve"> SSD Modello di Analisi UC</w:t>
+                            </w:r>
+                            <w:r>
+                              <w:t>7</w:t>
+                            </w:r>
+                          </w:p>
+                        </w:txbxContent>
+                      </wps:txbx>
+                      <wps:bodyPr rot="0" spcFirstLastPara="0" vertOverflow="overflow" horzOverflow="overflow" vert="horz" wrap="square" lIns="0" tIns="0" rIns="0" bIns="0" numCol="1" spcCol="0" rtlCol="0" fromWordArt="0" anchor="t" anchorCtr="0" forceAA="0" compatLnSpc="1">
+                        <a:prstTxWarp prst="textNoShape">
+                          <a:avLst/>
+                        </a:prstTxWarp>
+                        <a:spAutoFit/>
+                      </wps:bodyPr>
+                    </wps:wsp>
+                  </a:graphicData>
+                </a:graphic>
+              </wp:anchor>
+            </w:drawing>
+          </mc:Choice>
+          <mc:Fallback>
+            <w:pict>
+              <v:shape w14:anchorId="50EBA2A5" id="_x0000_s1029" type="#_x0000_t202" style="position:absolute;margin-left:-7.1pt;margin-top:267.3pt;width:324.9pt;height:.05pt;z-index:-251614208;visibility:visible;mso-wrap-style:square;mso-wrap-distance-left:9pt;mso-wrap-distance-top:0;mso-wrap-distance-right:9pt;mso-wrap-distance-bottom:0;mso-position-horizontal:absolute;mso-position-horizontal-relative:text;mso-position-vertical:absolute;mso-position-vertical-relative:text;v-text-anchor:top" o:gfxdata="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" stroked="f">
+                <v:textbox style="mso-fit-shape-to-text:t" inset="0,0,0,0">
+                  <w:txbxContent>
+                    <w:p>
+                      <w:pPr>
+                        <w:pStyle w:val="Didascalia"/>
+                        <w:rPr>
+                          <w:rFonts w:ascii="Calibri" w:hAnsi="Calibri" w:cs="Calibri"/>
+                          <w:noProof/>
+                          <w:color w:val="000000" w:themeColor="text1"/>
+                          <w:sz w:val="22"/>
+                          <w:szCs w:val="22"/>
+                        </w:rPr>
+                      </w:pPr>
+                      <w:r>
+                        <w:t xml:space="preserve">Figura </w:t>
+                      </w:r>
+                      <w:r>
+                        <w:fldChar w:fldCharType="begin"/>
+                      </w:r>
+                      <w:r>
+                        <w:instrText xml:space="preserve"> SEQ Figura \* ARABIC </w:instrText>
+                      </w:r>
+                      <w:r>
+                        <w:fldChar w:fldCharType="separate"/>
+                      </w:r>
+                      <w:r>
+                        <w:rPr>
+                          <w:noProof/>
+                        </w:rPr>
+                        <w:t>8</w:t>
+                      </w:r>
+                      <w:r>
+                        <w:fldChar w:fldCharType="end"/>
+                      </w:r>
+                      <w:r>
+                        <w:t xml:space="preserve"> SSD Modello di Analisi UC</w:t>
+                      </w:r>
+                      <w:r>
+                        <w:t>7</w:t>
+                      </w:r>
+                    </w:p>
+                  </w:txbxContent>
+                </v:textbox>
+                <w10:wrap type="tight"/>
+              </v:shape>
+            </w:pict>
+          </mc:Fallback>
+        </mc:AlternateContent>
+      </w:r>
       <w:r>
         <w:rPr>
           <w:rFonts w:ascii="Calibri" w:hAnsi="Calibri" w:cs="Calibri"/>
@@ -18801,6 +19592,14 @@
           <w:color w:val="000000" w:themeColor="text1"/>
         </w:rPr>
       </w:pPr>
+    </w:p>
+    <w:p>
+      <w:pPr>
+        <w:rPr>
+          <w:rFonts w:ascii="Calibri" w:hAnsi="Calibri" w:cs="Calibri"/>
+          <w:color w:val="000000" w:themeColor="text1"/>
+        </w:rPr>
+      </w:pPr>
       <w:r>
         <w:rPr>
           <w:rFonts w:ascii="Calibri" w:hAnsi="Calibri" w:cs="Calibri"/>
@@ -18844,6 +19643,7 @@
           <w:rFonts w:ascii="Calibri" w:hAnsi="Calibri" w:cs="Calibri"/>
           <w:color w:val="000000" w:themeColor="text1"/>
         </w:rPr>
+        <w:lastRenderedPageBreak/>
         <w:t>Operazione:</w:t>
       </w:r>
       <w:r>
@@ -19150,10 +19950,7 @@
     </w:p>
     <w:p>
       <w:pPr>
-        <w:rPr>
-          <w:rFonts w:ascii="Calibri" w:hAnsi="Calibri" w:cs="Calibri"/>
-          <w:color w:val="000000" w:themeColor="text1"/>
-        </w:rPr>
+        <w:keepNext/>
       </w:pPr>
       <w:r>
         <w:rPr>
@@ -19161,7 +19958,6 @@
           <w:noProof/>
           <w:color w:val="000000" w:themeColor="text1"/>
         </w:rPr>
-        <w:lastRenderedPageBreak/>
         <w:drawing>
           <wp:inline distT="0" distB="0" distL="0" distR="0" wp14:anchorId="654BA34C" wp14:editId="40528667">
             <wp:extent cx="4280007" cy="3378532"/>
@@ -19207,6 +20003,45 @@
     </w:p>
     <w:p>
       <w:pPr>
+        <w:pStyle w:val="Didascalia"/>
+        <w:rPr>
+          <w:rFonts w:ascii="Calibri" w:hAnsi="Calibri" w:cs="Calibri"/>
+          <w:color w:val="000000" w:themeColor="text1"/>
+        </w:rPr>
+      </w:pPr>
+      <w:r>
+        <w:t xml:space="preserve">Figura </w:t>
+      </w:r>
+      <w:r>
+        <w:fldChar w:fldCharType="begin"/>
+      </w:r>
+      <w:r>
+        <w:instrText xml:space="preserve"> SEQ Figura \* ARABIC </w:instrText>
+      </w:r>
+      <w:r>
+        <w:fldChar w:fldCharType="separate"/>
+      </w:r>
+      <w:r>
+        <w:rPr>
+          <w:noProof/>
+        </w:rPr>
+        <w:t>9</w:t>
+      </w:r>
+      <w:r>
+        <w:fldChar w:fldCharType="end"/>
+      </w:r>
+      <w:r>
+        <w:t xml:space="preserve"> </w:t>
+      </w:r>
+      <w:r>
+        <w:t xml:space="preserve"> SSD Modello di Analisi UC</w:t>
+      </w:r>
+      <w:r>
+        <w:t>8</w:t>
+      </w:r>
+    </w:p>
+    <w:p>
+      <w:pPr>
         <w:rPr>
           <w:rFonts w:ascii="Calibri" w:hAnsi="Calibri" w:cs="Calibri"/>
           <w:color w:val="000000" w:themeColor="text1"/>
@@ -19332,6 +20167,7 @@
           <w:rFonts w:ascii="Calibri" w:hAnsi="Calibri" w:cs="Calibri"/>
           <w:color w:val="000000" w:themeColor="text1"/>
         </w:rPr>
+        <w:lastRenderedPageBreak/>
         <w:t>Post-condizioni:</w:t>
       </w:r>
       <w:r>
@@ -19400,25 +20236,7 @@
     </w:p>
     <w:p>
       <w:pPr>
-        <w:rPr>
-          <w:rFonts w:ascii="Calibri" w:hAnsi="Calibri" w:cs="Calibri"/>
-          <w:color w:val="000000" w:themeColor="text1"/>
-        </w:rPr>
-      </w:pPr>
-      <w:r>
-        <w:rPr>
-          <w:rFonts w:ascii="Calibri" w:hAnsi="Calibri" w:cs="Calibri"/>
-          <w:color w:val="000000" w:themeColor="text1"/>
-        </w:rPr>
-        <w:t>Il Diagramma delle Classi risultante è il seguente:</w:t>
-      </w:r>
-    </w:p>
-    <w:p>
-      <w:pPr>
-        <w:rPr>
-          <w:rFonts w:ascii="Calibri" w:hAnsi="Calibri" w:cs="Calibri"/>
-          <w:color w:val="000000" w:themeColor="text1"/>
-        </w:rPr>
+        <w:keepNext/>
       </w:pPr>
       <w:r>
         <w:rPr>
@@ -19426,7 +20244,6 @@
           <w:noProof/>
           <w:color w:val="000000" w:themeColor="text1"/>
         </w:rPr>
-        <w:lastRenderedPageBreak/>
         <w:drawing>
           <wp:inline distT="0" distB="0" distL="0" distR="0" wp14:anchorId="56675FE6" wp14:editId="2FC1A438">
             <wp:extent cx="6120130" cy="3305175"/>
@@ -19472,6 +20289,39 @@
     </w:p>
     <w:p>
       <w:pPr>
+        <w:pStyle w:val="Didascalia"/>
+        <w:rPr>
+          <w:rFonts w:ascii="Calibri" w:hAnsi="Calibri" w:cs="Calibri"/>
+          <w:color w:val="000000" w:themeColor="text1"/>
+        </w:rPr>
+      </w:pPr>
+      <w:r>
+        <w:t xml:space="preserve">Figura </w:t>
+      </w:r>
+      <w:r>
+        <w:fldChar w:fldCharType="begin"/>
+      </w:r>
+      <w:r>
+        <w:instrText xml:space="preserve"> SEQ Figura \* ARABIC </w:instrText>
+      </w:r>
+      <w:r>
+        <w:fldChar w:fldCharType="separate"/>
+      </w:r>
+      <w:r>
+        <w:rPr>
+          <w:noProof/>
+        </w:rPr>
+        <w:t>10</w:t>
+      </w:r>
+      <w:r>
+        <w:fldChar w:fldCharType="end"/>
+      </w:r>
+      <w:r>
+        <w:t xml:space="preserve"> Diagramma delle Classi</w:t>
+      </w:r>
+    </w:p>
+    <w:p>
+      <w:pPr>
         <w:pStyle w:val="Subtitle1"/>
       </w:pPr>
       <w:bookmarkStart w:id="40" w:name="_Toc221933047"/>
@@ -19514,13 +20364,13 @@
           <w:color w:val="000000" w:themeColor="text1"/>
         </w:rPr>
         <w:drawing>
-          <wp:anchor distT="0" distB="0" distL="114300" distR="114300" simplePos="0" relativeHeight="251669504" behindDoc="1" locked="0" layoutInCell="1" allowOverlap="1" wp14:anchorId="592AD052" wp14:editId="62A292CE">
+          <wp:anchor distT="0" distB="0" distL="114300" distR="114300" simplePos="0" relativeHeight="251669504" behindDoc="1" locked="0" layoutInCell="1" allowOverlap="1" wp14:anchorId="592AD052" wp14:editId="435281D3">
             <wp:simplePos x="0" y="0"/>
             <wp:positionH relativeFrom="margin">
               <wp:align>right</wp:align>
             </wp:positionH>
-            <wp:positionV relativeFrom="paragraph">
-              <wp:posOffset>283210</wp:posOffset>
+            <wp:positionV relativeFrom="page">
+              <wp:posOffset>1183005</wp:posOffset>
             </wp:positionV>
             <wp:extent cx="6120130" cy="2414270"/>
             <wp:effectExtent l="0" t="0" r="0" b="5080"/>
@@ -19612,9 +20462,8 @@
           <w:noProof/>
           <w:color w:val="000000" w:themeColor="text1"/>
         </w:rPr>
-        <w:lastRenderedPageBreak/>
         <w:drawing>
-          <wp:anchor distT="0" distB="0" distL="114300" distR="114300" simplePos="0" relativeHeight="251667456" behindDoc="1" locked="0" layoutInCell="1" allowOverlap="1" wp14:anchorId="1CA21F51" wp14:editId="5FD050DD">
+          <wp:anchor distT="0" distB="0" distL="114300" distR="114300" simplePos="0" relativeHeight="251667456" behindDoc="1" locked="0" layoutInCell="1" allowOverlap="1" wp14:anchorId="1CA21F51" wp14:editId="02E92865">
             <wp:simplePos x="0" y="0"/>
             <wp:positionH relativeFrom="margin">
               <wp:align>right</wp:align>
@@ -19694,30 +20543,27 @@
       <w:r>
         <w:rPr>
           <w:rFonts w:ascii="Calibri" w:hAnsi="Calibri" w:cs="Calibri"/>
+          <w:color w:val="000000" w:themeColor="text1"/>
+        </w:rPr>
+        <w:t>Generazione e salvataggio di una nuova terapia</w:t>
+      </w:r>
+    </w:p>
+    <w:p>
+      <w:pPr>
+        <w:pStyle w:val="Paragrafoelenco"/>
+        <w:keepNext/>
+      </w:pPr>
+      <w:r>
+        <w:rPr>
+          <w:rFonts w:ascii="Calibri" w:hAnsi="Calibri" w:cs="Calibri"/>
           <w:noProof/>
           <w:color w:val="000000" w:themeColor="text1"/>
         </w:rPr>
         <w:drawing>
-          <wp:anchor distT="0" distB="0" distL="114300" distR="114300" simplePos="0" relativeHeight="251677696" behindDoc="1" locked="0" layoutInCell="1" allowOverlap="1" wp14:anchorId="19E1C084" wp14:editId="6E4B6C17">
-            <wp:simplePos x="0" y="0"/>
-            <wp:positionH relativeFrom="margin">
-              <wp:posOffset>138313</wp:posOffset>
-            </wp:positionH>
-            <wp:positionV relativeFrom="paragraph">
-              <wp:posOffset>2728349</wp:posOffset>
-            </wp:positionV>
-            <wp:extent cx="6120130" cy="3582670"/>
-            <wp:effectExtent l="0" t="0" r="0" b="0"/>
-            <wp:wrapTight wrapText="bothSides">
-              <wp:wrapPolygon edited="0">
-                <wp:start x="0" y="0"/>
-                <wp:lineTo x="0" y="21477"/>
-                <wp:lineTo x="21515" y="21477"/>
-                <wp:lineTo x="21515" y="0"/>
-                <wp:lineTo x="0" y="0"/>
-              </wp:wrapPolygon>
-            </wp:wrapTight>
-            <wp:docPr id="812492478" name="Immagine 18" descr="Immagine che contiene testo, diagramma, Parallelo, linea&#10;&#10;Il contenuto generato dall'IA potrebbe non essere corretto."/>
+          <wp:inline distT="0" distB="0" distL="0" distR="0" wp14:anchorId="5938DDA0" wp14:editId="3C93FC04">
+            <wp:extent cx="4347210" cy="2545715"/>
+            <wp:effectExtent l="0" t="0" r="0" b="6985"/>
+            <wp:docPr id="1346670790" name="Immagine 3"/>
             <wp:cNvGraphicFramePr>
               <a:graphicFrameLocks xmlns:a="http://schemas.openxmlformats.org/drawingml/2006/main" noChangeAspect="1"/>
             </wp:cNvGraphicFramePr>
@@ -19725,8 +20571,10 @@
               <a:graphicData uri="http://schemas.openxmlformats.org/drawingml/2006/picture">
                 <pic:pic xmlns:pic="http://schemas.openxmlformats.org/drawingml/2006/picture">
                   <pic:nvPicPr>
-                    <pic:cNvPr id="812492478" name="Immagine 18" descr="Immagine che contiene testo, diagramma, Parallelo, linea&#10;&#10;Il contenuto generato dall'IA potrebbe non essere corretto."/>
-                    <pic:cNvPicPr/>
+                    <pic:cNvPr id="0" name="Picture 4"/>
+                    <pic:cNvPicPr>
+                      <a:picLocks noChangeAspect="1" noChangeArrowheads="1"/>
+                    </pic:cNvPicPr>
                   </pic:nvPicPr>
                   <pic:blipFill>
                     <a:blip r:embed="rId23">
@@ -19736,31 +20584,26 @@
                         </a:ext>
                       </a:extLst>
                     </a:blip>
+                    <a:srcRect/>
                     <a:stretch>
                       <a:fillRect/>
                     </a:stretch>
                   </pic:blipFill>
-                  <pic:spPr>
+                  <pic:spPr bwMode="auto">
                     <a:xfrm>
                       <a:off x="0" y="0"/>
-                      <a:ext cx="6120130" cy="3582670"/>
+                      <a:ext cx="4347210" cy="2545715"/>
                     </a:xfrm>
                     <a:prstGeom prst="rect">
                       <a:avLst/>
                     </a:prstGeom>
+                    <a:noFill/>
                   </pic:spPr>
                 </pic:pic>
               </a:graphicData>
             </a:graphic>
-          </wp:anchor>
+          </wp:inline>
         </w:drawing>
-      </w:r>
-      <w:r>
-        <w:rPr>
-          <w:rFonts w:ascii="Calibri" w:hAnsi="Calibri" w:cs="Calibri"/>
-          <w:color w:val="000000" w:themeColor="text1"/>
-        </w:rPr>
-        <w:t>Generazione e salvataggio di una nuova terapia</w:t>
       </w:r>
     </w:p>
     <w:p>
@@ -19791,6 +20634,14 @@
           <w:color w:val="000000" w:themeColor="text1"/>
         </w:rPr>
       </w:pPr>
+    </w:p>
+    <w:p>
+      <w:pPr>
+        <w:rPr>
+          <w:rFonts w:ascii="Calibri" w:hAnsi="Calibri" w:cs="Calibri"/>
+          <w:color w:val="000000" w:themeColor="text1"/>
+        </w:rPr>
+      </w:pPr>
       <w:r>
         <w:rPr>
           <w:rFonts w:ascii="Calibri" w:hAnsi="Calibri" w:cs="Calibri"/>
@@ -19798,13 +20649,13 @@
           <w:color w:val="000000" w:themeColor="text1"/>
         </w:rPr>
         <w:drawing>
-          <wp:anchor distT="0" distB="0" distL="114300" distR="114300" simplePos="0" relativeHeight="251683840" behindDoc="1" locked="0" layoutInCell="1" allowOverlap="1" wp14:anchorId="7CCA5662" wp14:editId="21EEE768">
+          <wp:anchor distT="0" distB="0" distL="114300" distR="114300" simplePos="0" relativeHeight="251683840" behindDoc="1" locked="0" layoutInCell="1" allowOverlap="1" wp14:anchorId="7CCA5662" wp14:editId="541CB22F">
             <wp:simplePos x="0" y="0"/>
             <wp:positionH relativeFrom="column">
-              <wp:posOffset>101770</wp:posOffset>
+              <wp:posOffset>71750</wp:posOffset>
             </wp:positionH>
-            <wp:positionV relativeFrom="paragraph">
-              <wp:posOffset>163606</wp:posOffset>
+            <wp:positionV relativeFrom="page">
+              <wp:posOffset>6990167</wp:posOffset>
             </wp:positionV>
             <wp:extent cx="5408930" cy="1965325"/>
             <wp:effectExtent l="0" t="0" r="1270" b="0"/>
@@ -19862,14 +20713,6 @@
         </w:drawing>
       </w:r>
     </w:p>
-    <w:p>
-      <w:pPr>
-        <w:rPr>
-          <w:rFonts w:ascii="Calibri" w:hAnsi="Calibri" w:cs="Calibri"/>
-          <w:color w:val="000000" w:themeColor="text1"/>
-        </w:rPr>
-      </w:pPr>
-    </w:p>
     <w:p/>
     <w:p/>
     <w:p/>
@@ -19885,6 +20728,14 @@
         </w:numPr>
       </w:pPr>
       <w:r>
+        <w:t>Salvataggio degli esami richiesti</w:t>
+      </w:r>
+    </w:p>
+    <w:p>
+      <w:pPr>
+        <w:pStyle w:val="Paragrafoelenco"/>
+      </w:pPr>
+      <w:r>
         <w:rPr>
           <w:rFonts w:ascii="Calibri" w:hAnsi="Calibri" w:cs="Calibri"/>
           <w:noProof/>
@@ -19892,13 +20743,13 @@
         </w:rPr>
         <w:lastRenderedPageBreak/>
         <w:drawing>
-          <wp:anchor distT="0" distB="0" distL="114300" distR="114300" simplePos="0" relativeHeight="251686912" behindDoc="1" locked="0" layoutInCell="1" allowOverlap="1" wp14:anchorId="5F5EE57F" wp14:editId="2E83797C">
+          <wp:anchor distT="0" distB="0" distL="114300" distR="114300" simplePos="0" relativeHeight="251704320" behindDoc="1" locked="0" layoutInCell="1" allowOverlap="1" wp14:anchorId="183F2004" wp14:editId="5D15C6AE">
             <wp:simplePos x="0" y="0"/>
             <wp:positionH relativeFrom="margin">
-              <wp:align>right</wp:align>
+              <wp:posOffset>-1134</wp:posOffset>
             </wp:positionH>
-            <wp:positionV relativeFrom="paragraph">
-              <wp:posOffset>203825</wp:posOffset>
+            <wp:positionV relativeFrom="page">
+              <wp:posOffset>1081924</wp:posOffset>
             </wp:positionV>
             <wp:extent cx="6120130" cy="2720975"/>
             <wp:effectExtent l="0" t="0" r="0" b="3175"/>
@@ -19949,9 +20800,6 @@
           </wp:anchor>
         </w:drawing>
       </w:r>
-      <w:r>
-        <w:t>Salvataggio degli esami richiesti</w:t>
-      </w:r>
     </w:p>
     <w:p>
       <w:pPr>
@@ -19966,13 +20814,13 @@
           <w:noProof/>
         </w:rPr>
         <w:drawing>
-          <wp:anchor distT="0" distB="0" distL="114300" distR="114300" simplePos="0" relativeHeight="251687936" behindDoc="1" locked="0" layoutInCell="1" allowOverlap="1" wp14:anchorId="0C6789E4" wp14:editId="00BBFAA3">
+          <wp:anchor distT="0" distB="0" distL="114300" distR="114300" simplePos="0" relativeHeight="251687936" behindDoc="1" locked="0" layoutInCell="1" allowOverlap="1" wp14:anchorId="0C6789E4" wp14:editId="5068CE0C">
             <wp:simplePos x="0" y="0"/>
             <wp:positionH relativeFrom="margin">
-              <wp:align>right</wp:align>
+              <wp:posOffset>-1134</wp:posOffset>
             </wp:positionH>
-            <wp:positionV relativeFrom="paragraph">
-              <wp:posOffset>2983604</wp:posOffset>
+            <wp:positionV relativeFrom="page">
+              <wp:posOffset>4069429</wp:posOffset>
             </wp:positionV>
             <wp:extent cx="6120130" cy="3173095"/>
             <wp:effectExtent l="0" t="0" r="0" b="8255"/>
@@ -20272,14 +21120,6 @@
     </w:p>
     <w:p>
       <w:pPr>
-        <w:rPr>
-          <w:rFonts w:ascii="Calibri" w:hAnsi="Calibri" w:cs="Calibri"/>
-          <w:color w:val="000000" w:themeColor="text1"/>
-        </w:rPr>
-      </w:pPr>
-    </w:p>
-    <w:p>
-      <w:pPr>
         <w:tabs>
           <w:tab w:val="left" w:pos="4259"/>
         </w:tabs>
@@ -20291,38 +21131,50 @@
     </w:p>
     <w:p>
       <w:pPr>
-        <w:tabs>
-          <w:tab w:val="left" w:pos="4259"/>
-        </w:tabs>
-        <w:rPr>
-          <w:rFonts w:ascii="Calibri" w:hAnsi="Calibri" w:cs="Calibri"/>
-          <w:color w:val="000000" w:themeColor="text1"/>
-        </w:rPr>
-      </w:pPr>
-    </w:p>
-    <w:p>
-      <w:pPr>
-        <w:tabs>
-          <w:tab w:val="left" w:pos="4259"/>
-        </w:tabs>
-        <w:rPr>
-          <w:rFonts w:ascii="Calibri" w:hAnsi="Calibri" w:cs="Calibri"/>
-          <w:color w:val="000000" w:themeColor="text1"/>
-        </w:rPr>
-      </w:pPr>
-    </w:p>
-    <w:p>
-      <w:pPr>
         <w:pStyle w:val="Title1"/>
+        <w:numPr>
+          <w:ilvl w:val="0"/>
+          <w:numId w:val="0"/>
+        </w:numPr>
+        <w:ind w:left="720"/>
+        <w:jc w:val="left"/>
+        <w:rPr>
+          <w:b w:val="0"/>
+          <w:bCs w:val="0"/>
+          <w:sz w:val="22"/>
+        </w:rPr>
       </w:pPr>
       <w:bookmarkStart w:id="41" w:name="_Toc221933048"/>
-      <w:r>
+    </w:p>
+    <w:p>
+      <w:pPr>
+        <w:pStyle w:val="Title1"/>
+        <w:numPr>
+          <w:ilvl w:val="0"/>
+          <w:numId w:val="21"/>
+        </w:numPr>
+        <w:jc w:val="left"/>
+        <w:rPr>
+          <w:b w:val="0"/>
+          <w:bCs w:val="0"/>
+          <w:sz w:val="22"/>
+        </w:rPr>
+      </w:pPr>
+      <w:r>
+        <w:rPr>
+          <w:b w:val="0"/>
+          <w:bCs w:val="0"/>
+          <w:sz w:val="22"/>
+        </w:rPr>
         <w:lastRenderedPageBreak/>
         <w:t>Aggiunta di un’operazione al calendario</w:t>
       </w:r>
       <w:r>
         <w:rPr>
+          <w:b w:val="0"/>
+          <w:bCs w:val="0"/>
           <w:noProof/>
+          <w:sz w:val="22"/>
         </w:rPr>
         <w:drawing>
           <wp:anchor distT="0" distB="0" distL="114300" distR="114300" simplePos="0" relativeHeight="251694080" behindDoc="1" locked="0" layoutInCell="1" allowOverlap="1" wp14:anchorId="36BD0AD3" wp14:editId="0C6B57B3">
@@ -20416,6 +21268,952 @@
       <w:pPr>
         <w:pStyle w:val="Title1"/>
       </w:pPr>
+      <w:r>
+        <w:t>RAFFINAMENTO DELL’ARCHITETTURA E PROSPETTIVE FUTURE</w:t>
+      </w:r>
+    </w:p>
+    <w:p>
+      <w:pPr>
+        <w:tabs>
+          <w:tab w:val="left" w:pos="4259"/>
+        </w:tabs>
+        <w:rPr>
+          <w:rFonts w:ascii="Calibri" w:hAnsi="Calibri" w:cs="Calibri"/>
+          <w:color w:val="000000" w:themeColor="text1"/>
+        </w:rPr>
+      </w:pPr>
+      <w:r>
+        <w:rPr>
+          <w:rFonts w:ascii="Calibri" w:hAnsi="Calibri" w:cs="Calibri"/>
+          <w:color w:val="000000" w:themeColor="text1"/>
+        </w:rPr>
+        <w:t xml:space="preserve">Il sistema </w:t>
+      </w:r>
+      <w:proofErr w:type="spellStart"/>
+      <w:r>
+        <w:rPr>
+          <w:rFonts w:ascii="Calibri" w:hAnsi="Calibri" w:cs="Calibri"/>
+          <w:color w:val="000000" w:themeColor="text1"/>
+        </w:rPr>
+        <w:t>VetCare</w:t>
+      </w:r>
+      <w:proofErr w:type="spellEnd"/>
+      <w:r>
+        <w:rPr>
+          <w:rFonts w:ascii="Calibri" w:hAnsi="Calibri" w:cs="Calibri"/>
+          <w:color w:val="000000" w:themeColor="text1"/>
+        </w:rPr>
+        <w:t xml:space="preserve">, nella sua architettura attuale, costituisce una solida base per la gestione integrata di una clinica veterinaria, soddisfacendo pienamente i requisiti funzionali e non funzionali emersi durante la fase di analisi. Tuttavia, in un'ottica di miglioramento continuo e di adattamento a scenari operativi più complessi, sono state identificate due direttrici di evoluzione architetturale. Questi interventi mirano a rendere il sistema ancora più </w:t>
+      </w:r>
+      <w:proofErr w:type="spellStart"/>
+      <w:r>
+        <w:rPr>
+          <w:rFonts w:ascii="Calibri" w:hAnsi="Calibri" w:cs="Calibri"/>
+          <w:color w:val="000000" w:themeColor="text1"/>
+        </w:rPr>
+        <w:t>manutenibile</w:t>
+      </w:r>
+      <w:proofErr w:type="spellEnd"/>
+      <w:r>
+        <w:rPr>
+          <w:rFonts w:ascii="Calibri" w:hAnsi="Calibri" w:cs="Calibri"/>
+          <w:color w:val="000000" w:themeColor="text1"/>
+        </w:rPr>
+        <w:t>, testabile e aderente ai principi dell'ingegneria del software, in particolare per quanto riguarda la gestione della complessità e la separazione delle responsabilità.</w:t>
+      </w:r>
+    </w:p>
+    <w:p>
+      <w:pPr>
+        <w:pStyle w:val="Subtitle1"/>
+      </w:pPr>
+      <w:r>
+        <w:t>Introduzione della classe Archivio</w:t>
+      </w:r>
+    </w:p>
+    <w:p>
+      <w:pPr>
+        <w:tabs>
+          <w:tab w:val="left" w:pos="4259"/>
+        </w:tabs>
+        <w:rPr>
+          <w:rFonts w:ascii="Calibri" w:hAnsi="Calibri" w:cs="Calibri"/>
+          <w:color w:val="000000" w:themeColor="text1"/>
+        </w:rPr>
+      </w:pPr>
+      <w:r>
+        <w:rPr>
+          <w:rFonts w:ascii="Calibri" w:hAnsi="Calibri" w:cs="Calibri"/>
+          <w:color w:val="000000" w:themeColor="text1"/>
+        </w:rPr>
+        <w:t>Analizzando le responsabilità attuali di </w:t>
+      </w:r>
+      <w:proofErr w:type="spellStart"/>
+      <w:r>
+        <w:rPr>
+          <w:rFonts w:ascii="Calibri" w:hAnsi="Calibri" w:cs="Calibri"/>
+          <w:color w:val="000000" w:themeColor="text1"/>
+        </w:rPr>
+        <w:t>VetCare</w:t>
+      </w:r>
+      <w:proofErr w:type="spellEnd"/>
+      <w:r>
+        <w:rPr>
+          <w:rFonts w:ascii="Calibri" w:hAnsi="Calibri" w:cs="Calibri"/>
+          <w:color w:val="000000" w:themeColor="text1"/>
+        </w:rPr>
+        <w:t>, si osserva che essa si occupa non solo del coordinamento delle operazioni, ma anche della gestione diretta della persistenza e della ricerca di entità come Proprietario, Animale e </w:t>
+      </w:r>
+      <w:proofErr w:type="spellStart"/>
+      <w:r>
+        <w:rPr>
+          <w:rFonts w:ascii="Calibri" w:hAnsi="Calibri" w:cs="Calibri"/>
+          <w:color w:val="000000" w:themeColor="text1"/>
+        </w:rPr>
+        <w:t>MembroPersonale</w:t>
+      </w:r>
+      <w:proofErr w:type="spellEnd"/>
+      <w:r>
+        <w:rPr>
+          <w:rFonts w:ascii="Calibri" w:hAnsi="Calibri" w:cs="Calibri"/>
+          <w:color w:val="000000" w:themeColor="text1"/>
+        </w:rPr>
+        <w:t xml:space="preserve"> (Veterinario, Segretario, </w:t>
+      </w:r>
+      <w:proofErr w:type="spellStart"/>
+      <w:r>
+        <w:rPr>
+          <w:rFonts w:ascii="Calibri" w:hAnsi="Calibri" w:cs="Calibri"/>
+          <w:color w:val="000000" w:themeColor="text1"/>
+        </w:rPr>
+        <w:t>MembroEquipe</w:t>
+      </w:r>
+      <w:proofErr w:type="spellEnd"/>
+      <w:r>
+        <w:rPr>
+          <w:rFonts w:ascii="Calibri" w:hAnsi="Calibri" w:cs="Calibri"/>
+          <w:color w:val="000000" w:themeColor="text1"/>
+        </w:rPr>
+        <w:t>). Questa gestione non appartiene naturalmente al controller, che dovrebbe coordinare i flussi, né alle singole entità di dominio, il cui compito è rappresentare concetti del mondo reale.</w:t>
+      </w:r>
+    </w:p>
+    <w:p>
+      <w:pPr>
+        <w:tabs>
+          <w:tab w:val="left" w:pos="4259"/>
+        </w:tabs>
+        <w:rPr>
+          <w:rFonts w:ascii="Calibri" w:hAnsi="Calibri" w:cs="Calibri"/>
+          <w:color w:val="000000" w:themeColor="text1"/>
+        </w:rPr>
+      </w:pPr>
+      <w:r>
+        <w:rPr>
+          <w:rFonts w:ascii="Calibri" w:hAnsi="Calibri" w:cs="Calibri"/>
+          <w:color w:val="000000" w:themeColor="text1"/>
+        </w:rPr>
+        <w:t xml:space="preserve">Applicando il principio del Pure </w:t>
+      </w:r>
+      <w:proofErr w:type="spellStart"/>
+      <w:r>
+        <w:rPr>
+          <w:rFonts w:ascii="Calibri" w:hAnsi="Calibri" w:cs="Calibri"/>
+          <w:color w:val="000000" w:themeColor="text1"/>
+        </w:rPr>
+        <w:t>Fabrication</w:t>
+      </w:r>
+      <w:proofErr w:type="spellEnd"/>
+      <w:r>
+        <w:rPr>
+          <w:rFonts w:ascii="Calibri" w:hAnsi="Calibri" w:cs="Calibri"/>
+          <w:color w:val="000000" w:themeColor="text1"/>
+        </w:rPr>
+        <w:t>, si introduce una nuova classe, denominata Archivio, la cui unica responsabilità è la memorizzazione, il recupero e la ricerca delle entità anagrafiche. Questa classe viene "fabbricata" puramente per esigenze di progettazione, non esiste nel dominio reale della clinica, ma serve a migliorare la struttura del software.</w:t>
+      </w:r>
+    </w:p>
+    <w:p>
+      <w:pPr>
+        <w:tabs>
+          <w:tab w:val="left" w:pos="4259"/>
+        </w:tabs>
+        <w:rPr>
+          <w:rFonts w:ascii="Calibri" w:hAnsi="Calibri" w:cs="Calibri"/>
+          <w:b/>
+          <w:bCs/>
+          <w:color w:val="000000" w:themeColor="text1"/>
+        </w:rPr>
+      </w:pPr>
+      <w:r>
+        <w:rPr>
+          <w:rFonts w:ascii="Calibri" w:hAnsi="Calibri" w:cs="Calibri"/>
+          <w:b/>
+          <w:bCs/>
+          <w:color w:val="000000" w:themeColor="text1"/>
+        </w:rPr>
+        <w:lastRenderedPageBreak/>
+        <w:t>Vantaggi dell'introduzione di Archivio</w:t>
+      </w:r>
+    </w:p>
+    <w:p>
+      <w:pPr>
+        <w:pStyle w:val="Paragrafoelenco"/>
+        <w:numPr>
+          <w:ilvl w:val="0"/>
+          <w:numId w:val="18"/>
+        </w:numPr>
+        <w:tabs>
+          <w:tab w:val="left" w:pos="4259"/>
+        </w:tabs>
+        <w:rPr>
+          <w:rFonts w:ascii="Calibri" w:hAnsi="Calibri" w:cs="Calibri"/>
+          <w:color w:val="000000" w:themeColor="text1"/>
+        </w:rPr>
+      </w:pPr>
+      <w:r>
+        <w:rPr>
+          <w:rFonts w:ascii="Calibri" w:hAnsi="Calibri" w:cs="Calibri"/>
+          <w:b/>
+          <w:bCs/>
+          <w:color w:val="000000" w:themeColor="text1"/>
+        </w:rPr>
+        <w:t>Separazione delle Responsabilità (SoC):</w:t>
+      </w:r>
+      <w:r>
+        <w:rPr>
+          <w:rFonts w:ascii="Calibri" w:hAnsi="Calibri" w:cs="Calibri"/>
+          <w:color w:val="000000" w:themeColor="text1"/>
+        </w:rPr>
+        <w:t> </w:t>
+      </w:r>
+      <w:proofErr w:type="spellStart"/>
+      <w:r>
+        <w:rPr>
+          <w:rFonts w:ascii="Calibri" w:hAnsi="Calibri" w:cs="Calibri"/>
+          <w:color w:val="000000" w:themeColor="text1"/>
+        </w:rPr>
+        <w:t>VetCare</w:t>
+      </w:r>
+      <w:proofErr w:type="spellEnd"/>
+      <w:r>
+        <w:rPr>
+          <w:rFonts w:ascii="Calibri" w:hAnsi="Calibri" w:cs="Calibri"/>
+          <w:color w:val="000000" w:themeColor="text1"/>
+        </w:rPr>
+        <w:t> viene sollevata dalla gestione diretta dei dati anagrafici e può concentrarsi esclusivamente sul coordinamento dei flussi logici.</w:t>
+      </w:r>
+    </w:p>
+    <w:p>
+      <w:pPr>
+        <w:numPr>
+          <w:ilvl w:val="0"/>
+          <w:numId w:val="15"/>
+        </w:numPr>
+        <w:tabs>
+          <w:tab w:val="left" w:pos="4259"/>
+        </w:tabs>
+        <w:rPr>
+          <w:rFonts w:ascii="Calibri" w:hAnsi="Calibri" w:cs="Calibri"/>
+          <w:color w:val="000000" w:themeColor="text1"/>
+        </w:rPr>
+      </w:pPr>
+      <w:r>
+        <w:rPr>
+          <w:rFonts w:ascii="Calibri" w:hAnsi="Calibri" w:cs="Calibri"/>
+          <w:b/>
+          <w:bCs/>
+          <w:color w:val="000000" w:themeColor="text1"/>
+        </w:rPr>
+        <w:t>Maggiore Coesione:</w:t>
+      </w:r>
+      <w:r>
+        <w:rPr>
+          <w:rFonts w:ascii="Calibri" w:hAnsi="Calibri" w:cs="Calibri"/>
+          <w:color w:val="000000" w:themeColor="text1"/>
+        </w:rPr>
+        <w:t> Sia </w:t>
+      </w:r>
+      <w:proofErr w:type="spellStart"/>
+      <w:r>
+        <w:rPr>
+          <w:rFonts w:ascii="Calibri" w:hAnsi="Calibri" w:cs="Calibri"/>
+          <w:color w:val="000000" w:themeColor="text1"/>
+        </w:rPr>
+        <w:t>VetCare</w:t>
+      </w:r>
+      <w:proofErr w:type="spellEnd"/>
+      <w:r>
+        <w:rPr>
+          <w:rFonts w:ascii="Calibri" w:hAnsi="Calibri" w:cs="Calibri"/>
+          <w:color w:val="000000" w:themeColor="text1"/>
+        </w:rPr>
+        <w:t> (coordinamento) che Archivio (gestione dati) diventano classi con una responsabilità unica e ben definita.</w:t>
+      </w:r>
+    </w:p>
+    <w:p>
+      <w:pPr>
+        <w:numPr>
+          <w:ilvl w:val="0"/>
+          <w:numId w:val="15"/>
+        </w:numPr>
+        <w:tabs>
+          <w:tab w:val="left" w:pos="4259"/>
+        </w:tabs>
+        <w:rPr>
+          <w:rFonts w:ascii="Calibri" w:hAnsi="Calibri" w:cs="Calibri"/>
+          <w:color w:val="000000" w:themeColor="text1"/>
+        </w:rPr>
+      </w:pPr>
+      <w:r>
+        <w:rPr>
+          <w:rFonts w:ascii="Calibri" w:hAnsi="Calibri" w:cs="Calibri"/>
+          <w:b/>
+          <w:bCs/>
+          <w:color w:val="000000" w:themeColor="text1"/>
+        </w:rPr>
+        <w:t>Riusabilità:</w:t>
+      </w:r>
+      <w:r>
+        <w:rPr>
+          <w:rFonts w:ascii="Calibri" w:hAnsi="Calibri" w:cs="Calibri"/>
+          <w:color w:val="000000" w:themeColor="text1"/>
+        </w:rPr>
+        <w:t> La logica di ricerca e archiviazione è centralizzata e può essere facilmente riutilizzata da diverse parti del sistema senza duplicazione di codice.</w:t>
+      </w:r>
+    </w:p>
+    <w:p>
+      <w:pPr>
+        <w:numPr>
+          <w:ilvl w:val="0"/>
+          <w:numId w:val="15"/>
+        </w:numPr>
+        <w:tabs>
+          <w:tab w:val="left" w:pos="4259"/>
+        </w:tabs>
+        <w:rPr>
+          <w:rFonts w:ascii="Calibri" w:hAnsi="Calibri" w:cs="Calibri"/>
+          <w:color w:val="000000" w:themeColor="text1"/>
+        </w:rPr>
+      </w:pPr>
+      <w:r>
+        <w:rPr>
+          <w:rFonts w:ascii="Calibri" w:hAnsi="Calibri" w:cs="Calibri"/>
+          <w:b/>
+          <w:bCs/>
+          <w:color w:val="000000" w:themeColor="text1"/>
+        </w:rPr>
+        <w:t>Manutenibilità:</w:t>
+      </w:r>
+      <w:r>
+        <w:rPr>
+          <w:rFonts w:ascii="Calibri" w:hAnsi="Calibri" w:cs="Calibri"/>
+          <w:color w:val="000000" w:themeColor="text1"/>
+        </w:rPr>
+        <w:t> Eventuali modifiche alle strutture dati o alle logiche di ricerca sono confinate alla sola classe Archivio, senza impattare il controller o le entità di dominio.</w:t>
+      </w:r>
+    </w:p>
+    <w:p>
+      <w:pPr>
+        <w:keepNext/>
+        <w:tabs>
+          <w:tab w:val="left" w:pos="4259"/>
+        </w:tabs>
+        <w:ind w:left="360"/>
+      </w:pPr>
+      <w:r>
+        <w:rPr>
+          <w:rFonts w:ascii="Calibri" w:hAnsi="Calibri" w:cs="Calibri"/>
+          <w:noProof/>
+          <w:color w:val="000000" w:themeColor="text1"/>
+        </w:rPr>
+        <w:drawing>
+          <wp:inline distT="0" distB="0" distL="0" distR="0" wp14:anchorId="46991971" wp14:editId="74F16A13">
+            <wp:extent cx="4932681" cy="3259094"/>
+            <wp:effectExtent l="0" t="0" r="1270" b="0"/>
+            <wp:docPr id="694172031" name="Immagine 2"/>
+            <wp:cNvGraphicFramePr>
+              <a:graphicFrameLocks xmlns:a="http://schemas.openxmlformats.org/drawingml/2006/main" noChangeAspect="1"/>
+            </wp:cNvGraphicFramePr>
+            <a:graphic xmlns:a="http://schemas.openxmlformats.org/drawingml/2006/main">
+              <a:graphicData uri="http://schemas.openxmlformats.org/drawingml/2006/picture">
+                <pic:pic xmlns:pic="http://schemas.openxmlformats.org/drawingml/2006/picture">
+                  <pic:nvPicPr>
+                    <pic:cNvPr id="0" name="Picture 3"/>
+                    <pic:cNvPicPr>
+                      <a:picLocks noChangeAspect="1" noChangeArrowheads="1"/>
+                    </pic:cNvPicPr>
+                  </pic:nvPicPr>
+                  <pic:blipFill>
+                    <a:blip r:embed="rId31">
+                      <a:extLst>
+                        <a:ext uri="{28A0092B-C50C-407E-A947-70E740481C1C}">
+                          <a14:useLocalDpi xmlns:a14="http://schemas.microsoft.com/office/drawing/2010/main" val="0"/>
+                        </a:ext>
+                      </a:extLst>
+                    </a:blip>
+                    <a:srcRect/>
+                    <a:stretch>
+                      <a:fillRect/>
+                    </a:stretch>
+                  </pic:blipFill>
+                  <pic:spPr bwMode="auto">
+                    <a:xfrm>
+                      <a:off x="0" y="0"/>
+                      <a:ext cx="4953572" cy="3272897"/>
+                    </a:xfrm>
+                    <a:prstGeom prst="rect">
+                      <a:avLst/>
+                    </a:prstGeom>
+                    <a:noFill/>
+                  </pic:spPr>
+                </pic:pic>
+              </a:graphicData>
+            </a:graphic>
+          </wp:inline>
+        </w:drawing>
+      </w:r>
+    </w:p>
+    <w:p>
+      <w:pPr>
+        <w:pStyle w:val="Didascalia"/>
+        <w:rPr>
+          <w:rFonts w:ascii="Calibri" w:hAnsi="Calibri" w:cs="Calibri"/>
+          <w:color w:val="000000" w:themeColor="text1"/>
+        </w:rPr>
+      </w:pPr>
+      <w:r>
+        <w:t xml:space="preserve">Figura </w:t>
+      </w:r>
+      <w:r>
+        <w:fldChar w:fldCharType="begin"/>
+      </w:r>
+      <w:r>
+        <w:instrText xml:space="preserve"> SEQ Figura \* ARABIC </w:instrText>
+      </w:r>
+      <w:r>
+        <w:fldChar w:fldCharType="separate"/>
+      </w:r>
+      <w:r>
+        <w:rPr>
+          <w:noProof/>
+        </w:rPr>
+        <w:t>16</w:t>
+      </w:r>
+      <w:r>
+        <w:fldChar w:fldCharType="end"/>
+      </w:r>
+      <w:r>
+        <w:t xml:space="preserve"> Modello di dominio con classe Archivio</w:t>
+      </w:r>
+    </w:p>
+    <w:p>
+      <w:pPr>
+        <w:tabs>
+          <w:tab w:val="left" w:pos="4259"/>
+        </w:tabs>
+        <w:rPr>
+          <w:rFonts w:ascii="Calibri" w:hAnsi="Calibri" w:cs="Calibri"/>
+          <w:color w:val="000000" w:themeColor="text1"/>
+          <w:sz w:val="20"/>
+          <w:szCs w:val="20"/>
+        </w:rPr>
+      </w:pPr>
+    </w:p>
+    <w:p>
+      <w:pPr>
+        <w:pStyle w:val="Subtitle1"/>
+      </w:pPr>
+      <w:r>
+        <w:t>Riorganizzazione della Logica di Presentazione per una Maggiore Coesione</w:t>
+      </w:r>
+    </w:p>
+    <w:p>
+      <w:pPr>
+        <w:tabs>
+          <w:tab w:val="left" w:pos="4259"/>
+        </w:tabs>
+        <w:rPr>
+          <w:rFonts w:ascii="Calibri" w:hAnsi="Calibri" w:cs="Calibri"/>
+          <w:color w:val="000000" w:themeColor="text1"/>
+        </w:rPr>
+      </w:pPr>
+      <w:r>
+        <w:rPr>
+          <w:rFonts w:ascii="Calibri" w:hAnsi="Calibri" w:cs="Calibri"/>
+          <w:color w:val="000000" w:themeColor="text1"/>
+        </w:rPr>
+        <w:t xml:space="preserve">Allo stato attuale, la classe </w:t>
+      </w:r>
+      <w:proofErr w:type="spellStart"/>
+      <w:r>
+        <w:rPr>
+          <w:rFonts w:ascii="Calibri" w:hAnsi="Calibri" w:cs="Calibri"/>
+          <w:color w:val="000000" w:themeColor="text1"/>
+        </w:rPr>
+        <w:t>VetCare</w:t>
+      </w:r>
+      <w:proofErr w:type="spellEnd"/>
+      <w:r>
+        <w:rPr>
+          <w:rFonts w:ascii="Calibri" w:hAnsi="Calibri" w:cs="Calibri"/>
+          <w:color w:val="000000" w:themeColor="text1"/>
+        </w:rPr>
+        <w:t xml:space="preserve"> (che funge da controller) gestisce anche parte della logica di interazione con l'utente, come la stampa di messaggi di conferma o la richiesta di input. Questa commistione di responsabilità viola il principio della Separazione delle Responsabilità (SoC) e riduce la coesione della classe, rendendola più complessa e difficile da manutenere o adattare a diversi tipi di interfaccia utente (es. grafica invece che a riga di comando).</w:t>
+      </w:r>
+    </w:p>
+    <w:p>
+      <w:pPr>
+        <w:tabs>
+          <w:tab w:val="left" w:pos="4259"/>
+        </w:tabs>
+        <w:rPr>
+          <w:rFonts w:ascii="Calibri" w:hAnsi="Calibri" w:cs="Calibri"/>
+          <w:color w:val="000000" w:themeColor="text1"/>
+        </w:rPr>
+      </w:pPr>
+    </w:p>
+    <w:p>
+      <w:pPr>
+        <w:tabs>
+          <w:tab w:val="left" w:pos="4259"/>
+        </w:tabs>
+        <w:rPr>
+          <w:rFonts w:ascii="Calibri" w:hAnsi="Calibri" w:cs="Calibri"/>
+          <w:b/>
+          <w:bCs/>
+          <w:color w:val="000000" w:themeColor="text1"/>
+        </w:rPr>
+      </w:pPr>
+      <w:r>
+        <w:rPr>
+          <w:rFonts w:ascii="Calibri" w:hAnsi="Calibri" w:cs="Calibri"/>
+          <w:b/>
+          <w:bCs/>
+          <w:color w:val="000000" w:themeColor="text1"/>
+        </w:rPr>
+        <w:t>Soluzione Proposta:</w:t>
+      </w:r>
+    </w:p>
+    <w:p>
+      <w:pPr>
+        <w:tabs>
+          <w:tab w:val="left" w:pos="4259"/>
+        </w:tabs>
+        <w:rPr>
+          <w:rFonts w:ascii="Calibri" w:hAnsi="Calibri" w:cs="Calibri"/>
+          <w:color w:val="000000" w:themeColor="text1"/>
+        </w:rPr>
+      </w:pPr>
+      <w:r>
+        <w:rPr>
+          <w:rFonts w:ascii="Calibri" w:hAnsi="Calibri" w:cs="Calibri"/>
+          <w:color w:val="000000" w:themeColor="text1"/>
+        </w:rPr>
+        <w:t xml:space="preserve">Si intende operare un </w:t>
+      </w:r>
+      <w:proofErr w:type="spellStart"/>
+      <w:r>
+        <w:rPr>
+          <w:rFonts w:ascii="Calibri" w:hAnsi="Calibri" w:cs="Calibri"/>
+          <w:color w:val="000000" w:themeColor="text1"/>
+        </w:rPr>
+        <w:t>refactoring</w:t>
+      </w:r>
+      <w:proofErr w:type="spellEnd"/>
+      <w:r>
+        <w:rPr>
+          <w:rFonts w:ascii="Calibri" w:hAnsi="Calibri" w:cs="Calibri"/>
+          <w:color w:val="000000" w:themeColor="text1"/>
+        </w:rPr>
+        <w:t xml:space="preserve"> che trasferisca completamente la responsabilità dell'interazione con l'utente dalla classe </w:t>
+      </w:r>
+      <w:proofErr w:type="spellStart"/>
+      <w:r>
+        <w:rPr>
+          <w:rFonts w:ascii="Calibri" w:hAnsi="Calibri" w:cs="Calibri"/>
+          <w:color w:val="000000" w:themeColor="text1"/>
+        </w:rPr>
+        <w:t>VetCare</w:t>
+      </w:r>
+      <w:proofErr w:type="spellEnd"/>
+      <w:r>
+        <w:rPr>
+          <w:rFonts w:ascii="Calibri" w:hAnsi="Calibri" w:cs="Calibri"/>
+          <w:color w:val="000000" w:themeColor="text1"/>
+        </w:rPr>
+        <w:t xml:space="preserve"> a un livello dedicato, ovvero la UI. L'obiettivo è fare in modo che </w:t>
+      </w:r>
+      <w:proofErr w:type="spellStart"/>
+      <w:r>
+        <w:rPr>
+          <w:rFonts w:ascii="Calibri" w:hAnsi="Calibri" w:cs="Calibri"/>
+          <w:color w:val="000000" w:themeColor="text1"/>
+        </w:rPr>
+        <w:t>VetCare</w:t>
+      </w:r>
+      <w:proofErr w:type="spellEnd"/>
+      <w:r>
+        <w:rPr>
+          <w:rFonts w:ascii="Calibri" w:hAnsi="Calibri" w:cs="Calibri"/>
+          <w:color w:val="000000" w:themeColor="text1"/>
+        </w:rPr>
+        <w:t xml:space="preserve"> si occupi esclusivamente della logica di dominio e del coordinamento dei servizi, diventando un vero e proprio Application Service o </w:t>
+      </w:r>
+      <w:proofErr w:type="spellStart"/>
+      <w:r>
+        <w:rPr>
+          <w:rFonts w:ascii="Calibri" w:hAnsi="Calibri" w:cs="Calibri"/>
+          <w:color w:val="000000" w:themeColor="text1"/>
+        </w:rPr>
+        <w:t>Facade</w:t>
+      </w:r>
+      <w:proofErr w:type="spellEnd"/>
+      <w:r>
+        <w:rPr>
+          <w:rFonts w:ascii="Calibri" w:hAnsi="Calibri" w:cs="Calibri"/>
+          <w:color w:val="000000" w:themeColor="text1"/>
+        </w:rPr>
+        <w:t xml:space="preserve"> per il sistema.</w:t>
+      </w:r>
+    </w:p>
+    <w:p>
+      <w:pPr>
+        <w:tabs>
+          <w:tab w:val="left" w:pos="4259"/>
+        </w:tabs>
+        <w:rPr>
+          <w:rFonts w:ascii="Calibri" w:hAnsi="Calibri" w:cs="Calibri"/>
+          <w:color w:val="000000" w:themeColor="text1"/>
+        </w:rPr>
+      </w:pPr>
+      <w:r>
+        <w:rPr>
+          <w:rFonts w:ascii="Calibri" w:hAnsi="Calibri" w:cs="Calibri"/>
+          <w:color w:val="000000" w:themeColor="text1"/>
+        </w:rPr>
+        <w:t>In questo nuovo assetto:</w:t>
+      </w:r>
+    </w:p>
+    <w:p>
+      <w:pPr>
+        <w:pStyle w:val="Paragrafoelenco"/>
+        <w:numPr>
+          <w:ilvl w:val="0"/>
+          <w:numId w:val="19"/>
+        </w:numPr>
+        <w:tabs>
+          <w:tab w:val="left" w:pos="4259"/>
+        </w:tabs>
+        <w:rPr>
+          <w:rFonts w:ascii="Calibri" w:hAnsi="Calibri" w:cs="Calibri"/>
+          <w:color w:val="000000" w:themeColor="text1"/>
+        </w:rPr>
+      </w:pPr>
+      <w:r>
+        <w:rPr>
+          <w:rFonts w:ascii="Calibri" w:hAnsi="Calibri" w:cs="Calibri"/>
+          <w:color w:val="000000" w:themeColor="text1"/>
+        </w:rPr>
+        <w:lastRenderedPageBreak/>
+        <w:t>La UI (</w:t>
+      </w:r>
+      <w:proofErr w:type="spellStart"/>
+      <w:r>
+        <w:rPr>
+          <w:rFonts w:ascii="Calibri" w:hAnsi="Calibri" w:cs="Calibri"/>
+          <w:color w:val="000000" w:themeColor="text1"/>
+        </w:rPr>
+        <w:t>ConsoleUI</w:t>
+      </w:r>
+      <w:proofErr w:type="spellEnd"/>
+      <w:r>
+        <w:rPr>
+          <w:rFonts w:ascii="Calibri" w:hAnsi="Calibri" w:cs="Calibri"/>
+          <w:color w:val="000000" w:themeColor="text1"/>
+        </w:rPr>
+        <w:t xml:space="preserve">) gestisce tutto il flusso di presentazione: raccoglie i dati in input, li validano sintatticamente (es. formato della data) e li passa a </w:t>
+      </w:r>
+      <w:proofErr w:type="spellStart"/>
+      <w:r>
+        <w:rPr>
+          <w:rFonts w:ascii="Calibri" w:hAnsi="Calibri" w:cs="Calibri"/>
+          <w:color w:val="000000" w:themeColor="text1"/>
+        </w:rPr>
+        <w:t>VetCare</w:t>
+      </w:r>
+      <w:proofErr w:type="spellEnd"/>
+      <w:r>
+        <w:rPr>
+          <w:rFonts w:ascii="Calibri" w:hAnsi="Calibri" w:cs="Calibri"/>
+          <w:color w:val="000000" w:themeColor="text1"/>
+        </w:rPr>
+        <w:t xml:space="preserve"> sotto forma di oggetti dati semplici (DTO o parametri già tipizzati).</w:t>
+      </w:r>
+    </w:p>
+    <w:p>
+      <w:pPr>
+        <w:pStyle w:val="Paragrafoelenco"/>
+        <w:numPr>
+          <w:ilvl w:val="0"/>
+          <w:numId w:val="19"/>
+        </w:numPr>
+        <w:tabs>
+          <w:tab w:val="left" w:pos="4259"/>
+        </w:tabs>
+        <w:rPr>
+          <w:rFonts w:ascii="Calibri" w:hAnsi="Calibri" w:cs="Calibri"/>
+          <w:color w:val="000000" w:themeColor="text1"/>
+        </w:rPr>
+      </w:pPr>
+      <w:r>
+        <w:rPr>
+          <w:rFonts w:ascii="Calibri" w:hAnsi="Calibri" w:cs="Calibri"/>
+          <w:color w:val="000000" w:themeColor="text1"/>
+        </w:rPr>
+        <w:t>Il controller (</w:t>
+      </w:r>
+      <w:proofErr w:type="spellStart"/>
+      <w:r>
+        <w:rPr>
+          <w:rFonts w:ascii="Calibri" w:hAnsi="Calibri" w:cs="Calibri"/>
+          <w:color w:val="000000" w:themeColor="text1"/>
+        </w:rPr>
+        <w:t>VetCare</w:t>
+      </w:r>
+      <w:proofErr w:type="spellEnd"/>
+      <w:r>
+        <w:rPr>
+          <w:rFonts w:ascii="Calibri" w:hAnsi="Calibri" w:cs="Calibri"/>
+          <w:color w:val="000000" w:themeColor="text1"/>
+        </w:rPr>
+        <w:t>) esegue le operazioni richieste: interagisce con il modello di dominio (attraverso le nuove interfacce di servizio) e restituisce alla UI un oggetto risultato (es. l'animale appena creato, un messaggio di stato, un'eccezione trasformata).</w:t>
+      </w:r>
+    </w:p>
+    <w:p>
+      <w:pPr>
+        <w:pStyle w:val="Paragrafoelenco"/>
+        <w:numPr>
+          <w:ilvl w:val="0"/>
+          <w:numId w:val="19"/>
+        </w:numPr>
+        <w:tabs>
+          <w:tab w:val="left" w:pos="4259"/>
+        </w:tabs>
+        <w:rPr>
+          <w:rFonts w:ascii="Calibri" w:hAnsi="Calibri" w:cs="Calibri"/>
+          <w:color w:val="000000" w:themeColor="text1"/>
+        </w:rPr>
+      </w:pPr>
+      <w:r>
+        <w:rPr>
+          <w:rFonts w:ascii="Calibri" w:hAnsi="Calibri" w:cs="Calibri"/>
+          <w:color w:val="000000" w:themeColor="text1"/>
+        </w:rPr>
+        <w:t xml:space="preserve">La UI gestisce l'output: riceve il risultato da </w:t>
+      </w:r>
+      <w:proofErr w:type="spellStart"/>
+      <w:r>
+        <w:rPr>
+          <w:rFonts w:ascii="Calibri" w:hAnsi="Calibri" w:cs="Calibri"/>
+          <w:color w:val="000000" w:themeColor="text1"/>
+        </w:rPr>
+        <w:t>VetCare</w:t>
+      </w:r>
+      <w:proofErr w:type="spellEnd"/>
+      <w:r>
+        <w:rPr>
+          <w:rFonts w:ascii="Calibri" w:hAnsi="Calibri" w:cs="Calibri"/>
+          <w:color w:val="000000" w:themeColor="text1"/>
+        </w:rPr>
+        <w:t xml:space="preserve"> e decide come presentarlo all'utente, che si tratti di un messaggio di successo, di un errore, o della formattazione di dati da visualizzare.</w:t>
+      </w:r>
+    </w:p>
+    <w:p>
+      <w:pPr>
+        <w:tabs>
+          <w:tab w:val="left" w:pos="4259"/>
+        </w:tabs>
+        <w:rPr>
+          <w:rFonts w:ascii="Calibri" w:hAnsi="Calibri" w:cs="Calibri"/>
+          <w:color w:val="000000" w:themeColor="text1"/>
+        </w:rPr>
+      </w:pPr>
+    </w:p>
+    <w:p>
+      <w:pPr>
+        <w:tabs>
+          <w:tab w:val="left" w:pos="4259"/>
+        </w:tabs>
+        <w:rPr>
+          <w:rFonts w:ascii="Calibri" w:hAnsi="Calibri" w:cs="Calibri"/>
+          <w:b/>
+          <w:bCs/>
+          <w:color w:val="000000" w:themeColor="text1"/>
+        </w:rPr>
+      </w:pPr>
+      <w:r>
+        <w:rPr>
+          <w:rFonts w:ascii="Calibri" w:hAnsi="Calibri" w:cs="Calibri"/>
+          <w:b/>
+          <w:bCs/>
+          <w:color w:val="000000" w:themeColor="text1"/>
+        </w:rPr>
+        <w:t>Vantaggi della Riorganizzazione:</w:t>
+      </w:r>
+    </w:p>
+    <w:p>
+      <w:pPr>
+        <w:pStyle w:val="Paragrafoelenco"/>
+        <w:numPr>
+          <w:ilvl w:val="0"/>
+          <w:numId w:val="20"/>
+        </w:numPr>
+        <w:tabs>
+          <w:tab w:val="left" w:pos="4259"/>
+        </w:tabs>
+        <w:rPr>
+          <w:rFonts w:ascii="Calibri" w:hAnsi="Calibri" w:cs="Calibri"/>
+          <w:color w:val="000000" w:themeColor="text1"/>
+        </w:rPr>
+      </w:pPr>
+      <w:r>
+        <w:rPr>
+          <w:rFonts w:ascii="Calibri" w:hAnsi="Calibri" w:cs="Calibri"/>
+          <w:color w:val="000000" w:themeColor="text1"/>
+        </w:rPr>
+        <w:t xml:space="preserve">Massima Coesione: </w:t>
+      </w:r>
+      <w:proofErr w:type="spellStart"/>
+      <w:r>
+        <w:rPr>
+          <w:rFonts w:ascii="Calibri" w:hAnsi="Calibri" w:cs="Calibri"/>
+          <w:color w:val="000000" w:themeColor="text1"/>
+        </w:rPr>
+        <w:t>VetCare</w:t>
+      </w:r>
+      <w:proofErr w:type="spellEnd"/>
+      <w:r>
+        <w:rPr>
+          <w:rFonts w:ascii="Calibri" w:hAnsi="Calibri" w:cs="Calibri"/>
+          <w:color w:val="000000" w:themeColor="text1"/>
+        </w:rPr>
+        <w:t xml:space="preserve"> diventa un componente altamente coeso, focalizzato solo sulla logica applicativa. La UI si occupa solo di presentazione.</w:t>
+      </w:r>
+    </w:p>
+    <w:p>
+      <w:pPr>
+        <w:pStyle w:val="Paragrafoelenco"/>
+        <w:numPr>
+          <w:ilvl w:val="0"/>
+          <w:numId w:val="20"/>
+        </w:numPr>
+        <w:tabs>
+          <w:tab w:val="left" w:pos="4259"/>
+        </w:tabs>
+        <w:rPr>
+          <w:rFonts w:ascii="Calibri" w:hAnsi="Calibri" w:cs="Calibri"/>
+          <w:color w:val="000000" w:themeColor="text1"/>
+        </w:rPr>
+      </w:pPr>
+      <w:r>
+        <w:rPr>
+          <w:rFonts w:ascii="Calibri" w:hAnsi="Calibri" w:cs="Calibri"/>
+          <w:color w:val="000000" w:themeColor="text1"/>
+        </w:rPr>
+        <w:t>Manutenibilità e Chiarezza: Il codice di entrambi i livelli diventa più semplice da leggere e modificare, poiché ogni classe ha uno scopo ben definito.</w:t>
+      </w:r>
+    </w:p>
+    <w:p>
+      <w:pPr>
+        <w:pStyle w:val="Paragrafoelenco"/>
+        <w:numPr>
+          <w:ilvl w:val="0"/>
+          <w:numId w:val="20"/>
+        </w:numPr>
+        <w:tabs>
+          <w:tab w:val="left" w:pos="4259"/>
+        </w:tabs>
+        <w:rPr>
+          <w:rFonts w:ascii="Calibri" w:hAnsi="Calibri" w:cs="Calibri"/>
+          <w:color w:val="000000" w:themeColor="text1"/>
+        </w:rPr>
+      </w:pPr>
+      <w:r>
+        <w:rPr>
+          <w:rFonts w:ascii="Calibri" w:hAnsi="Calibri" w:cs="Calibri"/>
+          <w:color w:val="000000" w:themeColor="text1"/>
+        </w:rPr>
+        <w:t xml:space="preserve">Adattabilità: Questa separazione apre la strada allo sviluppo di diverse interfacce utente (Web, REST API, applicazione mobile) senza dover modificare il nucleo dell'applicazione. Basterà creare una nuova UI che interagisca con la medesima interfaccia pubblica di </w:t>
+      </w:r>
+      <w:proofErr w:type="spellStart"/>
+      <w:r>
+        <w:rPr>
+          <w:rFonts w:ascii="Calibri" w:hAnsi="Calibri" w:cs="Calibri"/>
+          <w:color w:val="000000" w:themeColor="text1"/>
+        </w:rPr>
+        <w:t>VetCare</w:t>
+      </w:r>
+      <w:proofErr w:type="spellEnd"/>
+      <w:r>
+        <w:rPr>
+          <w:rFonts w:ascii="Calibri" w:hAnsi="Calibri" w:cs="Calibri"/>
+          <w:color w:val="000000" w:themeColor="text1"/>
+        </w:rPr>
+        <w:t>.</w:t>
+      </w:r>
+    </w:p>
+    <w:p>
+      <w:pPr>
+        <w:pStyle w:val="Paragrafoelenco"/>
+        <w:numPr>
+          <w:ilvl w:val="0"/>
+          <w:numId w:val="20"/>
+        </w:numPr>
+        <w:tabs>
+          <w:tab w:val="left" w:pos="4259"/>
+        </w:tabs>
+        <w:rPr>
+          <w:rFonts w:ascii="Calibri" w:hAnsi="Calibri" w:cs="Calibri"/>
+          <w:color w:val="000000" w:themeColor="text1"/>
+        </w:rPr>
+      </w:pPr>
+      <w:r>
+        <w:rPr>
+          <w:rFonts w:ascii="Calibri" w:hAnsi="Calibri" w:cs="Calibri"/>
+          <w:color w:val="000000" w:themeColor="text1"/>
+        </w:rPr>
+        <w:t xml:space="preserve">Testabilità: La logica di dominio in </w:t>
+      </w:r>
+      <w:proofErr w:type="spellStart"/>
+      <w:r>
+        <w:rPr>
+          <w:rFonts w:ascii="Calibri" w:hAnsi="Calibri" w:cs="Calibri"/>
+          <w:color w:val="000000" w:themeColor="text1"/>
+        </w:rPr>
+        <w:t>VetCare</w:t>
+      </w:r>
+      <w:proofErr w:type="spellEnd"/>
+      <w:r>
+        <w:rPr>
+          <w:rFonts w:ascii="Calibri" w:hAnsi="Calibri" w:cs="Calibri"/>
+          <w:color w:val="000000" w:themeColor="text1"/>
+        </w:rPr>
+        <w:t xml:space="preserve"> può essere testata tramite test unitari senza la necessità di simulare l'interazione con un utente attraverso una console.</w:t>
+      </w:r>
+    </w:p>
+    <w:p>
+      <w:pPr>
+        <w:tabs>
+          <w:tab w:val="left" w:pos="4259"/>
+        </w:tabs>
+        <w:rPr>
+          <w:rFonts w:ascii="Calibri" w:hAnsi="Calibri" w:cs="Calibri"/>
+          <w:color w:val="000000" w:themeColor="text1"/>
+        </w:rPr>
+      </w:pPr>
+    </w:p>
+    <w:p>
+      <w:pPr>
+        <w:pStyle w:val="Title1"/>
+      </w:pPr>
       <w:bookmarkStart w:id="43" w:name="_Toc221933050"/>
       <w:r>
         <w:t>CONCLUSIONI</w:t>
@@ -20538,15 +22336,7 @@
           <w:rFonts w:ascii="Calibri" w:hAnsi="Calibri" w:cs="Calibri"/>
           <w:color w:val="000000" w:themeColor="text1"/>
         </w:rPr>
-        <w:t xml:space="preserve">Sostenibilità e Scalabilità: La separazione delle logiche di dominio dalla presentazione e il disaccoppiamento ottenuto tramite il polimorfismo rendono il sistema pronto per future </w:t>
-      </w:r>
-      <w:r>
-        <w:rPr>
-          <w:rFonts w:ascii="Calibri" w:hAnsi="Calibri" w:cs="Calibri"/>
-          <w:color w:val="000000" w:themeColor="text1"/>
-        </w:rPr>
-        <w:lastRenderedPageBreak/>
-        <w:t>estensioni, come l'integrazione di nuovi macchinari diagnostici o nuove tipologie di servizi chirurgici.</w:t>
+        <w:t>Sostenibilità e Scalabilità: La separazione delle logiche di dominio dalla presentazione e il disaccoppiamento ottenuto tramite il polimorfismo rendono il sistema pronto per future estensioni, come l'integrazione di nuovi macchinari diagnostici o nuove tipologie di servizi chirurgici.</w:t>
       </w:r>
     </w:p>
     <w:p>
@@ -20566,7 +22356,15 @@
           <w:rFonts w:ascii="Calibri" w:hAnsi="Calibri" w:cs="Calibri"/>
           <w:color w:val="000000" w:themeColor="text1"/>
         </w:rPr>
-        <w:t xml:space="preserve">In sintesi, ogni componente è stato attentamente valutato e testato per convergere verso un unico fine: offrire uno strumento informatico organico che supporti il personale medico e amministrativo nel fornire la migliore assistenza possibile ai pazienti, riducendo al minimo l'errore umano e l'inefficienza gestionale. Il sistema </w:t>
+        <w:t xml:space="preserve">In sintesi, ogni componente è stato attentamente valutato e testato per convergere verso un unico fine: offrire uno strumento informatico organico che supporti il personale medico e amministrativo nel fornire la migliore assistenza possibile ai pazienti, riducendo al minimo l'errore umano e l'inefficienza gestionale. Il </w:t>
+      </w:r>
+      <w:r>
+        <w:rPr>
+          <w:rFonts w:ascii="Calibri" w:hAnsi="Calibri" w:cs="Calibri"/>
+          <w:color w:val="000000" w:themeColor="text1"/>
+        </w:rPr>
+        <w:lastRenderedPageBreak/>
+        <w:t xml:space="preserve">sistema </w:t>
       </w:r>
       <w:proofErr w:type="spellStart"/>
       <w:r>
@@ -20616,7 +22414,7 @@
       </w:pPr>
     </w:p>
     <w:sectPr>
-      <w:footerReference w:type="default" r:id="rId31"/>
+      <w:footerReference w:type="default" r:id="rId32"/>
       <w:pgSz w:w="11906" w:h="16838"/>
       <w:pgMar w:top="1417" w:right="1134" w:bottom="1134" w:left="1134" w:header="708" w:footer="708" w:gutter="0"/>
       <w:cols w:space="708"/>
@@ -20722,6 +22520,119 @@
 <file path=word/numbering.xml><?xml version="1.0" encoding="utf-8"?>
 <w:numbering xmlns:wpc="http://schemas.microsoft.com/office/word/2010/wordprocessingCanvas" xmlns:cx="http://schemas.microsoft.com/office/drawing/2014/chartex" xmlns:cx1="http://schemas.microsoft.com/office/drawing/2015/9/8/chartex" xmlns:cx2="http://schemas.microsoft.com/office/drawing/2015/10/21/chartex" xmlns:cx3="http://schemas.microsoft.com/office/drawing/2016/5/9/chartex" xmlns:cx4="http://schemas.microsoft.com/office/drawing/2016/5/10/chartex" xmlns:cx5="http://schemas.microsoft.com/office/drawing/2016/5/11/chartex" xmlns:cx6="http://schemas.microsoft.com/office/drawing/2016/5/12/chartex" xmlns:cx7="http://schemas.microsoft.com/office/drawing/2016/5/13/chartex" xmlns:cx8="http://schemas.microsoft.com/office/drawing/2016/5/14/chartex" xmlns:mc="http://schemas.openxmlformats.org/markup-compatibility/2006" xmlns:aink="http://schemas.microsoft.com/office/drawing/2016/ink" xmlns:am3d="http://schemas.microsoft.com/office/drawing/2017/model3d" xmlns:o="urn:schemas-microsoft-com:office:office" xmlns:oel="http://schemas.microsoft.com/office/2019/extlst" xmlns:r="http://schemas.openxmlformats.org/officeDocument/2006/relationships" xmlns:m="http://schemas.openxmlformats.org/officeDocument/2006/math" xmlns:v="urn:schemas-microsoft-com:vml" xmlns:wp14="http://schemas.microsoft.com/office/word/2010/wordprocessingDrawing" xmlns:wp="http://schemas.openxmlformats.org/drawingml/2006/wordprocessingDrawing" xmlns:w10="urn:schemas-microsoft-com:office:word" xmlns:w="http://schemas.openxmlformats.org/wordprocessingml/2006/main" xmlns:w14="http://schemas.microsoft.com/office/word/2010/wordml" xmlns:w15="http://schemas.microsoft.com/office/word/2012/wordml" xmlns:w16cex="http://schemas.microsoft.com/office/word/2018/wordml/cex" xmlns:w16cid="http://schemas.microsoft.com/office/word/2016/wordml/cid" xmlns:w16="http://schemas.microsoft.com/office/word/2018/wordml" xmlns:w16du="http://schemas.microsoft.com/office/word/2023/wordml/word16du" xmlns:w16sdtdh="http://schemas.microsoft.com/office/word/2020/wordml/sdtdatahash" xmlns:w16sdtfl="http://schemas.microsoft.com/office/word/2024/wordml/sdtformatlock" xmlns:w16se="http://schemas.microsoft.com/office/word/2015/wordml/symex" xmlns:wpg="http://schemas.microsoft.com/office/word/2010/wordprocessingGroup" xmlns:wpi="http://schemas.microsoft.com/office/word/2010/wordprocessingInk" xmlns:wne="http://schemas.microsoft.com/office/word/2006/wordml" xmlns:wps="http://schemas.microsoft.com/office/word/2010/wordprocessingShape" mc:Ignorable="w14 w15 w16se w16cid w16 w16cex w16sdtdh w16sdtfl w16du wp14">
   <w:abstractNum w:abstractNumId="0" w15:restartNumberingAfterBreak="0">
+    <w:nsid w:val="003C2C07"/>
+    <w:multiLevelType w:val="hybridMultilevel"/>
+    <w:tmpl w:val="98EC197C"/>
+    <w:lvl w:ilvl="0" w:tplc="04100001">
+      <w:start w:val="1"/>
+      <w:numFmt w:val="bullet"/>
+      <w:lvlText w:val=""/>
+      <w:lvlJc w:val="left"/>
+      <w:pPr>
+        <w:ind w:left="720" w:hanging="360"/>
+      </w:pPr>
+      <w:rPr>
+        <w:rFonts w:ascii="Symbol" w:hAnsi="Symbol" w:hint="default"/>
+      </w:rPr>
+    </w:lvl>
+    <w:lvl w:ilvl="1" w:tplc="04100003" w:tentative="1">
+      <w:start w:val="1"/>
+      <w:numFmt w:val="bullet"/>
+      <w:lvlText w:val="o"/>
+      <w:lvlJc w:val="left"/>
+      <w:pPr>
+        <w:ind w:left="1440" w:hanging="360"/>
+      </w:pPr>
+      <w:rPr>
+        <w:rFonts w:ascii="Courier New" w:hAnsi="Courier New" w:cs="Courier New" w:hint="default"/>
+      </w:rPr>
+    </w:lvl>
+    <w:lvl w:ilvl="2" w:tplc="04100005" w:tentative="1">
+      <w:start w:val="1"/>
+      <w:numFmt w:val="bullet"/>
+      <w:lvlText w:val=""/>
+      <w:lvlJc w:val="left"/>
+      <w:pPr>
+        <w:ind w:left="2160" w:hanging="360"/>
+      </w:pPr>
+      <w:rPr>
+        <w:rFonts w:ascii="Wingdings" w:hAnsi="Wingdings" w:hint="default"/>
+      </w:rPr>
+    </w:lvl>
+    <w:lvl w:ilvl="3" w:tplc="04100001" w:tentative="1">
+      <w:start w:val="1"/>
+      <w:numFmt w:val="bullet"/>
+      <w:lvlText w:val=""/>
+      <w:lvlJc w:val="left"/>
+      <w:pPr>
+        <w:ind w:left="2880" w:hanging="360"/>
+      </w:pPr>
+      <w:rPr>
+        <w:rFonts w:ascii="Symbol" w:hAnsi="Symbol" w:hint="default"/>
+      </w:rPr>
+    </w:lvl>
+    <w:lvl w:ilvl="4" w:tplc="04100003" w:tentative="1">
+      <w:start w:val="1"/>
+      <w:numFmt w:val="bullet"/>
+      <w:lvlText w:val="o"/>
+      <w:lvlJc w:val="left"/>
+      <w:pPr>
+        <w:ind w:left="3600" w:hanging="360"/>
+      </w:pPr>
+      <w:rPr>
+        <w:rFonts w:ascii="Courier New" w:hAnsi="Courier New" w:cs="Courier New" w:hint="default"/>
+      </w:rPr>
+    </w:lvl>
+    <w:lvl w:ilvl="5" w:tplc="04100005" w:tentative="1">
+      <w:start w:val="1"/>
+      <w:numFmt w:val="bullet"/>
+      <w:lvlText w:val=""/>
+      <w:lvlJc w:val="left"/>
+      <w:pPr>
+        <w:ind w:left="4320" w:hanging="360"/>
+      </w:pPr>
+      <w:rPr>
+        <w:rFonts w:ascii="Wingdings" w:hAnsi="Wingdings" w:hint="default"/>
+      </w:rPr>
+    </w:lvl>
+    <w:lvl w:ilvl="6" w:tplc="04100001" w:tentative="1">
+      <w:start w:val="1"/>
+      <w:numFmt w:val="bullet"/>
+      <w:lvlText w:val=""/>
+      <w:lvlJc w:val="left"/>
+      <w:pPr>
+        <w:ind w:left="5040" w:hanging="360"/>
+      </w:pPr>
+      <w:rPr>
+        <w:rFonts w:ascii="Symbol" w:hAnsi="Symbol" w:hint="default"/>
+      </w:rPr>
+    </w:lvl>
+    <w:lvl w:ilvl="7" w:tplc="04100003" w:tentative="1">
+      <w:start w:val="1"/>
+      <w:numFmt w:val="bullet"/>
+      <w:lvlText w:val="o"/>
+      <w:lvlJc w:val="left"/>
+      <w:pPr>
+        <w:ind w:left="5760" w:hanging="360"/>
+      </w:pPr>
+      <w:rPr>
+        <w:rFonts w:ascii="Courier New" w:hAnsi="Courier New" w:cs="Courier New" w:hint="default"/>
+      </w:rPr>
+    </w:lvl>
+    <w:lvl w:ilvl="8" w:tplc="04100005" w:tentative="1">
+      <w:start w:val="1"/>
+      <w:numFmt w:val="bullet"/>
+      <w:lvlText w:val=""/>
+      <w:lvlJc w:val="left"/>
+      <w:pPr>
+        <w:ind w:left="6480" w:hanging="360"/>
+      </w:pPr>
+      <w:rPr>
+        <w:rFonts w:ascii="Wingdings" w:hAnsi="Wingdings" w:hint="default"/>
+      </w:rPr>
+    </w:lvl>
+  </w:abstractNum>
+  <w:abstractNum w:abstractNumId="1" w15:restartNumberingAfterBreak="0">
     <w:nsid w:val="00846A54"/>
     <w:multiLevelType w:val="multilevel"/>
     <w:tmpl w:val="BB403CC8"/>
@@ -20870,10 +22781,10 @@
       </w:rPr>
     </w:lvl>
   </w:abstractNum>
-  <w:abstractNum w:abstractNumId="1" w15:restartNumberingAfterBreak="0">
-    <w:nsid w:val="1BAA7D97"/>
+  <w:abstractNum w:abstractNumId="2" w15:restartNumberingAfterBreak="0">
+    <w:nsid w:val="07CC5C3F"/>
     <w:multiLevelType w:val="hybridMultilevel"/>
-    <w:tmpl w:val="0D6C45FE"/>
+    <w:tmpl w:val="65F49FF8"/>
     <w:lvl w:ilvl="0" w:tplc="0410000B">
       <w:start w:val="1"/>
       <w:numFmt w:val="bullet"/>
@@ -20983,7 +22894,120 @@
       </w:rPr>
     </w:lvl>
   </w:abstractNum>
-  <w:abstractNum w:abstractNumId="2" w15:restartNumberingAfterBreak="0">
+  <w:abstractNum w:abstractNumId="3" w15:restartNumberingAfterBreak="0">
+    <w:nsid w:val="1BAA7D97"/>
+    <w:multiLevelType w:val="hybridMultilevel"/>
+    <w:tmpl w:val="0D6C45FE"/>
+    <w:lvl w:ilvl="0" w:tplc="0410000B">
+      <w:start w:val="1"/>
+      <w:numFmt w:val="bullet"/>
+      <w:lvlText w:val=""/>
+      <w:lvlJc w:val="left"/>
+      <w:pPr>
+        <w:ind w:left="720" w:hanging="360"/>
+      </w:pPr>
+      <w:rPr>
+        <w:rFonts w:ascii="Wingdings" w:hAnsi="Wingdings" w:hint="default"/>
+      </w:rPr>
+    </w:lvl>
+    <w:lvl w:ilvl="1" w:tplc="04100003" w:tentative="1">
+      <w:start w:val="1"/>
+      <w:numFmt w:val="bullet"/>
+      <w:lvlText w:val="o"/>
+      <w:lvlJc w:val="left"/>
+      <w:pPr>
+        <w:ind w:left="1440" w:hanging="360"/>
+      </w:pPr>
+      <w:rPr>
+        <w:rFonts w:ascii="Courier New" w:hAnsi="Courier New" w:cs="Courier New" w:hint="default"/>
+      </w:rPr>
+    </w:lvl>
+    <w:lvl w:ilvl="2" w:tplc="04100005" w:tentative="1">
+      <w:start w:val="1"/>
+      <w:numFmt w:val="bullet"/>
+      <w:lvlText w:val=""/>
+      <w:lvlJc w:val="left"/>
+      <w:pPr>
+        <w:ind w:left="2160" w:hanging="360"/>
+      </w:pPr>
+      <w:rPr>
+        <w:rFonts w:ascii="Wingdings" w:hAnsi="Wingdings" w:hint="default"/>
+      </w:rPr>
+    </w:lvl>
+    <w:lvl w:ilvl="3" w:tplc="04100001" w:tentative="1">
+      <w:start w:val="1"/>
+      <w:numFmt w:val="bullet"/>
+      <w:lvlText w:val=""/>
+      <w:lvlJc w:val="left"/>
+      <w:pPr>
+        <w:ind w:left="2880" w:hanging="360"/>
+      </w:pPr>
+      <w:rPr>
+        <w:rFonts w:ascii="Symbol" w:hAnsi="Symbol" w:hint="default"/>
+      </w:rPr>
+    </w:lvl>
+    <w:lvl w:ilvl="4" w:tplc="04100003" w:tentative="1">
+      <w:start w:val="1"/>
+      <w:numFmt w:val="bullet"/>
+      <w:lvlText w:val="o"/>
+      <w:lvlJc w:val="left"/>
+      <w:pPr>
+        <w:ind w:left="3600" w:hanging="360"/>
+      </w:pPr>
+      <w:rPr>
+        <w:rFonts w:ascii="Courier New" w:hAnsi="Courier New" w:cs="Courier New" w:hint="default"/>
+      </w:rPr>
+    </w:lvl>
+    <w:lvl w:ilvl="5" w:tplc="04100005" w:tentative="1">
+      <w:start w:val="1"/>
+      <w:numFmt w:val="bullet"/>
+      <w:lvlText w:val=""/>
+      <w:lvlJc w:val="left"/>
+      <w:pPr>
+        <w:ind w:left="4320" w:hanging="360"/>
+      </w:pPr>
+      <w:rPr>
+        <w:rFonts w:ascii="Wingdings" w:hAnsi="Wingdings" w:hint="default"/>
+      </w:rPr>
+    </w:lvl>
+    <w:lvl w:ilvl="6" w:tplc="04100001" w:tentative="1">
+      <w:start w:val="1"/>
+      <w:numFmt w:val="bullet"/>
+      <w:lvlText w:val=""/>
+      <w:lvlJc w:val="left"/>
+      <w:pPr>
+        <w:ind w:left="5040" w:hanging="360"/>
+      </w:pPr>
+      <w:rPr>
+        <w:rFonts w:ascii="Symbol" w:hAnsi="Symbol" w:hint="default"/>
+      </w:rPr>
+    </w:lvl>
+    <w:lvl w:ilvl="7" w:tplc="04100003" w:tentative="1">
+      <w:start w:val="1"/>
+      <w:numFmt w:val="bullet"/>
+      <w:lvlText w:val="o"/>
+      <w:lvlJc w:val="left"/>
+      <w:pPr>
+        <w:ind w:left="5760" w:hanging="360"/>
+      </w:pPr>
+      <w:rPr>
+        <w:rFonts w:ascii="Courier New" w:hAnsi="Courier New" w:cs="Courier New" w:hint="default"/>
+      </w:rPr>
+    </w:lvl>
+    <w:lvl w:ilvl="8" w:tplc="04100005" w:tentative="1">
+      <w:start w:val="1"/>
+      <w:numFmt w:val="bullet"/>
+      <w:lvlText w:val=""/>
+      <w:lvlJc w:val="left"/>
+      <w:pPr>
+        <w:ind w:left="6480" w:hanging="360"/>
+      </w:pPr>
+      <w:rPr>
+        <w:rFonts w:ascii="Wingdings" w:hAnsi="Wingdings" w:hint="default"/>
+      </w:rPr>
+    </w:lvl>
+  </w:abstractNum>
+  <w:abstractNum w:abstractNumId="4" w15:restartNumberingAfterBreak="0">
     <w:nsid w:val="1CAA5DBD"/>
     <w:multiLevelType w:val="multilevel"/>
     <w:tmpl w:val="9774A33E"/>
@@ -21107,7 +23131,7 @@
       </w:rPr>
     </w:lvl>
   </w:abstractNum>
-  <w:abstractNum w:abstractNumId="3" w15:restartNumberingAfterBreak="0">
+  <w:abstractNum w:abstractNumId="5" w15:restartNumberingAfterBreak="0">
     <w:nsid w:val="1F3A3DBA"/>
     <w:multiLevelType w:val="multilevel"/>
     <w:tmpl w:val="6B3A05B2"/>
@@ -21256,7 +23280,7 @@
       </w:rPr>
     </w:lvl>
   </w:abstractNum>
-  <w:abstractNum w:abstractNumId="4" w15:restartNumberingAfterBreak="0">
+  <w:abstractNum w:abstractNumId="6" w15:restartNumberingAfterBreak="0">
     <w:nsid w:val="286E2C12"/>
     <w:multiLevelType w:val="multilevel"/>
     <w:tmpl w:val="9F029808"/>
@@ -21401,7 +23425,7 @@
       </w:rPr>
     </w:lvl>
   </w:abstractNum>
-  <w:abstractNum w:abstractNumId="5" w15:restartNumberingAfterBreak="0">
+  <w:abstractNum w:abstractNumId="7" w15:restartNumberingAfterBreak="0">
     <w:nsid w:val="2E91324A"/>
     <w:multiLevelType w:val="hybridMultilevel"/>
     <w:tmpl w:val="02A6DC48"/>
@@ -21487,7 +23511,128 @@
       </w:pPr>
     </w:lvl>
   </w:abstractNum>
-  <w:abstractNum w:abstractNumId="6" w15:restartNumberingAfterBreak="0">
+  <w:abstractNum w:abstractNumId="8" w15:restartNumberingAfterBreak="0">
+    <w:nsid w:val="2EEB3CCD"/>
+    <w:multiLevelType w:val="multilevel"/>
+    <w:tmpl w:val="0568C4DC"/>
+    <w:lvl w:ilvl="0">
+      <w:start w:val="1"/>
+      <w:numFmt w:val="bullet"/>
+      <w:lvlText w:val=""/>
+      <w:lvlJc w:val="left"/>
+      <w:pPr>
+        <w:ind w:left="720" w:hanging="360"/>
+      </w:pPr>
+      <w:rPr>
+        <w:rFonts w:ascii="Wingdings" w:hAnsi="Wingdings" w:hint="default"/>
+      </w:rPr>
+    </w:lvl>
+    <w:lvl w:ilvl="1">
+      <w:start w:val="1"/>
+      <w:numFmt w:val="decimal"/>
+      <w:isLgl/>
+      <w:lvlText w:val="%1.%2"/>
+      <w:lvlJc w:val="left"/>
+      <w:pPr>
+        <w:ind w:left="720" w:hanging="360"/>
+      </w:pPr>
+      <w:rPr>
+        <w:rFonts w:hint="default"/>
+      </w:rPr>
+    </w:lvl>
+    <w:lvl w:ilvl="2">
+      <w:start w:val="1"/>
+      <w:numFmt w:val="decimal"/>
+      <w:isLgl/>
+      <w:lvlText w:val="%1.%2.%3"/>
+      <w:lvlJc w:val="left"/>
+      <w:pPr>
+        <w:ind w:left="1080" w:hanging="720"/>
+      </w:pPr>
+      <w:rPr>
+        <w:rFonts w:hint="default"/>
+      </w:rPr>
+    </w:lvl>
+    <w:lvl w:ilvl="3">
+      <w:start w:val="1"/>
+      <w:numFmt w:val="decimal"/>
+      <w:isLgl/>
+      <w:lvlText w:val="%1.%2.%3.%4"/>
+      <w:lvlJc w:val="left"/>
+      <w:pPr>
+        <w:ind w:left="1080" w:hanging="720"/>
+      </w:pPr>
+      <w:rPr>
+        <w:rFonts w:hint="default"/>
+      </w:rPr>
+    </w:lvl>
+    <w:lvl w:ilvl="4">
+      <w:start w:val="1"/>
+      <w:numFmt w:val="decimal"/>
+      <w:isLgl/>
+      <w:lvlText w:val="%1.%2.%3.%4.%5"/>
+      <w:lvlJc w:val="left"/>
+      <w:pPr>
+        <w:ind w:left="1440" w:hanging="1080"/>
+      </w:pPr>
+      <w:rPr>
+        <w:rFonts w:hint="default"/>
+      </w:rPr>
+    </w:lvl>
+    <w:lvl w:ilvl="5">
+      <w:start w:val="1"/>
+      <w:numFmt w:val="decimal"/>
+      <w:isLgl/>
+      <w:lvlText w:val="%1.%2.%3.%4.%5.%6"/>
+      <w:lvlJc w:val="left"/>
+      <w:pPr>
+        <w:ind w:left="1440" w:hanging="1080"/>
+      </w:pPr>
+      <w:rPr>
+        <w:rFonts w:hint="default"/>
+      </w:rPr>
+    </w:lvl>
+    <w:lvl w:ilvl="6">
+      <w:start w:val="1"/>
+      <w:numFmt w:val="decimal"/>
+      <w:isLgl/>
+      <w:lvlText w:val="%1.%2.%3.%4.%5.%6.%7"/>
+      <w:lvlJc w:val="left"/>
+      <w:pPr>
+        <w:ind w:left="1800" w:hanging="1440"/>
+      </w:pPr>
+      <w:rPr>
+        <w:rFonts w:hint="default"/>
+      </w:rPr>
+    </w:lvl>
+    <w:lvl w:ilvl="7">
+      <w:start w:val="1"/>
+      <w:numFmt w:val="decimal"/>
+      <w:isLgl/>
+      <w:lvlText w:val="%1.%2.%3.%4.%5.%6.%7.%8"/>
+      <w:lvlJc w:val="left"/>
+      <w:pPr>
+        <w:ind w:left="1800" w:hanging="1440"/>
+      </w:pPr>
+      <w:rPr>
+        <w:rFonts w:hint="default"/>
+      </w:rPr>
+    </w:lvl>
+    <w:lvl w:ilvl="8">
+      <w:start w:val="1"/>
+      <w:numFmt w:val="decimal"/>
+      <w:isLgl/>
+      <w:lvlText w:val="%1.%2.%3.%4.%5.%6.%7.%8.%9"/>
+      <w:lvlJc w:val="left"/>
+      <w:pPr>
+        <w:ind w:left="2160" w:hanging="1800"/>
+      </w:pPr>
+      <w:rPr>
+        <w:rFonts w:hint="default"/>
+      </w:rPr>
+    </w:lvl>
+  </w:abstractNum>
+  <w:abstractNum w:abstractNumId="9" w15:restartNumberingAfterBreak="0">
     <w:nsid w:val="36855CE6"/>
     <w:multiLevelType w:val="hybridMultilevel"/>
     <w:tmpl w:val="768C7606"/>
@@ -21632,7 +23777,7 @@
       </w:rPr>
     </w:lvl>
   </w:abstractNum>
-  <w:abstractNum w:abstractNumId="7" w15:restartNumberingAfterBreak="0">
+  <w:abstractNum w:abstractNumId="10" w15:restartNumberingAfterBreak="0">
     <w:nsid w:val="443D1317"/>
     <w:multiLevelType w:val="multilevel"/>
     <w:tmpl w:val="C6DA4170"/>
@@ -21781,7 +23926,7 @@
       </w:rPr>
     </w:lvl>
   </w:abstractNum>
-  <w:abstractNum w:abstractNumId="8" w15:restartNumberingAfterBreak="0">
+  <w:abstractNum w:abstractNumId="11" w15:restartNumberingAfterBreak="0">
     <w:nsid w:val="5276463F"/>
     <w:multiLevelType w:val="multilevel"/>
     <w:tmpl w:val="D8D8741C"/>
@@ -21930,7 +24075,7 @@
       </w:rPr>
     </w:lvl>
   </w:abstractNum>
-  <w:abstractNum w:abstractNumId="9" w15:restartNumberingAfterBreak="0">
+  <w:abstractNum w:abstractNumId="12" w15:restartNumberingAfterBreak="0">
     <w:nsid w:val="53DF4DF0"/>
     <w:multiLevelType w:val="multilevel"/>
     <w:tmpl w:val="468E4B66"/>
@@ -22079,7 +24224,7 @@
       </w:rPr>
     </w:lvl>
   </w:abstractNum>
-  <w:abstractNum w:abstractNumId="10" w15:restartNumberingAfterBreak="0">
+  <w:abstractNum w:abstractNumId="13" w15:restartNumberingAfterBreak="0">
     <w:nsid w:val="564C5C57"/>
     <w:multiLevelType w:val="hybridMultilevel"/>
     <w:tmpl w:val="7E585808"/>
@@ -22192,7 +24337,7 @@
       </w:rPr>
     </w:lvl>
   </w:abstractNum>
-  <w:abstractNum w:abstractNumId="11" w15:restartNumberingAfterBreak="0">
+  <w:abstractNum w:abstractNumId="14" w15:restartNumberingAfterBreak="0">
     <w:nsid w:val="5998606F"/>
     <w:multiLevelType w:val="multilevel"/>
     <w:tmpl w:val="3FE235C6"/>
@@ -22333,7 +24478,382 @@
       </w:rPr>
     </w:lvl>
   </w:abstractNum>
-  <w:abstractNum w:abstractNumId="12" w15:restartNumberingAfterBreak="0">
+  <w:abstractNum w:abstractNumId="15" w15:restartNumberingAfterBreak="0">
+    <w:nsid w:val="5F6E5CB5"/>
+    <w:multiLevelType w:val="multilevel"/>
+    <w:tmpl w:val="C8B8B9C6"/>
+    <w:lvl w:ilvl="0">
+      <w:start w:val="1"/>
+      <w:numFmt w:val="bullet"/>
+      <w:lvlText w:val=""/>
+      <w:lvlJc w:val="left"/>
+      <w:pPr>
+        <w:tabs>
+          <w:tab w:val="num" w:pos="720"/>
+        </w:tabs>
+        <w:ind w:left="720" w:hanging="360"/>
+      </w:pPr>
+      <w:rPr>
+        <w:rFonts w:ascii="Symbol" w:hAnsi="Symbol" w:hint="default"/>
+        <w:sz w:val="20"/>
+      </w:rPr>
+    </w:lvl>
+    <w:lvl w:ilvl="1" w:tentative="1">
+      <w:start w:val="1"/>
+      <w:numFmt w:val="bullet"/>
+      <w:lvlText w:val="o"/>
+      <w:lvlJc w:val="left"/>
+      <w:pPr>
+        <w:tabs>
+          <w:tab w:val="num" w:pos="1440"/>
+        </w:tabs>
+        <w:ind w:left="1440" w:hanging="360"/>
+      </w:pPr>
+      <w:rPr>
+        <w:rFonts w:ascii="Courier New" w:hAnsi="Courier New" w:hint="default"/>
+        <w:sz w:val="20"/>
+      </w:rPr>
+    </w:lvl>
+    <w:lvl w:ilvl="2" w:tentative="1">
+      <w:start w:val="1"/>
+      <w:numFmt w:val="bullet"/>
+      <w:lvlText w:val=""/>
+      <w:lvlJc w:val="left"/>
+      <w:pPr>
+        <w:tabs>
+          <w:tab w:val="num" w:pos="2160"/>
+        </w:tabs>
+        <w:ind w:left="2160" w:hanging="360"/>
+      </w:pPr>
+      <w:rPr>
+        <w:rFonts w:ascii="Wingdings" w:hAnsi="Wingdings" w:hint="default"/>
+        <w:sz w:val="20"/>
+      </w:rPr>
+    </w:lvl>
+    <w:lvl w:ilvl="3" w:tentative="1">
+      <w:start w:val="1"/>
+      <w:numFmt w:val="bullet"/>
+      <w:lvlText w:val=""/>
+      <w:lvlJc w:val="left"/>
+      <w:pPr>
+        <w:tabs>
+          <w:tab w:val="num" w:pos="2880"/>
+        </w:tabs>
+        <w:ind w:left="2880" w:hanging="360"/>
+      </w:pPr>
+      <w:rPr>
+        <w:rFonts w:ascii="Wingdings" w:hAnsi="Wingdings" w:hint="default"/>
+        <w:sz w:val="20"/>
+      </w:rPr>
+    </w:lvl>
+    <w:lvl w:ilvl="4" w:tentative="1">
+      <w:start w:val="1"/>
+      <w:numFmt w:val="bullet"/>
+      <w:lvlText w:val=""/>
+      <w:lvlJc w:val="left"/>
+      <w:pPr>
+        <w:tabs>
+          <w:tab w:val="num" w:pos="3600"/>
+        </w:tabs>
+        <w:ind w:left="3600" w:hanging="360"/>
+      </w:pPr>
+      <w:rPr>
+        <w:rFonts w:ascii="Wingdings" w:hAnsi="Wingdings" w:hint="default"/>
+        <w:sz w:val="20"/>
+      </w:rPr>
+    </w:lvl>
+    <w:lvl w:ilvl="5" w:tentative="1">
+      <w:start w:val="1"/>
+      <w:numFmt w:val="bullet"/>
+      <w:lvlText w:val=""/>
+      <w:lvlJc w:val="left"/>
+      <w:pPr>
+        <w:tabs>
+          <w:tab w:val="num" w:pos="4320"/>
+        </w:tabs>
+        <w:ind w:left="4320" w:hanging="360"/>
+      </w:pPr>
+      <w:rPr>
+        <w:rFonts w:ascii="Wingdings" w:hAnsi="Wingdings" w:hint="default"/>
+        <w:sz w:val="20"/>
+      </w:rPr>
+    </w:lvl>
+    <w:lvl w:ilvl="6" w:tentative="1">
+      <w:start w:val="1"/>
+      <w:numFmt w:val="bullet"/>
+      <w:lvlText w:val=""/>
+      <w:lvlJc w:val="left"/>
+      <w:pPr>
+        <w:tabs>
+          <w:tab w:val="num" w:pos="5040"/>
+        </w:tabs>
+        <w:ind w:left="5040" w:hanging="360"/>
+      </w:pPr>
+      <w:rPr>
+        <w:rFonts w:ascii="Wingdings" w:hAnsi="Wingdings" w:hint="default"/>
+        <w:sz w:val="20"/>
+      </w:rPr>
+    </w:lvl>
+    <w:lvl w:ilvl="7" w:tentative="1">
+      <w:start w:val="1"/>
+      <w:numFmt w:val="bullet"/>
+      <w:lvlText w:val=""/>
+      <w:lvlJc w:val="left"/>
+      <w:pPr>
+        <w:tabs>
+          <w:tab w:val="num" w:pos="5760"/>
+        </w:tabs>
+        <w:ind w:left="5760" w:hanging="360"/>
+      </w:pPr>
+      <w:rPr>
+        <w:rFonts w:ascii="Wingdings" w:hAnsi="Wingdings" w:hint="default"/>
+        <w:sz w:val="20"/>
+      </w:rPr>
+    </w:lvl>
+    <w:lvl w:ilvl="8" w:tentative="1">
+      <w:start w:val="1"/>
+      <w:numFmt w:val="bullet"/>
+      <w:lvlText w:val=""/>
+      <w:lvlJc w:val="left"/>
+      <w:pPr>
+        <w:tabs>
+          <w:tab w:val="num" w:pos="6480"/>
+        </w:tabs>
+        <w:ind w:left="6480" w:hanging="360"/>
+      </w:pPr>
+      <w:rPr>
+        <w:rFonts w:ascii="Wingdings" w:hAnsi="Wingdings" w:hint="default"/>
+        <w:sz w:val="20"/>
+      </w:rPr>
+    </w:lvl>
+  </w:abstractNum>
+  <w:abstractNum w:abstractNumId="16" w15:restartNumberingAfterBreak="0">
+    <w:nsid w:val="604E52EB"/>
+    <w:multiLevelType w:val="hybridMultilevel"/>
+    <w:tmpl w:val="B6F45DD2"/>
+    <w:lvl w:ilvl="0" w:tplc="04100001">
+      <w:start w:val="1"/>
+      <w:numFmt w:val="bullet"/>
+      <w:lvlText w:val=""/>
+      <w:lvlJc w:val="left"/>
+      <w:pPr>
+        <w:ind w:left="1440" w:hanging="360"/>
+      </w:pPr>
+      <w:rPr>
+        <w:rFonts w:ascii="Symbol" w:hAnsi="Symbol" w:hint="default"/>
+      </w:rPr>
+    </w:lvl>
+    <w:lvl w:ilvl="1" w:tplc="04100003" w:tentative="1">
+      <w:start w:val="1"/>
+      <w:numFmt w:val="bullet"/>
+      <w:lvlText w:val="o"/>
+      <w:lvlJc w:val="left"/>
+      <w:pPr>
+        <w:ind w:left="2160" w:hanging="360"/>
+      </w:pPr>
+      <w:rPr>
+        <w:rFonts w:ascii="Courier New" w:hAnsi="Courier New" w:cs="Courier New" w:hint="default"/>
+      </w:rPr>
+    </w:lvl>
+    <w:lvl w:ilvl="2" w:tplc="04100005" w:tentative="1">
+      <w:start w:val="1"/>
+      <w:numFmt w:val="bullet"/>
+      <w:lvlText w:val=""/>
+      <w:lvlJc w:val="left"/>
+      <w:pPr>
+        <w:ind w:left="2880" w:hanging="360"/>
+      </w:pPr>
+      <w:rPr>
+        <w:rFonts w:ascii="Wingdings" w:hAnsi="Wingdings" w:hint="default"/>
+      </w:rPr>
+    </w:lvl>
+    <w:lvl w:ilvl="3" w:tplc="04100001" w:tentative="1">
+      <w:start w:val="1"/>
+      <w:numFmt w:val="bullet"/>
+      <w:lvlText w:val=""/>
+      <w:lvlJc w:val="left"/>
+      <w:pPr>
+        <w:ind w:left="3600" w:hanging="360"/>
+      </w:pPr>
+      <w:rPr>
+        <w:rFonts w:ascii="Symbol" w:hAnsi="Symbol" w:hint="default"/>
+      </w:rPr>
+    </w:lvl>
+    <w:lvl w:ilvl="4" w:tplc="04100003" w:tentative="1">
+      <w:start w:val="1"/>
+      <w:numFmt w:val="bullet"/>
+      <w:lvlText w:val="o"/>
+      <w:lvlJc w:val="left"/>
+      <w:pPr>
+        <w:ind w:left="4320" w:hanging="360"/>
+      </w:pPr>
+      <w:rPr>
+        <w:rFonts w:ascii="Courier New" w:hAnsi="Courier New" w:cs="Courier New" w:hint="default"/>
+      </w:rPr>
+    </w:lvl>
+    <w:lvl w:ilvl="5" w:tplc="04100005" w:tentative="1">
+      <w:start w:val="1"/>
+      <w:numFmt w:val="bullet"/>
+      <w:lvlText w:val=""/>
+      <w:lvlJc w:val="left"/>
+      <w:pPr>
+        <w:ind w:left="5040" w:hanging="360"/>
+      </w:pPr>
+      <w:rPr>
+        <w:rFonts w:ascii="Wingdings" w:hAnsi="Wingdings" w:hint="default"/>
+      </w:rPr>
+    </w:lvl>
+    <w:lvl w:ilvl="6" w:tplc="04100001" w:tentative="1">
+      <w:start w:val="1"/>
+      <w:numFmt w:val="bullet"/>
+      <w:lvlText w:val=""/>
+      <w:lvlJc w:val="left"/>
+      <w:pPr>
+        <w:ind w:left="5760" w:hanging="360"/>
+      </w:pPr>
+      <w:rPr>
+        <w:rFonts w:ascii="Symbol" w:hAnsi="Symbol" w:hint="default"/>
+      </w:rPr>
+    </w:lvl>
+    <w:lvl w:ilvl="7" w:tplc="04100003" w:tentative="1">
+      <w:start w:val="1"/>
+      <w:numFmt w:val="bullet"/>
+      <w:lvlText w:val="o"/>
+      <w:lvlJc w:val="left"/>
+      <w:pPr>
+        <w:ind w:left="6480" w:hanging="360"/>
+      </w:pPr>
+      <w:rPr>
+        <w:rFonts w:ascii="Courier New" w:hAnsi="Courier New" w:cs="Courier New" w:hint="default"/>
+      </w:rPr>
+    </w:lvl>
+    <w:lvl w:ilvl="8" w:tplc="04100005" w:tentative="1">
+      <w:start w:val="1"/>
+      <w:numFmt w:val="bullet"/>
+      <w:lvlText w:val=""/>
+      <w:lvlJc w:val="left"/>
+      <w:pPr>
+        <w:ind w:left="7200" w:hanging="360"/>
+      </w:pPr>
+      <w:rPr>
+        <w:rFonts w:ascii="Wingdings" w:hAnsi="Wingdings" w:hint="default"/>
+      </w:rPr>
+    </w:lvl>
+  </w:abstractNum>
+  <w:abstractNum w:abstractNumId="17" w15:restartNumberingAfterBreak="0">
+    <w:nsid w:val="68751EB0"/>
+    <w:multiLevelType w:val="hybridMultilevel"/>
+    <w:tmpl w:val="EBC80BDA"/>
+    <w:lvl w:ilvl="0" w:tplc="0410000B">
+      <w:start w:val="1"/>
+      <w:numFmt w:val="bullet"/>
+      <w:lvlText w:val=""/>
+      <w:lvlJc w:val="left"/>
+      <w:pPr>
+        <w:ind w:left="720" w:hanging="360"/>
+      </w:pPr>
+      <w:rPr>
+        <w:rFonts w:ascii="Wingdings" w:hAnsi="Wingdings" w:hint="default"/>
+      </w:rPr>
+    </w:lvl>
+    <w:lvl w:ilvl="1" w:tplc="04100003" w:tentative="1">
+      <w:start w:val="1"/>
+      <w:numFmt w:val="bullet"/>
+      <w:lvlText w:val="o"/>
+      <w:lvlJc w:val="left"/>
+      <w:pPr>
+        <w:ind w:left="1440" w:hanging="360"/>
+      </w:pPr>
+      <w:rPr>
+        <w:rFonts w:ascii="Courier New" w:hAnsi="Courier New" w:cs="Courier New" w:hint="default"/>
+      </w:rPr>
+    </w:lvl>
+    <w:lvl w:ilvl="2" w:tplc="04100005" w:tentative="1">
+      <w:start w:val="1"/>
+      <w:numFmt w:val="bullet"/>
+      <w:lvlText w:val=""/>
+      <w:lvlJc w:val="left"/>
+      <w:pPr>
+        <w:ind w:left="2160" w:hanging="360"/>
+      </w:pPr>
+      <w:rPr>
+        <w:rFonts w:ascii="Wingdings" w:hAnsi="Wingdings" w:hint="default"/>
+      </w:rPr>
+    </w:lvl>
+    <w:lvl w:ilvl="3" w:tplc="04100001" w:tentative="1">
+      <w:start w:val="1"/>
+      <w:numFmt w:val="bullet"/>
+      <w:lvlText w:val=""/>
+      <w:lvlJc w:val="left"/>
+      <w:pPr>
+        <w:ind w:left="2880" w:hanging="360"/>
+      </w:pPr>
+      <w:rPr>
+        <w:rFonts w:ascii="Symbol" w:hAnsi="Symbol" w:hint="default"/>
+      </w:rPr>
+    </w:lvl>
+    <w:lvl w:ilvl="4" w:tplc="04100003" w:tentative="1">
+      <w:start w:val="1"/>
+      <w:numFmt w:val="bullet"/>
+      <w:lvlText w:val="o"/>
+      <w:lvlJc w:val="left"/>
+      <w:pPr>
+        <w:ind w:left="3600" w:hanging="360"/>
+      </w:pPr>
+      <w:rPr>
+        <w:rFonts w:ascii="Courier New" w:hAnsi="Courier New" w:cs="Courier New" w:hint="default"/>
+      </w:rPr>
+    </w:lvl>
+    <w:lvl w:ilvl="5" w:tplc="04100005" w:tentative="1">
+      <w:start w:val="1"/>
+      <w:numFmt w:val="bullet"/>
+      <w:lvlText w:val=""/>
+      <w:lvlJc w:val="left"/>
+      <w:pPr>
+        <w:ind w:left="4320" w:hanging="360"/>
+      </w:pPr>
+      <w:rPr>
+        <w:rFonts w:ascii="Wingdings" w:hAnsi="Wingdings" w:hint="default"/>
+      </w:rPr>
+    </w:lvl>
+    <w:lvl w:ilvl="6" w:tplc="04100001" w:tentative="1">
+      <w:start w:val="1"/>
+      <w:numFmt w:val="bullet"/>
+      <w:lvlText w:val=""/>
+      <w:lvlJc w:val="left"/>
+      <w:pPr>
+        <w:ind w:left="5040" w:hanging="360"/>
+      </w:pPr>
+      <w:rPr>
+        <w:rFonts w:ascii="Symbol" w:hAnsi="Symbol" w:hint="default"/>
+      </w:rPr>
+    </w:lvl>
+    <w:lvl w:ilvl="7" w:tplc="04100003" w:tentative="1">
+      <w:start w:val="1"/>
+      <w:numFmt w:val="bullet"/>
+      <w:lvlText w:val="o"/>
+      <w:lvlJc w:val="left"/>
+      <w:pPr>
+        <w:ind w:left="5760" w:hanging="360"/>
+      </w:pPr>
+      <w:rPr>
+        <w:rFonts w:ascii="Courier New" w:hAnsi="Courier New" w:cs="Courier New" w:hint="default"/>
+      </w:rPr>
+    </w:lvl>
+    <w:lvl w:ilvl="8" w:tplc="04100005" w:tentative="1">
+      <w:start w:val="1"/>
+      <w:numFmt w:val="bullet"/>
+      <w:lvlText w:val=""/>
+      <w:lvlJc w:val="left"/>
+      <w:pPr>
+        <w:ind w:left="6480" w:hanging="360"/>
+      </w:pPr>
+      <w:rPr>
+        <w:rFonts w:ascii="Wingdings" w:hAnsi="Wingdings" w:hint="default"/>
+      </w:rPr>
+    </w:lvl>
+  </w:abstractNum>
+  <w:abstractNum w:abstractNumId="18" w15:restartNumberingAfterBreak="0">
     <w:nsid w:val="74006CC1"/>
     <w:multiLevelType w:val="multilevel"/>
     <w:tmpl w:val="805CB770"/>
@@ -22482,7 +25002,7 @@
       </w:rPr>
     </w:lvl>
   </w:abstractNum>
-  <w:abstractNum w:abstractNumId="13" w15:restartNumberingAfterBreak="0">
+  <w:abstractNum w:abstractNumId="19" w15:restartNumberingAfterBreak="0">
     <w:nsid w:val="75481469"/>
     <w:multiLevelType w:val="multilevel"/>
     <w:tmpl w:val="A844A2DA"/>
@@ -22632,46 +25152,76 @@
     </w:lvl>
   </w:abstractNum>
   <w:num w:numId="1" w16cid:durableId="1219364729">
+    <w:abstractNumId w:val="6"/>
+  </w:num>
+  <w:num w:numId="2" w16cid:durableId="1785230691">
+    <w:abstractNumId w:val="7"/>
+  </w:num>
+  <w:num w:numId="3" w16cid:durableId="1218664122">
+    <w:abstractNumId w:val="14"/>
+  </w:num>
+  <w:num w:numId="4" w16cid:durableId="809980689">
+    <w:abstractNumId w:val="11"/>
+  </w:num>
+  <w:num w:numId="5" w16cid:durableId="2059086037">
+    <w:abstractNumId w:val="3"/>
+  </w:num>
+  <w:num w:numId="6" w16cid:durableId="1564751397">
+    <w:abstractNumId w:val="1"/>
+  </w:num>
+  <w:num w:numId="7" w16cid:durableId="2118870801">
+    <w:abstractNumId w:val="18"/>
+  </w:num>
+  <w:num w:numId="8" w16cid:durableId="845949174">
+    <w:abstractNumId w:val="12"/>
+  </w:num>
+  <w:num w:numId="9" w16cid:durableId="1316911062">
+    <w:abstractNumId w:val="9"/>
+  </w:num>
+  <w:num w:numId="10" w16cid:durableId="74934965">
+    <w:abstractNumId w:val="10"/>
+  </w:num>
+  <w:num w:numId="11" w16cid:durableId="1358778931">
+    <w:abstractNumId w:val="5"/>
+  </w:num>
+  <w:num w:numId="12" w16cid:durableId="765614911">
+    <w:abstractNumId w:val="13"/>
+  </w:num>
+  <w:num w:numId="13" w16cid:durableId="772827488">
+    <w:abstractNumId w:val="19"/>
+  </w:num>
+  <w:num w:numId="14" w16cid:durableId="146747532">
     <w:abstractNumId w:val="4"/>
   </w:num>
-  <w:num w:numId="2" w16cid:durableId="1785230691">
-    <w:abstractNumId w:val="5"/>
+  <w:num w:numId="15" w16cid:durableId="910962251">
+    <w:abstractNumId w:val="15"/>
   </w:num>
-  <w:num w:numId="3" w16cid:durableId="1218664122">
-    <w:abstractNumId w:val="11"/>
+  <w:num w:numId="16" w16cid:durableId="1619221628">
+    <w:abstractNumId w:val="4"/>
+    <w:lvlOverride w:ilvl="0"/>
+    <w:lvlOverride w:ilvl="1"/>
+    <w:lvlOverride w:ilvl="2"/>
+    <w:lvlOverride w:ilvl="3"/>
+    <w:lvlOverride w:ilvl="4"/>
+    <w:lvlOverride w:ilvl="5"/>
+    <w:lvlOverride w:ilvl="6"/>
+    <w:lvlOverride w:ilvl="7"/>
+    <w:lvlOverride w:ilvl="8"/>
   </w:num>
-  <w:num w:numId="4" w16cid:durableId="809980689">
-    <w:abstractNumId w:val="8"/>
+  <w:num w:numId="17" w16cid:durableId="2101755162">
+    <w:abstractNumId w:val="16"/>
   </w:num>
-  <w:num w:numId="5" w16cid:durableId="2059086037">
-    <w:abstractNumId w:val="1"/>
-  </w:num>
-  <w:num w:numId="6" w16cid:durableId="1564751397">
+  <w:num w:numId="18" w16cid:durableId="44525197">
     <w:abstractNumId w:val="0"/>
   </w:num>
-  <w:num w:numId="7" w16cid:durableId="2118870801">
-    <w:abstractNumId w:val="12"/>
+  <w:num w:numId="19" w16cid:durableId="19010540">
+    <w:abstractNumId w:val="2"/>
   </w:num>
-  <w:num w:numId="8" w16cid:durableId="845949174">
-    <w:abstractNumId w:val="9"/>
+  <w:num w:numId="20" w16cid:durableId="2132966734">
+    <w:abstractNumId w:val="17"/>
   </w:num>
-  <w:num w:numId="9" w16cid:durableId="1316911062">
-    <w:abstractNumId w:val="6"/>
-  </w:num>
-  <w:num w:numId="10" w16cid:durableId="74934965">
-    <w:abstractNumId w:val="7"/>
-  </w:num>
-  <w:num w:numId="11" w16cid:durableId="1358778931">
-    <w:abstractNumId w:val="3"/>
-  </w:num>
-  <w:num w:numId="12" w16cid:durableId="765614911">
-    <w:abstractNumId w:val="10"/>
-  </w:num>
-  <w:num w:numId="13" w16cid:durableId="772827488">
-    <w:abstractNumId w:val="13"/>
-  </w:num>
-  <w:num w:numId="14" w16cid:durableId="146747532">
-    <w:abstractNumId w:val="2"/>
+  <w:num w:numId="21" w16cid:durableId="1056589301">
+    <w:abstractNumId w:val="8"/>
   </w:num>
   <w:numIdMacAtCleanup w:val="14"/>
 </w:numbering>
@@ -23986,6 +26536,25 @@
     <w:uiPriority w:val="99"/>
     <w:rsid w:val="00BD5321"/>
   </w:style>
+  <w:style w:type="paragraph" w:styleId="Didascalia">
+    <w:name w:val="caption"/>
+    <w:basedOn w:val="Normale"/>
+    <w:next w:val="Normale"/>
+    <w:uiPriority w:val="35"/>
+    <w:unhideWhenUsed/>
+    <w:qFormat/>
+    <w:rsid w:val="00BA6775"/>
+    <w:pPr>
+      <w:spacing w:after="200" w:line="240" w:lineRule="auto"/>
+    </w:pPr>
+    <w:rPr>
+      <w:i/>
+      <w:iCs/>
+      <w:color w:val="0E2841" w:themeColor="text2"/>
+      <w:sz w:val="18"/>
+      <w:szCs w:val="18"/>
+    </w:rPr>
+  </w:style>
 </w:styles>
 </file>
 
@@ -24285,15 +26854,6 @@
 </file>
 
 <file path=customXml/item1.xml><?xml version="1.0" encoding="utf-8"?>
-<?mso-contentType ?>
-<FormTemplates xmlns="http://schemas.microsoft.com/sharepoint/v3/contenttype/forms">
-  <Display>DocumentLibraryForm</Display>
-  <Edit>DocumentLibraryForm</Edit>
-  <New>DocumentLibraryForm</New>
-</FormTemplates>
-</file>
-
-<file path=customXml/item2.xml><?xml version="1.0" encoding="utf-8"?>
 <ct:contentTypeSchema xmlns:ct="http://schemas.microsoft.com/office/2006/metadata/contentType" xmlns:ma="http://schemas.microsoft.com/office/2006/metadata/properties/metaAttributes" ct:_="" ma:_="" ma:contentTypeName="Document" ma:contentTypeID="0x01010016E63A739F563946AD8C16C05D062E98" ma:contentTypeVersion="6" ma:contentTypeDescription="Create a new document." ma:contentTypeScope="" ma:versionID="a28a9786f1d8f4f56c75dc998e4d5f9b">
   <xsd:schema xmlns:xsd="http://www.w3.org/2001/XMLSchema" xmlns:xs="http://www.w3.org/2001/XMLSchema" xmlns:p="http://schemas.microsoft.com/office/2006/metadata/properties" xmlns:ns3="56c654e7-54e6-4cec-9125-9ecb39084783" targetNamespace="http://schemas.microsoft.com/office/2006/metadata/properties" ma:root="true" ma:fieldsID="a24d4552bcb2c83444a4b426af01032c" ns3:_="">
     <xsd:import namespace="56c654e7-54e6-4cec-9125-9ecb39084783"/>
@@ -24449,7 +27009,20 @@
 </ct:contentTypeSchema>
 </file>
 
+<file path=customXml/item2.xml><?xml version="1.0" encoding="utf-8"?>
+<?mso-contentType ?>
+<FormTemplates xmlns="http://schemas.microsoft.com/sharepoint/v3/contenttype/forms">
+  <Display>DocumentLibraryForm</Display>
+  <Edit>DocumentLibraryForm</Edit>
+  <New>DocumentLibraryForm</New>
+</FormTemplates>
+</file>
+
 <file path=customXml/item3.xml><?xml version="1.0" encoding="utf-8"?>
+<b:Sources xmlns:b="http://schemas.openxmlformats.org/officeDocument/2006/bibliography" xmlns="http://schemas.openxmlformats.org/officeDocument/2006/bibliography" SelectedStyle="\APASixthEditionOfficeOnline.xsl" StyleName="APA" Version="6"/>
+</file>
+
+<file path=customXml/item4.xml><?xml version="1.0" encoding="utf-8"?>
 <p:properties xmlns:p="http://schemas.microsoft.com/office/2006/metadata/properties" xmlns:xsi="http://www.w3.org/2001/XMLSchema-instance" xmlns:pc="http://schemas.microsoft.com/office/infopath/2007/PartnerControls">
   <documentManagement>
     <_activity xmlns="56c654e7-54e6-4cec-9125-9ecb39084783" xsi:nil="true"/>
@@ -24457,19 +27030,7 @@
 </p:properties>
 </file>
 
-<file path=customXml/item4.xml><?xml version="1.0" encoding="utf-8"?>
-<b:Sources xmlns:b="http://schemas.openxmlformats.org/officeDocument/2006/bibliography" xmlns="http://schemas.openxmlformats.org/officeDocument/2006/bibliography" SelectedStyle="\APASixthEditionOfficeOnline.xsl" StyleName="APA" Version="6"/>
-</file>
-
 <file path=customXml/itemProps1.xml><?xml version="1.0" encoding="utf-8"?>
-<ds:datastoreItem xmlns:ds="http://schemas.openxmlformats.org/officeDocument/2006/customXml" ds:itemID="{9526C769-C152-44AB-BBAD-EB530518D039}">
-  <ds:schemaRefs>
-    <ds:schemaRef ds:uri="http://schemas.microsoft.com/sharepoint/v3/contenttype/forms"/>
-  </ds:schemaRefs>
-</ds:datastoreItem>
-</file>
-
-<file path=customXml/itemProps2.xml><?xml version="1.0" encoding="utf-8"?>
 <ds:datastoreItem xmlns:ds="http://schemas.openxmlformats.org/officeDocument/2006/customXml" ds:itemID="{AF05F828-C5B5-4DC4-9F99-F95268BC84EF}">
   <ds:schemaRefs>
     <ds:schemaRef ds:uri="http://schemas.microsoft.com/office/2006/metadata/contentType"/>
@@ -24487,7 +27048,23 @@
 </ds:datastoreItem>
 </file>
 
+<file path=customXml/itemProps2.xml><?xml version="1.0" encoding="utf-8"?>
+<ds:datastoreItem xmlns:ds="http://schemas.openxmlformats.org/officeDocument/2006/customXml" ds:itemID="{9526C769-C152-44AB-BBAD-EB530518D039}">
+  <ds:schemaRefs>
+    <ds:schemaRef ds:uri="http://schemas.microsoft.com/sharepoint/v3/contenttype/forms"/>
+  </ds:schemaRefs>
+</ds:datastoreItem>
+</file>
+
 <file path=customXml/itemProps3.xml><?xml version="1.0" encoding="utf-8"?>
+<ds:datastoreItem xmlns:ds="http://schemas.openxmlformats.org/officeDocument/2006/customXml" ds:itemID="{57B83800-9DD8-48E5-B4BC-7F02BDC5F36A}">
+  <ds:schemaRefs>
+    <ds:schemaRef ds:uri="http://schemas.openxmlformats.org/officeDocument/2006/bibliography"/>
+  </ds:schemaRefs>
+</ds:datastoreItem>
+</file>
+
+<file path=customXml/itemProps4.xml><?xml version="1.0" encoding="utf-8"?>
 <ds:datastoreItem xmlns:ds="http://schemas.openxmlformats.org/officeDocument/2006/customXml" ds:itemID="{DAE6ADA1-BD15-4943-963F-C21A8F36A2A2}">
   <ds:schemaRefs>
     <ds:schemaRef ds:uri="http://schemas.microsoft.com/office/2006/metadata/properties"/>
@@ -24495,12 +27072,4 @@
     <ds:schemaRef ds:uri="56c654e7-54e6-4cec-9125-9ecb39084783"/>
   </ds:schemaRefs>
 </ds:datastoreItem>
-</file>
-
-<file path=customXml/itemProps4.xml><?xml version="1.0" encoding="utf-8"?>
-<ds:datastoreItem xmlns:ds="http://schemas.openxmlformats.org/officeDocument/2006/customXml" ds:itemID="{57B83800-9DD8-48E5-B4BC-7F02BDC5F36A}">
-  <ds:schemaRefs>
-    <ds:schemaRef ds:uri="http://schemas.openxmlformats.org/officeDocument/2006/bibliography"/>
-  </ds:schemaRefs>
-</ds:datastoreItem>
 </file>
</xml_diff>

<commit_message>
aggiunta modifiche finali documento di visione 2
</commit_message>
<xml_diff>
--- a/Documenti/Documento di progetto finale.docx
+++ b/Documenti/Documento di progetto finale.docx
@@ -13000,6 +13000,7 @@
           <w:color w:val="000000" w:themeColor="text1"/>
         </w:rPr>
       </w:pPr>
+      <w:proofErr w:type="spellStart"/>
       <w:r>
         <w:rPr>
           <w:rFonts w:ascii="Calibri" w:hAnsi="Calibri" w:cs="Calibri"/>
@@ -13007,7 +13008,26 @@
           <w:bCs/>
           <w:color w:val="000000" w:themeColor="text1"/>
         </w:rPr>
-        <w:t>Controller Pattern:</w:t>
+        <w:t>Facade</w:t>
+      </w:r>
+      <w:proofErr w:type="spellEnd"/>
+      <w:r>
+        <w:rPr>
+          <w:rFonts w:ascii="Calibri" w:hAnsi="Calibri" w:cs="Calibri"/>
+          <w:b/>
+          <w:bCs/>
+          <w:color w:val="000000" w:themeColor="text1"/>
+        </w:rPr>
+        <w:t xml:space="preserve"> Pattern</w:t>
+      </w:r>
+      <w:r>
+        <w:rPr>
+          <w:rFonts w:ascii="Calibri" w:hAnsi="Calibri" w:cs="Calibri"/>
+          <w:b/>
+          <w:bCs/>
+          <w:color w:val="000000" w:themeColor="text1"/>
+        </w:rPr>
+        <w:t>:</w:t>
       </w:r>
       <w:r>
         <w:rPr>
@@ -13647,14 +13667,7 @@
           <w:bCs/>
           <w:color w:val="000000" w:themeColor="text1"/>
         </w:rPr>
-        <w:t>Information Expert Evoluto:</w:t>
-      </w:r>
-      <w:r>
-        <w:rPr>
-          <w:rFonts w:ascii="Calibri" w:hAnsi="Calibri" w:cs="Calibri"/>
-          <w:color w:val="000000" w:themeColor="text1"/>
-        </w:rPr>
-        <w:t xml:space="preserve"> * </w:t>
+        <w:t>Information Expert</w:t>
       </w:r>
       <w:r>
         <w:rPr>
@@ -13663,7 +13676,34 @@
           <w:bCs/>
           <w:color w:val="000000" w:themeColor="text1"/>
         </w:rPr>
-        <w:t>Magazzino:</w:t>
+        <w:t xml:space="preserve"> (</w:t>
+      </w:r>
+      <w:r>
+        <w:rPr>
+          <w:rFonts w:ascii="Calibri" w:hAnsi="Calibri" w:cs="Calibri"/>
+          <w:b/>
+          <w:bCs/>
+          <w:color w:val="000000" w:themeColor="text1"/>
+        </w:rPr>
+        <w:t>Magazzino</w:t>
+      </w:r>
+      <w:r>
+        <w:rPr>
+          <w:rFonts w:ascii="Calibri" w:hAnsi="Calibri" w:cs="Calibri"/>
+          <w:b/>
+          <w:bCs/>
+          <w:color w:val="000000" w:themeColor="text1"/>
+        </w:rPr>
+        <w:t>)</w:t>
+      </w:r>
+      <w:r>
+        <w:rPr>
+          <w:rFonts w:ascii="Calibri" w:hAnsi="Calibri" w:cs="Calibri"/>
+          <w:b/>
+          <w:bCs/>
+          <w:color w:val="000000" w:themeColor="text1"/>
+        </w:rPr>
+        <w:t>:</w:t>
       </w:r>
       <w:r>
         <w:rPr>
@@ -14013,24 +14053,14 @@
       <w:r>
         <w:t xml:space="preserve">Figura </w:t>
       </w:r>
-      <w:r>
-        <w:fldChar w:fldCharType="begin"/>
-      </w:r>
-      <w:r>
-        <w:instrText xml:space="preserve"> SEQ Figura \* ARABIC </w:instrText>
-      </w:r>
-      <w:r>
-        <w:fldChar w:fldCharType="separate"/>
-      </w:r>
-      <w:r>
-        <w:rPr>
-          <w:noProof/>
-        </w:rPr>
-        <w:t>1</w:t>
-      </w:r>
-      <w:r>
-        <w:fldChar w:fldCharType="end"/>
-      </w:r>
+      <w:fldSimple w:instr=" SEQ Figura \* ARABIC ">
+        <w:r>
+          <w:rPr>
+            <w:noProof/>
+          </w:rPr>
+          <w:t>1</w:t>
+        </w:r>
+      </w:fldSimple>
       <w:r>
         <w:t xml:space="preserve"> Modello di dominio</w:t>
       </w:r>
@@ -14583,24 +14613,14 @@
       <w:r>
         <w:t xml:space="preserve">Figura </w:t>
       </w:r>
-      <w:r>
-        <w:fldChar w:fldCharType="begin"/>
-      </w:r>
-      <w:r>
-        <w:instrText xml:space="preserve"> SEQ Figura \* ARABIC </w:instrText>
-      </w:r>
-      <w:r>
-        <w:fldChar w:fldCharType="separate"/>
-      </w:r>
-      <w:r>
-        <w:rPr>
-          <w:noProof/>
-        </w:rPr>
-        <w:t>2</w:t>
-      </w:r>
-      <w:r>
-        <w:fldChar w:fldCharType="end"/>
-      </w:r>
+      <w:fldSimple w:instr=" SEQ Figura \* ARABIC ">
+        <w:r>
+          <w:rPr>
+            <w:noProof/>
+          </w:rPr>
+          <w:t>2</w:t>
+        </w:r>
+      </w:fldSimple>
       <w:r>
         <w:t xml:space="preserve"> SSD Modello di Analisi UC1</w:t>
       </w:r>
@@ -15433,24 +15453,14 @@
                             <w:r>
                               <w:t xml:space="preserve">Figura </w:t>
                             </w:r>
-                            <w:r>
-                              <w:fldChar w:fldCharType="begin"/>
-                            </w:r>
-                            <w:r>
-                              <w:instrText xml:space="preserve"> SEQ Figura \* ARABIC </w:instrText>
-                            </w:r>
-                            <w:r>
-                              <w:fldChar w:fldCharType="separate"/>
-                            </w:r>
-                            <w:r>
-                              <w:rPr>
-                                <w:noProof/>
-                              </w:rPr>
-                              <w:t>3</w:t>
-                            </w:r>
-                            <w:r>
-                              <w:fldChar w:fldCharType="end"/>
-                            </w:r>
+                            <w:fldSimple w:instr=" SEQ Figura \* ARABIC ">
+                              <w:r>
+                                <w:rPr>
+                                  <w:noProof/>
+                                </w:rPr>
+                                <w:t>3</w:t>
+                              </w:r>
+                            </w:fldSimple>
                             <w:r>
                               <w:t xml:space="preserve"> SSD Modello di Analisi UC2</w:t>
                             </w:r>
@@ -16259,24 +16269,14 @@
                             <w:r>
                               <w:t xml:space="preserve">Figura </w:t>
                             </w:r>
-                            <w:r>
-                              <w:fldChar w:fldCharType="begin"/>
-                            </w:r>
-                            <w:r>
-                              <w:instrText xml:space="preserve"> SEQ Figura \* ARABIC </w:instrText>
-                            </w:r>
-                            <w:r>
-                              <w:fldChar w:fldCharType="separate"/>
-                            </w:r>
-                            <w:r>
-                              <w:rPr>
-                                <w:noProof/>
-                              </w:rPr>
-                              <w:t>4</w:t>
-                            </w:r>
-                            <w:r>
-                              <w:fldChar w:fldCharType="end"/>
-                            </w:r>
+                            <w:fldSimple w:instr=" SEQ Figura \* ARABIC ">
+                              <w:r>
+                                <w:rPr>
+                                  <w:noProof/>
+                                </w:rPr>
+                                <w:t>4</w:t>
+                              </w:r>
+                            </w:fldSimple>
                             <w:r>
                               <w:t xml:space="preserve"> </w:t>
                             </w:r>
@@ -17202,24 +17202,14 @@
       <w:r>
         <w:t xml:space="preserve">Figura </w:t>
       </w:r>
-      <w:r>
-        <w:fldChar w:fldCharType="begin"/>
-      </w:r>
-      <w:r>
-        <w:instrText xml:space="preserve"> SEQ Figura \* ARABIC </w:instrText>
-      </w:r>
-      <w:r>
-        <w:fldChar w:fldCharType="separate"/>
-      </w:r>
-      <w:r>
-        <w:rPr>
-          <w:noProof/>
-        </w:rPr>
-        <w:t>5</w:t>
-      </w:r>
-      <w:r>
-        <w:fldChar w:fldCharType="end"/>
-      </w:r>
+      <w:fldSimple w:instr=" SEQ Figura \* ARABIC ">
+        <w:r>
+          <w:rPr>
+            <w:noProof/>
+          </w:rPr>
+          <w:t>5</w:t>
+        </w:r>
+      </w:fldSimple>
       <w:r>
         <w:t xml:space="preserve"> </w:t>
       </w:r>
@@ -18100,24 +18090,14 @@
       <w:r>
         <w:t xml:space="preserve">Figura </w:t>
       </w:r>
-      <w:r>
-        <w:fldChar w:fldCharType="begin"/>
-      </w:r>
-      <w:r>
-        <w:instrText xml:space="preserve"> SEQ Figura \* ARABIC </w:instrText>
-      </w:r>
-      <w:r>
-        <w:fldChar w:fldCharType="separate"/>
-      </w:r>
-      <w:r>
-        <w:rPr>
-          <w:noProof/>
-        </w:rPr>
-        <w:t>6</w:t>
-      </w:r>
-      <w:r>
-        <w:fldChar w:fldCharType="end"/>
-      </w:r>
+      <w:fldSimple w:instr=" SEQ Figura \* ARABIC ">
+        <w:r>
+          <w:rPr>
+            <w:noProof/>
+          </w:rPr>
+          <w:t>6</w:t>
+        </w:r>
+      </w:fldSimple>
       <w:r>
         <w:t xml:space="preserve"> </w:t>
       </w:r>
@@ -18604,24 +18584,14 @@
                             <w:r>
                               <w:t xml:space="preserve">Figura </w:t>
                             </w:r>
-                            <w:r>
-                              <w:fldChar w:fldCharType="begin"/>
-                            </w:r>
-                            <w:r>
-                              <w:instrText xml:space="preserve"> SEQ Figura \* ARABIC </w:instrText>
-                            </w:r>
-                            <w:r>
-                              <w:fldChar w:fldCharType="separate"/>
-                            </w:r>
-                            <w:r>
-                              <w:rPr>
-                                <w:noProof/>
-                              </w:rPr>
-                              <w:t>7</w:t>
-                            </w:r>
-                            <w:r>
-                              <w:fldChar w:fldCharType="end"/>
-                            </w:r>
+                            <w:fldSimple w:instr=" SEQ Figura \* ARABIC ">
+                              <w:r>
+                                <w:rPr>
+                                  <w:noProof/>
+                                </w:rPr>
+                                <w:t>7</w:t>
+                              </w:r>
+                            </w:fldSimple>
                             <w:r>
                               <w:t xml:space="preserve"> </w:t>
                             </w:r>
@@ -19335,24 +19305,14 @@
                             <w:r>
                               <w:t xml:space="preserve">Figura </w:t>
                             </w:r>
-                            <w:r>
-                              <w:fldChar w:fldCharType="begin"/>
-                            </w:r>
-                            <w:r>
-                              <w:instrText xml:space="preserve"> SEQ Figura \* ARABIC </w:instrText>
-                            </w:r>
-                            <w:r>
-                              <w:fldChar w:fldCharType="separate"/>
-                            </w:r>
-                            <w:r>
-                              <w:rPr>
-                                <w:noProof/>
-                              </w:rPr>
-                              <w:t>8</w:t>
-                            </w:r>
-                            <w:r>
-                              <w:fldChar w:fldCharType="end"/>
-                            </w:r>
+                            <w:fldSimple w:instr=" SEQ Figura \* ARABIC ">
+                              <w:r>
+                                <w:rPr>
+                                  <w:noProof/>
+                                </w:rPr>
+                                <w:t>8</w:t>
+                              </w:r>
+                            </w:fldSimple>
                             <w:r>
                               <w:t xml:space="preserve"> SSD Modello di Analisi UC</w:t>
                             </w:r>
@@ -20012,24 +19972,14 @@
       <w:r>
         <w:t xml:space="preserve">Figura </w:t>
       </w:r>
-      <w:r>
-        <w:fldChar w:fldCharType="begin"/>
-      </w:r>
-      <w:r>
-        <w:instrText xml:space="preserve"> SEQ Figura \* ARABIC </w:instrText>
-      </w:r>
-      <w:r>
-        <w:fldChar w:fldCharType="separate"/>
-      </w:r>
-      <w:r>
-        <w:rPr>
-          <w:noProof/>
-        </w:rPr>
-        <w:t>9</w:t>
-      </w:r>
-      <w:r>
-        <w:fldChar w:fldCharType="end"/>
-      </w:r>
+      <w:fldSimple w:instr=" SEQ Figura \* ARABIC ">
+        <w:r>
+          <w:rPr>
+            <w:noProof/>
+          </w:rPr>
+          <w:t>9</w:t>
+        </w:r>
+      </w:fldSimple>
       <w:r>
         <w:t xml:space="preserve"> </w:t>
       </w:r>
@@ -20298,24 +20248,14 @@
       <w:r>
         <w:t xml:space="preserve">Figura </w:t>
       </w:r>
-      <w:r>
-        <w:fldChar w:fldCharType="begin"/>
-      </w:r>
-      <w:r>
-        <w:instrText xml:space="preserve"> SEQ Figura \* ARABIC </w:instrText>
-      </w:r>
-      <w:r>
-        <w:fldChar w:fldCharType="separate"/>
-      </w:r>
-      <w:r>
-        <w:rPr>
-          <w:noProof/>
-        </w:rPr>
-        <w:t>10</w:t>
-      </w:r>
-      <w:r>
-        <w:fldChar w:fldCharType="end"/>
-      </w:r>
+      <w:fldSimple w:instr=" SEQ Figura \* ARABIC ">
+        <w:r>
+          <w:rPr>
+            <w:noProof/>
+          </w:rPr>
+          <w:t>10</w:t>
+        </w:r>
+      </w:fldSimple>
       <w:r>
         <w:t xml:space="preserve"> Diagramma delle Classi</w:t>
       </w:r>
@@ -20360,17 +20300,33 @@
       <w:r>
         <w:rPr>
           <w:rFonts w:ascii="Calibri" w:hAnsi="Calibri" w:cs="Calibri"/>
+          <w:color w:val="000000" w:themeColor="text1"/>
+        </w:rPr>
+        <w:t>Inserimento di un nuovo animale e relativo padrone</w:t>
+      </w:r>
+    </w:p>
+    <w:p>
+      <w:pPr>
+        <w:pStyle w:val="Paragrafoelenco"/>
+        <w:rPr>
+          <w:rFonts w:ascii="Calibri" w:hAnsi="Calibri" w:cs="Calibri"/>
+          <w:color w:val="000000" w:themeColor="text1"/>
+        </w:rPr>
+      </w:pPr>
+      <w:r>
+        <w:rPr>
+          <w:rFonts w:ascii="Calibri" w:hAnsi="Calibri" w:cs="Calibri"/>
           <w:noProof/>
           <w:color w:val="000000" w:themeColor="text1"/>
         </w:rPr>
         <w:drawing>
-          <wp:anchor distT="0" distB="0" distL="114300" distR="114300" simplePos="0" relativeHeight="251669504" behindDoc="1" locked="0" layoutInCell="1" allowOverlap="1" wp14:anchorId="592AD052" wp14:editId="435281D3">
+          <wp:anchor distT="0" distB="0" distL="114300" distR="114300" simplePos="0" relativeHeight="251706368" behindDoc="1" locked="0" layoutInCell="1" allowOverlap="1" wp14:anchorId="68F2213A" wp14:editId="2BF192C7">
             <wp:simplePos x="0" y="0"/>
             <wp:positionH relativeFrom="margin">
-              <wp:align>right</wp:align>
+              <wp:posOffset>0</wp:posOffset>
             </wp:positionH>
             <wp:positionV relativeFrom="page">
-              <wp:posOffset>1183005</wp:posOffset>
+              <wp:posOffset>7612380</wp:posOffset>
             </wp:positionV>
             <wp:extent cx="6120130" cy="2414270"/>
             <wp:effectExtent l="0" t="0" r="0" b="5080"/>
@@ -20427,22 +20383,6 @@
           </wp:anchor>
         </w:drawing>
       </w:r>
-      <w:r>
-        <w:rPr>
-          <w:rFonts w:ascii="Calibri" w:hAnsi="Calibri" w:cs="Calibri"/>
-          <w:color w:val="000000" w:themeColor="text1"/>
-        </w:rPr>
-        <w:t>Inserimento di un nuovo animale e relativo padrone</w:t>
-      </w:r>
-    </w:p>
-    <w:p>
-      <w:pPr>
-        <w:ind w:left="360"/>
-        <w:rPr>
-          <w:rFonts w:ascii="Calibri" w:hAnsi="Calibri" w:cs="Calibri"/>
-          <w:color w:val="000000" w:themeColor="text1"/>
-        </w:rPr>
-      </w:pPr>
     </w:p>
     <w:p>
       <w:pPr>
@@ -20462,8 +20402,9 @@
           <w:noProof/>
           <w:color w:val="000000" w:themeColor="text1"/>
         </w:rPr>
+        <w:lastRenderedPageBreak/>
         <w:drawing>
-          <wp:anchor distT="0" distB="0" distL="114300" distR="114300" simplePos="0" relativeHeight="251667456" behindDoc="1" locked="0" layoutInCell="1" allowOverlap="1" wp14:anchorId="1CA21F51" wp14:editId="02E92865">
+          <wp:anchor distT="0" distB="0" distL="114300" distR="114300" simplePos="0" relativeHeight="251667456" behindDoc="1" locked="0" layoutInCell="1" allowOverlap="1" wp14:anchorId="1CA21F51" wp14:editId="327AE221">
             <wp:simplePos x="0" y="0"/>
             <wp:positionH relativeFrom="margin">
               <wp:align>right</wp:align>
@@ -20719,6 +20660,7 @@
     <w:p/>
     <w:p/>
     <w:p/>
+    <w:p/>
     <w:p>
       <w:pPr>
         <w:pStyle w:val="Paragrafoelenco"/>
@@ -20737,32 +20679,14 @@
       </w:pPr>
       <w:r>
         <w:rPr>
-          <w:rFonts w:ascii="Calibri" w:hAnsi="Calibri" w:cs="Calibri"/>
           <w:noProof/>
-          <w:color w:val="000000" w:themeColor="text1"/>
         </w:rPr>
         <w:lastRenderedPageBreak/>
         <w:drawing>
-          <wp:anchor distT="0" distB="0" distL="114300" distR="114300" simplePos="0" relativeHeight="251704320" behindDoc="1" locked="0" layoutInCell="1" allowOverlap="1" wp14:anchorId="183F2004" wp14:editId="5D15C6AE">
-            <wp:simplePos x="0" y="0"/>
-            <wp:positionH relativeFrom="margin">
-              <wp:posOffset>-1134</wp:posOffset>
-            </wp:positionH>
-            <wp:positionV relativeFrom="page">
-              <wp:posOffset>1081924</wp:posOffset>
-            </wp:positionV>
-            <wp:extent cx="6120130" cy="2720975"/>
-            <wp:effectExtent l="0" t="0" r="0" b="3175"/>
-            <wp:wrapTight wrapText="bothSides">
-              <wp:wrapPolygon edited="0">
-                <wp:start x="0" y="0"/>
-                <wp:lineTo x="0" y="21474"/>
-                <wp:lineTo x="21515" y="21474"/>
-                <wp:lineTo x="21515" y="0"/>
-                <wp:lineTo x="0" y="0"/>
-              </wp:wrapPolygon>
-            </wp:wrapTight>
-            <wp:docPr id="1487701655" name="Immagine 16" descr="Immagine che contiene testo, schermata, diagramma, linea&#10;&#10;Il contenuto generato dall'IA potrebbe non essere corretto."/>
+          <wp:inline distT="0" distB="0" distL="0" distR="0" wp14:anchorId="30FF922C" wp14:editId="1FF61319">
+            <wp:extent cx="6120765" cy="2725420"/>
+            <wp:effectExtent l="0" t="0" r="0" b="0"/>
+            <wp:docPr id="799212152" name="Immagine 6"/>
             <wp:cNvGraphicFramePr>
               <a:graphicFrameLocks xmlns:a="http://schemas.openxmlformats.org/drawingml/2006/main" noChangeAspect="1"/>
             </wp:cNvGraphicFramePr>
@@ -20770,8 +20694,10 @@
               <a:graphicData uri="http://schemas.openxmlformats.org/drawingml/2006/picture">
                 <pic:pic xmlns:pic="http://schemas.openxmlformats.org/drawingml/2006/picture">
                   <pic:nvPicPr>
-                    <pic:cNvPr id="1487701655" name="Immagine 16" descr="Immagine che contiene testo, schermata, diagramma, linea&#10;&#10;Il contenuto generato dall'IA potrebbe non essere corretto."/>
-                    <pic:cNvPicPr/>
+                    <pic:cNvPr id="0" name="Picture 3"/>
+                    <pic:cNvPicPr>
+                      <a:picLocks noChangeAspect="1" noChangeArrowheads="1"/>
+                    </pic:cNvPicPr>
                   </pic:nvPicPr>
                   <pic:blipFill>
                     <a:blip r:embed="rId25">
@@ -20781,23 +20707,25 @@
                         </a:ext>
                       </a:extLst>
                     </a:blip>
+                    <a:srcRect/>
                     <a:stretch>
                       <a:fillRect/>
                     </a:stretch>
                   </pic:blipFill>
-                  <pic:spPr>
+                  <pic:spPr bwMode="auto">
                     <a:xfrm>
                       <a:off x="0" y="0"/>
-                      <a:ext cx="6120130" cy="2720975"/>
+                      <a:ext cx="6120765" cy="2725420"/>
                     </a:xfrm>
                     <a:prstGeom prst="rect">
                       <a:avLst/>
                     </a:prstGeom>
+                    <a:noFill/>
                   </pic:spPr>
                 </pic:pic>
               </a:graphicData>
             </a:graphic>
-          </wp:anchor>
+          </wp:inline>
         </w:drawing>
       </w:r>
     </w:p>
@@ -20810,30 +20738,17 @@
         </w:numPr>
       </w:pPr>
       <w:r>
+        <w:t>Conferma dell’esame</w:t>
+      </w:r>
+      <w:r>
         <w:rPr>
           <w:noProof/>
         </w:rPr>
         <w:drawing>
-          <wp:anchor distT="0" distB="0" distL="114300" distR="114300" simplePos="0" relativeHeight="251687936" behindDoc="1" locked="0" layoutInCell="1" allowOverlap="1" wp14:anchorId="0C6789E4" wp14:editId="5068CE0C">
-            <wp:simplePos x="0" y="0"/>
-            <wp:positionH relativeFrom="margin">
-              <wp:posOffset>-1134</wp:posOffset>
-            </wp:positionH>
-            <wp:positionV relativeFrom="page">
-              <wp:posOffset>4069429</wp:posOffset>
-            </wp:positionV>
-            <wp:extent cx="6120130" cy="3173095"/>
-            <wp:effectExtent l="0" t="0" r="0" b="8255"/>
-            <wp:wrapTight wrapText="bothSides">
-              <wp:wrapPolygon edited="0">
-                <wp:start x="0" y="0"/>
-                <wp:lineTo x="0" y="21527"/>
-                <wp:lineTo x="21515" y="21527"/>
-                <wp:lineTo x="21515" y="0"/>
-                <wp:lineTo x="0" y="0"/>
-              </wp:wrapPolygon>
-            </wp:wrapTight>
-            <wp:docPr id="1734724264" name="Immagine 21" descr="Immagine che contiene testo, schermata, diagramma, linea&#10;&#10;Il contenuto generato dall'IA potrebbe non essere corretto."/>
+          <wp:inline distT="0" distB="0" distL="0" distR="0" wp14:anchorId="75900EB1" wp14:editId="7BBDBDC1">
+            <wp:extent cx="6120130" cy="3169591"/>
+            <wp:effectExtent l="0" t="0" r="0" b="0"/>
+            <wp:docPr id="553708708" name="Immagine 5"/>
             <wp:cNvGraphicFramePr>
               <a:graphicFrameLocks xmlns:a="http://schemas.openxmlformats.org/drawingml/2006/main" noChangeAspect="1"/>
             </wp:cNvGraphicFramePr>
@@ -20841,8 +20756,10 @@
               <a:graphicData uri="http://schemas.openxmlformats.org/drawingml/2006/picture">
                 <pic:pic xmlns:pic="http://schemas.openxmlformats.org/drawingml/2006/picture">
                   <pic:nvPicPr>
-                    <pic:cNvPr id="1734724264" name="Immagine 21" descr="Immagine che contiene testo, schermata, diagramma, linea&#10;&#10;Il contenuto generato dall'IA potrebbe non essere corretto."/>
-                    <pic:cNvPicPr/>
+                    <pic:cNvPr id="0" name="Picture 2"/>
+                    <pic:cNvPicPr>
+                      <a:picLocks noChangeAspect="1" noChangeArrowheads="1"/>
+                    </pic:cNvPicPr>
                   </pic:nvPicPr>
                   <pic:blipFill>
                     <a:blip r:embed="rId26">
@@ -20852,27 +20769,26 @@
                         </a:ext>
                       </a:extLst>
                     </a:blip>
+                    <a:srcRect/>
                     <a:stretch>
                       <a:fillRect/>
                     </a:stretch>
                   </pic:blipFill>
-                  <pic:spPr>
+                  <pic:spPr bwMode="auto">
                     <a:xfrm>
                       <a:off x="0" y="0"/>
-                      <a:ext cx="6120130" cy="3173095"/>
+                      <a:ext cx="6120130" cy="3169591"/>
                     </a:xfrm>
                     <a:prstGeom prst="rect">
                       <a:avLst/>
                     </a:prstGeom>
+                    <a:noFill/>
                   </pic:spPr>
                 </pic:pic>
               </a:graphicData>
             </a:graphic>
-          </wp:anchor>
+          </wp:inline>
         </w:drawing>
-      </w:r>
-      <w:r>
-        <w:t>Conferma dell’esame</w:t>
       </w:r>
     </w:p>
     <w:p>
@@ -21151,6 +21067,70 @@
         <w:pStyle w:val="Title1"/>
         <w:numPr>
           <w:ilvl w:val="0"/>
+          <w:numId w:val="0"/>
+        </w:numPr>
+        <w:ind w:left="720"/>
+        <w:jc w:val="left"/>
+        <w:rPr>
+          <w:b w:val="0"/>
+          <w:bCs w:val="0"/>
+          <w:sz w:val="22"/>
+        </w:rPr>
+      </w:pPr>
+    </w:p>
+    <w:p>
+      <w:pPr>
+        <w:pStyle w:val="Title1"/>
+        <w:numPr>
+          <w:ilvl w:val="0"/>
+          <w:numId w:val="0"/>
+        </w:numPr>
+        <w:ind w:left="720"/>
+        <w:jc w:val="left"/>
+        <w:rPr>
+          <w:b w:val="0"/>
+          <w:bCs w:val="0"/>
+          <w:sz w:val="22"/>
+        </w:rPr>
+      </w:pPr>
+    </w:p>
+    <w:p>
+      <w:pPr>
+        <w:pStyle w:val="Title1"/>
+        <w:numPr>
+          <w:ilvl w:val="0"/>
+          <w:numId w:val="0"/>
+        </w:numPr>
+        <w:ind w:left="720" w:hanging="360"/>
+        <w:jc w:val="left"/>
+        <w:rPr>
+          <w:b w:val="0"/>
+          <w:bCs w:val="0"/>
+          <w:sz w:val="22"/>
+        </w:rPr>
+      </w:pPr>
+    </w:p>
+    <w:p>
+      <w:pPr>
+        <w:pStyle w:val="Title1"/>
+        <w:numPr>
+          <w:ilvl w:val="0"/>
+          <w:numId w:val="0"/>
+        </w:numPr>
+        <w:ind w:left="720" w:hanging="360"/>
+        <w:jc w:val="left"/>
+        <w:rPr>
+          <w:b w:val="0"/>
+          <w:bCs w:val="0"/>
+          <w:sz w:val="22"/>
+        </w:rPr>
+      </w:pPr>
+    </w:p>
+    <w:p>
+      <w:pPr>
+        <w:pStyle w:val="Title1"/>
+        <w:numPr>
+          <w:ilvl w:val="0"/>
           <w:numId w:val="21"/>
         </w:numPr>
         <w:jc w:val="left"/>
@@ -21166,9 +21146,15 @@
           <w:bCs w:val="0"/>
           <w:sz w:val="22"/>
         </w:rPr>
-        <w:lastRenderedPageBreak/>
         <w:t>Aggiunta di un’operazione al calendario</w:t>
       </w:r>
+      <w:bookmarkEnd w:id="41"/>
+    </w:p>
+    <w:p>
+      <w:pPr>
+        <w:pStyle w:val="Title1"/>
+      </w:pPr>
+      <w:bookmarkStart w:id="42" w:name="_Toc221933049"/>
       <w:r>
         <w:rPr>
           <w:b w:val="0"/>
@@ -21176,14 +21162,15 @@
           <w:noProof/>
           <w:sz w:val="22"/>
         </w:rPr>
+        <w:lastRenderedPageBreak/>
         <w:drawing>
-          <wp:anchor distT="0" distB="0" distL="114300" distR="114300" simplePos="0" relativeHeight="251694080" behindDoc="1" locked="0" layoutInCell="1" allowOverlap="1" wp14:anchorId="36BD0AD3" wp14:editId="0C6B57B3">
+          <wp:anchor distT="0" distB="0" distL="114300" distR="114300" simplePos="0" relativeHeight="251694080" behindDoc="1" locked="0" layoutInCell="1" allowOverlap="1" wp14:anchorId="36BD0AD3" wp14:editId="5D348671">
             <wp:simplePos x="0" y="0"/>
             <wp:positionH relativeFrom="margin">
               <wp:align>right</wp:align>
             </wp:positionH>
             <wp:positionV relativeFrom="paragraph">
-              <wp:posOffset>239368</wp:posOffset>
+              <wp:posOffset>184082</wp:posOffset>
             </wp:positionV>
             <wp:extent cx="6120130" cy="3792220"/>
             <wp:effectExtent l="0" t="0" r="0" b="0"/>
@@ -21234,13 +21221,6 @@
           </wp:anchor>
         </w:drawing>
       </w:r>
-      <w:bookmarkEnd w:id="41"/>
-    </w:p>
-    <w:p>
-      <w:pPr>
-        <w:pStyle w:val="Title1"/>
-      </w:pPr>
-      <w:bookmarkStart w:id="42" w:name="_Toc221933049"/>
       <w:r>
         <w:t>TESTING</w:t>
       </w:r>
@@ -21682,24 +21662,14 @@
       <w:r>
         <w:t xml:space="preserve">Figura </w:t>
       </w:r>
-      <w:r>
-        <w:fldChar w:fldCharType="begin"/>
-      </w:r>
-      <w:r>
-        <w:instrText xml:space="preserve"> SEQ Figura \* ARABIC </w:instrText>
-      </w:r>
-      <w:r>
-        <w:fldChar w:fldCharType="separate"/>
-      </w:r>
-      <w:r>
-        <w:rPr>
-          <w:noProof/>
-        </w:rPr>
-        <w:t>16</w:t>
-      </w:r>
-      <w:r>
-        <w:fldChar w:fldCharType="end"/>
-      </w:r>
+      <w:fldSimple w:instr=" SEQ Figura \* ARABIC ">
+        <w:r>
+          <w:rPr>
+            <w:noProof/>
+          </w:rPr>
+          <w:t>16</w:t>
+        </w:r>
+      </w:fldSimple>
       <w:r>
         <w:t xml:space="preserve"> Modello di dominio con classe Archivio</w:t>
       </w:r>
@@ -25198,15 +25168,6 @@
   </w:num>
   <w:num w:numId="16" w16cid:durableId="1619221628">
     <w:abstractNumId w:val="4"/>
-    <w:lvlOverride w:ilvl="0"/>
-    <w:lvlOverride w:ilvl="1"/>
-    <w:lvlOverride w:ilvl="2"/>
-    <w:lvlOverride w:ilvl="3"/>
-    <w:lvlOverride w:ilvl="4"/>
-    <w:lvlOverride w:ilvl="5"/>
-    <w:lvlOverride w:ilvl="6"/>
-    <w:lvlOverride w:ilvl="7"/>
-    <w:lvlOverride w:ilvl="8"/>
   </w:num>
   <w:num w:numId="17" w16cid:durableId="2101755162">
     <w:abstractNumId w:val="16"/>
@@ -25826,6 +25787,7 @@
   <w:style w:type="character" w:default="1" w:styleId="Carpredefinitoparagrafo">
     <w:name w:val="Default Paragraph Font"/>
     <w:uiPriority w:val="1"/>
+    <w:semiHidden/>
     <w:unhideWhenUsed/>
   </w:style>
   <w:style w:type="table" w:default="1" w:styleId="Tabellanormale">
@@ -26854,6 +26816,15 @@
 </file>
 
 <file path=customXml/item1.xml><?xml version="1.0" encoding="utf-8"?>
+<?mso-contentType ?>
+<FormTemplates xmlns="http://schemas.microsoft.com/sharepoint/v3/contenttype/forms">
+  <Display>DocumentLibraryForm</Display>
+  <Edit>DocumentLibraryForm</Edit>
+  <New>DocumentLibraryForm</New>
+</FormTemplates>
+</file>
+
+<file path=customXml/item2.xml><?xml version="1.0" encoding="utf-8"?>
 <ct:contentTypeSchema xmlns:ct="http://schemas.microsoft.com/office/2006/metadata/contentType" xmlns:ma="http://schemas.microsoft.com/office/2006/metadata/properties/metaAttributes" ct:_="" ma:_="" ma:contentTypeName="Document" ma:contentTypeID="0x01010016E63A739F563946AD8C16C05D062E98" ma:contentTypeVersion="6" ma:contentTypeDescription="Create a new document." ma:contentTypeScope="" ma:versionID="a28a9786f1d8f4f56c75dc998e4d5f9b">
   <xsd:schema xmlns:xsd="http://www.w3.org/2001/XMLSchema" xmlns:xs="http://www.w3.org/2001/XMLSchema" xmlns:p="http://schemas.microsoft.com/office/2006/metadata/properties" xmlns:ns3="56c654e7-54e6-4cec-9125-9ecb39084783" targetNamespace="http://schemas.microsoft.com/office/2006/metadata/properties" ma:root="true" ma:fieldsID="a24d4552bcb2c83444a4b426af01032c" ns3:_="">
     <xsd:import namespace="56c654e7-54e6-4cec-9125-9ecb39084783"/>
@@ -27009,20 +26980,7 @@
 </ct:contentTypeSchema>
 </file>
 
-<file path=customXml/item2.xml><?xml version="1.0" encoding="utf-8"?>
-<?mso-contentType ?>
-<FormTemplates xmlns="http://schemas.microsoft.com/sharepoint/v3/contenttype/forms">
-  <Display>DocumentLibraryForm</Display>
-  <Edit>DocumentLibraryForm</Edit>
-  <New>DocumentLibraryForm</New>
-</FormTemplates>
-</file>
-
 <file path=customXml/item3.xml><?xml version="1.0" encoding="utf-8"?>
-<b:Sources xmlns:b="http://schemas.openxmlformats.org/officeDocument/2006/bibliography" xmlns="http://schemas.openxmlformats.org/officeDocument/2006/bibliography" SelectedStyle="\APASixthEditionOfficeOnline.xsl" StyleName="APA" Version="6"/>
-</file>
-
-<file path=customXml/item4.xml><?xml version="1.0" encoding="utf-8"?>
 <p:properties xmlns:p="http://schemas.microsoft.com/office/2006/metadata/properties" xmlns:xsi="http://www.w3.org/2001/XMLSchema-instance" xmlns:pc="http://schemas.microsoft.com/office/infopath/2007/PartnerControls">
   <documentManagement>
     <_activity xmlns="56c654e7-54e6-4cec-9125-9ecb39084783" xsi:nil="true"/>
@@ -27030,7 +26988,19 @@
 </p:properties>
 </file>
 
+<file path=customXml/item4.xml><?xml version="1.0" encoding="utf-8"?>
+<b:Sources xmlns:b="http://schemas.openxmlformats.org/officeDocument/2006/bibliography" xmlns="http://schemas.openxmlformats.org/officeDocument/2006/bibliography" SelectedStyle="\APASixthEditionOfficeOnline.xsl" StyleName="APA" Version="6"/>
+</file>
+
 <file path=customXml/itemProps1.xml><?xml version="1.0" encoding="utf-8"?>
+<ds:datastoreItem xmlns:ds="http://schemas.openxmlformats.org/officeDocument/2006/customXml" ds:itemID="{9526C769-C152-44AB-BBAD-EB530518D039}">
+  <ds:schemaRefs>
+    <ds:schemaRef ds:uri="http://schemas.microsoft.com/sharepoint/v3/contenttype/forms"/>
+  </ds:schemaRefs>
+</ds:datastoreItem>
+</file>
+
+<file path=customXml/itemProps2.xml><?xml version="1.0" encoding="utf-8"?>
 <ds:datastoreItem xmlns:ds="http://schemas.openxmlformats.org/officeDocument/2006/customXml" ds:itemID="{AF05F828-C5B5-4DC4-9F99-F95268BC84EF}">
   <ds:schemaRefs>
     <ds:schemaRef ds:uri="http://schemas.microsoft.com/office/2006/metadata/contentType"/>
@@ -27048,23 +27018,7 @@
 </ds:datastoreItem>
 </file>
 
-<file path=customXml/itemProps2.xml><?xml version="1.0" encoding="utf-8"?>
-<ds:datastoreItem xmlns:ds="http://schemas.openxmlformats.org/officeDocument/2006/customXml" ds:itemID="{9526C769-C152-44AB-BBAD-EB530518D039}">
-  <ds:schemaRefs>
-    <ds:schemaRef ds:uri="http://schemas.microsoft.com/sharepoint/v3/contenttype/forms"/>
-  </ds:schemaRefs>
-</ds:datastoreItem>
-</file>
-
 <file path=customXml/itemProps3.xml><?xml version="1.0" encoding="utf-8"?>
-<ds:datastoreItem xmlns:ds="http://schemas.openxmlformats.org/officeDocument/2006/customXml" ds:itemID="{57B83800-9DD8-48E5-B4BC-7F02BDC5F36A}">
-  <ds:schemaRefs>
-    <ds:schemaRef ds:uri="http://schemas.openxmlformats.org/officeDocument/2006/bibliography"/>
-  </ds:schemaRefs>
-</ds:datastoreItem>
-</file>
-
-<file path=customXml/itemProps4.xml><?xml version="1.0" encoding="utf-8"?>
 <ds:datastoreItem xmlns:ds="http://schemas.openxmlformats.org/officeDocument/2006/customXml" ds:itemID="{DAE6ADA1-BD15-4943-963F-C21A8F36A2A2}">
   <ds:schemaRefs>
     <ds:schemaRef ds:uri="http://schemas.microsoft.com/office/2006/metadata/properties"/>
@@ -27072,4 +27026,12 @@
     <ds:schemaRef ds:uri="56c654e7-54e6-4cec-9125-9ecb39084783"/>
   </ds:schemaRefs>
 </ds:datastoreItem>
+</file>
+
+<file path=customXml/itemProps4.xml><?xml version="1.0" encoding="utf-8"?>
+<ds:datastoreItem xmlns:ds="http://schemas.openxmlformats.org/officeDocument/2006/customXml" ds:itemID="{57B83800-9DD8-48E5-B4BC-7F02BDC5F36A}">
+  <ds:schemaRefs>
+    <ds:schemaRef ds:uri="http://schemas.openxmlformats.org/officeDocument/2006/bibliography"/>
+  </ds:schemaRefs>
+</ds:datastoreItem>
 </file>
</xml_diff>